<commit_message>
Sharpen novelty framing, add citations, Figure 2, and reproduction appendix
- Introduction: explicit positioning + research question (dependency-light,
  commodity-hardware annotation); complementarity with Foldseek (speed vs.
  transparency) and DeepFRI (learned vs. interpretable); cite DeepFRI and two
  recent AlphaFold/function-annotation reviews.
- Figure 2: real headless-Chromium screenshot of the 3D web viewer.
- Appendix A: step-by-step reproduction instructions.
- Re-rendered DOCX/PDF with all six figures; add paper/requirements-paper.txt.

Co-Authored-By: Claude Opus 4.8 <noreply@anthropic.com>
</commit_message>
<xml_diff>
--- a/paper/protein_function_rescue.docx
+++ b/paper/protein_function_rescue.docx
@@ -36,7 +36,7 @@
         </w:p>
       </w:sdtContent>
     </w:sdt>
-    <w:bookmarkStart w:id="61" w:name="X2d541942196f82a2883fccbb769b891731fb52e"/>
+    <w:bookmarkStart w:id="65" w:name="X2d541942196f82a2883fccbb769b891731fb52e"/>
     <w:p>
       <w:pPr>
         <w:pStyle w:val="Heading1"/>
@@ -682,31 +682,85 @@
         <w:pStyle w:val="BodyText"/>
       </w:pPr>
       <w:r>
-        <w:t xml:space="preserve">Most published applications of these tools assume access to a Linux server, a GPU, or a multi-gigabyte</w:t>
-      </w:r>
-      <w:r>
-        <w:t xml:space="preserve"> </w:t>
-      </w:r>
-      <w:r>
-        <w:t xml:space="preserve">structural database. Here we deliberately target the opposite regime: a single laptop, no GPU, no</w:t>
-      </w:r>
-      <w:r>
-        <w:t xml:space="preserve"> </w:t>
-      </w:r>
-      <w:r>
-        <w:t xml:space="preserve">administrator privileges, and no compiled bioinformatics binaries. We show that a scientifically</w:t>
-      </w:r>
-      <w:r>
-        <w:t xml:space="preserve"> </w:t>
-      </w:r>
-      <w:r>
-        <w:t xml:space="preserve">meaningful structure-based annotation workflow can be assembled entirely from the pre-computed</w:t>
-      </w:r>
-      <w:r>
-        <w:t xml:space="preserve"> </w:t>
-      </w:r>
-      <w:r>
-        <w:t xml:space="preserve">AlphaFold DB plus pure-Python components, and we apply it to unannotated proteins of</w:t>
+        <w:t xml:space="preserve">Beyond direct structural search, machine-learning methods now infer function directly from structure:</w:t>
+      </w:r>
+      <w:r>
+        <w:t xml:space="preserve"> </w:t>
+      </w:r>
+      <w:r>
+        <w:t xml:space="preserve">DeepFRI [12], for example, predicts Gene Ontology terms and EC numbers from a graph-convolutional</w:t>
+      </w:r>
+      <w:r>
+        <w:t xml:space="preserve"> </w:t>
+      </w:r>
+      <w:r>
+        <w:t xml:space="preserve">encoding of the fold. Such learned predictors are powerful but opaque, and — like the fast search</w:t>
+      </w:r>
+      <w:r>
+        <w:t xml:space="preserve"> </w:t>
+      </w:r>
+      <w:r>
+        <w:t xml:space="preserve">tools — are typically deployed with GPUs, large pre-indexed structural databases, or complex software</w:t>
+      </w:r>
+      <w:r>
+        <w:t xml:space="preserve"> </w:t>
+      </w:r>
+      <w:r>
+        <w:t xml:space="preserve">environments. Recent reviews and community assessments of AlphaFold’s impact on function prediction</w:t>
+      </w:r>
+      <w:r>
+        <w:t xml:space="preserve"> </w:t>
+      </w:r>
+      <w:r>
+        <w:t xml:space="preserve">[13, 14] make two points that frame the present work: the opportunity created by 200 million structures</w:t>
+      </w:r>
+      <w:r>
+        <w:t xml:space="preserve"> </w:t>
+      </w:r>
+      <w:r>
+        <w:t xml:space="preserve">is enormous, yet structure alone is not sufficient — predictions remain hypotheses that require</w:t>
+      </w:r>
+      <w:r>
+        <w:t xml:space="preserve"> </w:t>
+      </w:r>
+      <w:r>
+        <w:t xml:space="preserve">experimental validation, and the field is still evolving rather than solved.</w:t>
+      </w:r>
+    </w:p>
+    <w:p>
+      <w:pPr>
+        <w:pStyle w:val="BodyText"/>
+      </w:pPr>
+      <w:r>
+        <w:rPr>
+          <w:b/>
+          <w:bCs/>
+        </w:rPr>
+        <w:t xml:space="preserve">Positioning and research question.</w:t>
+      </w:r>
+      <w:r>
+        <w:t xml:space="preserve"> </w:t>
+      </w:r>
+      <w:r>
+        <w:t xml:space="preserve">Existing work has established that AlphaFold structures and</w:t>
+      </w:r>
+      <w:r>
+        <w:t xml:space="preserve"> </w:t>
+      </w:r>
+      <w:r>
+        <w:t xml:space="preserve">structural search can improve annotation, but published workflows typically depend on</w:t>
+      </w:r>
+      <w:r>
+        <w:t xml:space="preserve"> </w:t>
+      </w:r>
+      <w:r>
+        <w:t xml:space="preserve">high-performance-computing infrastructure, large pre-indexed structural databases, or intricate software</w:t>
+      </w:r>
+      <w:r>
+        <w:t xml:space="preserve"> </w:t>
+      </w:r>
+      <w:r>
+        <w:t xml:space="preserve">environments. We instead ask a different question:</w:t>
       </w:r>
       <w:r>
         <w:t xml:space="preserve"> </w:t>
@@ -716,7 +770,7 @@
           <w:i/>
           <w:iCs/>
         </w:rPr>
-        <w:t xml:space="preserve">Mycobacterium</w:t>
+        <w:t xml:space="preserve">can a transparent, dependency-light workflow achieve</w:t>
       </w:r>
       <w:r>
         <w:rPr>
@@ -730,19 +784,53 @@
           <w:i/>
           <w:iCs/>
         </w:rPr>
-        <w:t xml:space="preserve">tuberculosis</w:t>
-      </w:r>
-      <w:r>
-        <w:t xml:space="preserve"> </w:t>
-      </w:r>
-      <w:r>
-        <w:t xml:space="preserve">(Mtb), the causative agent of tuberculosis and a World Health Organization priority</w:t>
-      </w:r>
-      <w:r>
-        <w:t xml:space="preserve"> </w:t>
-      </w:r>
-      <w:r>
-        <w:t xml:space="preserve">pathogen whose genome remains rich in conserved hypothetical proteins.</w:t>
+        <w:t xml:space="preserve">meaningful annotation performance on commodity hardware while remaining fully reproducible?</w:t>
+      </w:r>
+      <w:r>
+        <w:t xml:space="preserve"> </w:t>
+      </w:r>
+      <w:r>
+        <w:t xml:space="preserve">Concretely,</w:t>
+      </w:r>
+      <w:r>
+        <w:t xml:space="preserve"> </w:t>
+      </w:r>
+      <w:r>
+        <w:t xml:space="preserve">we target a single laptop with no GPU, no administrator privileges, and no compiled bioinformatics</w:t>
+      </w:r>
+      <w:r>
+        <w:t xml:space="preserve"> </w:t>
+      </w:r>
+      <w:r>
+        <w:t xml:space="preserve">binaries, assembling the entire workflow from the pre-computed AlphaFold DB plus pure-Python components,</w:t>
+      </w:r>
+      <w:r>
+        <w:t xml:space="preserve"> </w:t>
+      </w:r>
+      <w:r>
+        <w:t xml:space="preserve">and we apply it to unannotated proteins of</w:t>
+      </w:r>
+      <w:r>
+        <w:t xml:space="preserve"> </w:t>
+      </w:r>
+      <w:r>
+        <w:rPr>
+          <w:i/>
+          <w:iCs/>
+        </w:rPr>
+        <w:t xml:space="preserve">Mycobacterium tuberculosis</w:t>
+      </w:r>
+      <w:r>
+        <w:t xml:space="preserve"> </w:t>
+      </w:r>
+      <w:r>
+        <w:t xml:space="preserve">(Mtb), a World Health</w:t>
+      </w:r>
+      <w:r>
+        <w:t xml:space="preserve"> </w:t>
+      </w:r>
+      <w:r>
+        <w:t xml:space="preserve">Organization priority pathogen whose genome remains rich in conserved hypothetical proteins.</w:t>
       </w:r>
     </w:p>
     <w:p>
@@ -750,31 +838,83 @@
         <w:pStyle w:val="BodyText"/>
       </w:pPr>
       <w:r>
-        <w:t xml:space="preserve">The contribution of this work is threefold: (1) a transparent, end-to-end pipeline that turns raw</w:t>
-      </w:r>
-      <w:r>
-        <w:t xml:space="preserve"> </w:t>
-      </w:r>
-      <w:r>
-        <w:t xml:space="preserve">AlphaFold models into ranked, evidence-linked functional hypotheses; (2) a demonstration that the</w:t>
-      </w:r>
-      <w:r>
-        <w:t xml:space="preserve"> </w:t>
-      </w:r>
-      <w:r>
-        <w:t xml:space="preserve">compute-heavy stages (structural search, pocket detection) can be replaced by laptop-friendly,</w:t>
-      </w:r>
-      <w:r>
-        <w:t xml:space="preserve"> </w:t>
-      </w:r>
-      <w:r>
-        <w:t xml:space="preserve">dependency-free equivalents without sacrificing interpretability; and (3) an openly available software</w:t>
-      </w:r>
-      <w:r>
-        <w:t xml:space="preserve"> </w:t>
-      </w:r>
-      <w:r>
-        <w:t xml:space="preserve">tool, including an interactive viewer, suitable for reproduction and extension.</w:t>
+        <w:t xml:space="preserve">Our contribution is fourfold: (1) an explicit demonstration that meaningful structure-based function</w:t>
+      </w:r>
+      <w:r>
+        <w:t xml:space="preserve"> </w:t>
+      </w:r>
+      <w:r>
+        <w:t xml:space="preserve">annotation is achievable on commodity hardware, without HPC, GPUs, or large indexed databases; (2) a</w:t>
+      </w:r>
+      <w:r>
+        <w:t xml:space="preserve"> </w:t>
+      </w:r>
+      <w:r>
+        <w:t xml:space="preserve">transparent, end-to-end pipeline that turns raw AlphaFold models into ranked, evidence-linked functional</w:t>
+      </w:r>
+      <w:r>
+        <w:t xml:space="preserve"> </w:t>
+      </w:r>
+      <w:r>
+        <w:t xml:space="preserve">hypotheses, in which the compute-heavy stages (structural search, pocket detection) are replaced by</w:t>
+      </w:r>
+      <w:r>
+        <w:t xml:space="preserve"> </w:t>
+      </w:r>
+      <w:r>
+        <w:t xml:space="preserve">laptop-friendly, fully interpretable equivalents; (3) a controlled validation quantifying recovery</w:t>
+      </w:r>
+      <w:r>
+        <w:t xml:space="preserve"> </w:t>
+      </w:r>
+      <w:r>
+        <w:t xml:space="preserve">accuracy against a sequence baseline, with residue-level active-site verification and ranking-robustness</w:t>
+      </w:r>
+      <w:r>
+        <w:t xml:space="preserve"> </w:t>
+      </w:r>
+      <w:r>
+        <w:t xml:space="preserve">analysis; and (4) an openly available, reproducible software tool with an interactive viewer. Our</w:t>
+      </w:r>
+      <w:r>
+        <w:t xml:space="preserve"> </w:t>
+      </w:r>
+      <w:r>
+        <w:t xml:space="preserve">approach is deliberately</w:t>
+      </w:r>
+      <w:r>
+        <w:t xml:space="preserve"> </w:t>
+      </w:r>
+      <w:r>
+        <w:rPr>
+          <w:b/>
+          <w:bCs/>
+        </w:rPr>
+        <w:t xml:space="preserve">complementary</w:t>
+      </w:r>
+      <w:r>
+        <w:t xml:space="preserve"> </w:t>
+      </w:r>
+      <w:r>
+        <w:t xml:space="preserve">to the prior art: unlike learned predictors such as DeepFRI</w:t>
+      </w:r>
+      <w:r>
+        <w:t xml:space="preserve"> </w:t>
+      </w:r>
+      <w:r>
+        <w:t xml:space="preserve">[12] it is fully interpretable — every assignment is traceable to a specific structural match and to</w:t>
+      </w:r>
+      <w:r>
+        <w:t xml:space="preserve"> </w:t>
+      </w:r>
+      <w:r>
+        <w:t xml:space="preserve">conserved catalytic residues rather than a black-box inference — and unlike Foldseek [5] it trades raw</w:t>
+      </w:r>
+      <w:r>
+        <w:t xml:space="preserve"> </w:t>
+      </w:r>
+      <w:r>
+        <w:t xml:space="preserve">search speed for transparency and accessibility on everyday hardware.</w:t>
       </w:r>
     </w:p>
     <w:p>
@@ -5192,7 +5332,7 @@
       </w:r>
     </w:p>
     <w:bookmarkEnd w:id="43"/>
-    <w:bookmarkStart w:id="59" w:name="figures"/>
+    <w:bookmarkStart w:id="62" w:name="figures"/>
     <w:p>
       <w:pPr>
         <w:pStyle w:val="Heading2"/>
@@ -5300,65 +5440,116 @@
     </w:p>
     <w:p>
       <w:pPr>
-        <w:pStyle w:val="BodyText"/>
-      </w:pPr>
-      <w:r>
-        <w:rPr>
-          <w:b/>
-          <w:bCs/>
-        </w:rPr>
-        <w:t xml:space="preserve">Figure 2. Web viewer.</w:t>
-      </w:r>
-      <w:r>
-        <w:t xml:space="preserve"> </w:t>
-      </w:r>
-      <w:r>
-        <w:t xml:space="preserve">Static browser interface showing the ranked candidate table (left) and, for a</w:t>
-      </w:r>
-      <w:r>
-        <w:t xml:space="preserve"> </w:t>
-      </w:r>
-      <w:r>
-        <w:t xml:space="preserve">selected candidate, its AlphaFold structure coloured by pLDDT together with its best structural match,</w:t>
-      </w:r>
-      <w:r>
-        <w:t xml:space="preserve"> </w:t>
-      </w:r>
-      <w:r>
-        <w:t xml:space="preserve">match confidence, pocket statistics, and per-component scores (right).</w:t>
-      </w:r>
-      <w:r>
-        <w:t xml:space="preserve"> </w:t>
-      </w:r>
-      <w:r>
-        <w:rPr>
-          <w:i/>
-          <w:iCs/>
-        </w:rPr>
-        <w:t xml:space="preserve">[Insert screenshot from the running viewer.]</w:t>
-      </w:r>
-    </w:p>
-    <w:p>
-      <w:pPr>
         <w:pStyle w:val="CaptionedFigure"/>
       </w:pPr>
       <w:r>
         <w:drawing>
           <wp:inline>
-            <wp:extent cx="5334000" cy="3556000"/>
+            <wp:extent cx="5334000" cy="3417093"/>
             <wp:effectExtent b="0" l="0" r="0" t="0"/>
-            <wp:docPr descr="Leave-one-out function recovery" title="" id="48" name="Picture"/>
+            <wp:docPr descr="Web viewer" title="" id="48" name="Picture"/>
             <a:graphic>
               <a:graphicData uri="http://schemas.openxmlformats.org/drawingml/2006/picture">
                 <pic:pic>
                   <pic:nvPicPr>
-                    <pic:cNvPr descr="../benchmark/results/figures/fig_ec_accuracy.png" id="49" name="Picture"/>
+                    <pic:cNvPr descr="figures/fig2_viewer.png" id="49" name="Picture"/>
                     <pic:cNvPicPr>
                       <a:picLocks noChangeArrowheads="1" noChangeAspect="1"/>
                     </pic:cNvPicPr>
                   </pic:nvPicPr>
                   <pic:blipFill>
                     <a:blip r:embed="rId47"/>
+                    <a:stretch>
+                      <a:fillRect/>
+                    </a:stretch>
+                  </pic:blipFill>
+                  <pic:spPr bwMode="auto">
+                    <a:xfrm>
+                      <a:off x="0" y="0"/>
+                      <a:ext cx="5334000" cy="3417093"/>
+                    </a:xfrm>
+                    <a:prstGeom prst="rect">
+                      <a:avLst/>
+                    </a:prstGeom>
+                    <a:noFill/>
+                    <a:ln w="9525">
+                      <a:noFill/>
+                      <a:headEnd/>
+                      <a:tailEnd/>
+                    </a:ln>
+                  </pic:spPr>
+                </pic:pic>
+              </a:graphicData>
+            </a:graphic>
+          </wp:inline>
+        </w:drawing>
+      </w:r>
+    </w:p>
+    <w:p>
+      <w:pPr>
+        <w:pStyle w:val="ImageCaption"/>
+      </w:pPr>
+      <w:r>
+        <w:t xml:space="preserve">Web viewer</w:t>
+      </w:r>
+    </w:p>
+    <w:p>
+      <w:pPr>
+        <w:pStyle w:val="BodyText"/>
+      </w:pPr>
+      <w:r>
+        <w:rPr>
+          <w:b/>
+          <w:bCs/>
+        </w:rPr>
+        <w:t xml:space="preserve">Figure 2. Web viewer.</w:t>
+      </w:r>
+      <w:r>
+        <w:t xml:space="preserve"> </w:t>
+      </w:r>
+      <w:r>
+        <w:t xml:space="preserve">Static browser interface showing the ranked candidate table (left) and, for</w:t>
+      </w:r>
+      <w:r>
+        <w:t xml:space="preserve"> </w:t>
+      </w:r>
+      <w:r>
+        <w:t xml:space="preserve">the selected top candidate (P9WIT1), its AlphaFold structure coloured by pLDDT (blue = high confidence)</w:t>
+      </w:r>
+      <w:r>
+        <w:t xml:space="preserve"> </w:t>
+      </w:r>
+      <w:r>
+        <w:t xml:space="preserve">together with its best structural match (D-2-hydroxyglutarate dehydrogenase, TM-score 0.90), match</w:t>
+      </w:r>
+      <w:r>
+        <w:t xml:space="preserve"> </w:t>
+      </w:r>
+      <w:r>
+        <w:t xml:space="preserve">confidence, pocket statistics, and per-component scores (right).</w:t>
+      </w:r>
+    </w:p>
+    <w:p>
+      <w:pPr>
+        <w:pStyle w:val="CaptionedFigure"/>
+      </w:pPr>
+      <w:r>
+        <w:drawing>
+          <wp:inline>
+            <wp:extent cx="5334000" cy="3556000"/>
+            <wp:effectExtent b="0" l="0" r="0" t="0"/>
+            <wp:docPr descr="Leave-one-out function recovery" title="" id="51" name="Picture"/>
+            <a:graphic>
+              <a:graphicData uri="http://schemas.openxmlformats.org/drawingml/2006/picture">
+                <pic:pic>
+                  <pic:nvPicPr>
+                    <pic:cNvPr descr="../benchmark/results/figures/fig_ec_accuracy.png" id="52" name="Picture"/>
+                    <pic:cNvPicPr>
+                      <a:picLocks noChangeArrowheads="1" noChangeAspect="1"/>
+                    </pic:cNvPicPr>
+                  </pic:nvPicPr>
+                  <pic:blipFill>
+                    <a:blip r:embed="rId50"/>
                     <a:stretch>
                       <a:fillRect/>
                     </a:stretch>
@@ -5459,18 +5650,18 @@
           <wp:inline>
             <wp:extent cx="5334000" cy="3733799"/>
             <wp:effectExtent b="0" l="0" r="0" t="0"/>
-            <wp:docPr descr="Structure recovers function below the sequence twilight zone" title="" id="51" name="Picture"/>
+            <wp:docPr descr="Structure recovers function below the sequence twilight zone" title="" id="54" name="Picture"/>
             <a:graphic>
               <a:graphicData uri="http://schemas.openxmlformats.org/drawingml/2006/picture">
                 <pic:pic>
                   <pic:nvPicPr>
-                    <pic:cNvPr descr="../benchmark/results/figures/fig_tm_vs_identity.png" id="52" name="Picture"/>
+                    <pic:cNvPr descr="../benchmark/results/figures/fig_tm_vs_identity.png" id="55" name="Picture"/>
                     <pic:cNvPicPr>
                       <a:picLocks noChangeArrowheads="1" noChangeAspect="1"/>
                     </pic:cNvPicPr>
                   </pic:nvPicPr>
                   <pic:blipFill>
-                    <a:blip r:embed="rId50"/>
+                    <a:blip r:embed="rId53"/>
                     <a:stretch>
                       <a:fillRect/>
                     </a:stretch>
@@ -5597,18 +5788,18 @@
           <wp:inline>
             <wp:extent cx="5334000" cy="3556000"/>
             <wp:effectExtent b="0" l="0" r="0" t="0"/>
-            <wp:docPr descr="Calibration of the TM-score threshold" title="" id="54" name="Picture"/>
+            <wp:docPr descr="Calibration of the TM-score threshold" title="" id="57" name="Picture"/>
             <a:graphic>
               <a:graphicData uri="http://schemas.openxmlformats.org/drawingml/2006/picture">
                 <pic:pic>
                   <pic:nvPicPr>
-                    <pic:cNvPr descr="../benchmark/results/figures/fig_precision_threshold.png" id="55" name="Picture"/>
+                    <pic:cNvPr descr="../benchmark/results/figures/fig_precision_threshold.png" id="58" name="Picture"/>
                     <pic:cNvPicPr>
                       <a:picLocks noChangeArrowheads="1" noChangeAspect="1"/>
                     </pic:cNvPicPr>
                   </pic:nvPicPr>
                   <pic:blipFill>
-                    <a:blip r:embed="rId53"/>
+                    <a:blip r:embed="rId56"/>
                     <a:stretch>
                       <a:fillRect/>
                     </a:stretch>
@@ -5717,18 +5908,18 @@
           <wp:inline>
             <wp:extent cx="5334000" cy="2250074"/>
             <wp:effectExtent b="0" l="0" r="0" t="0"/>
-            <wp:docPr descr="The candidate ranking is insensitive to the composite weights" title="" id="57" name="Picture"/>
+            <wp:docPr descr="The candidate ranking is insensitive to the composite weights" title="" id="60" name="Picture"/>
             <a:graphic>
               <a:graphicData uri="http://schemas.openxmlformats.org/drawingml/2006/picture">
                 <pic:pic>
                   <pic:nvPicPr>
-                    <pic:cNvPr descr="../benchmark/results/figures/fig_weight_sensitivity.png" id="58" name="Picture"/>
+                    <pic:cNvPr descr="../benchmark/results/figures/fig_weight_sensitivity.png" id="61" name="Picture"/>
                     <pic:cNvPicPr>
                       <a:picLocks noChangeArrowheads="1" noChangeAspect="1"/>
                     </pic:cNvPicPr>
                   </pic:nvPicPr>
                   <pic:blipFill>
-                    <a:blip r:embed="rId56"/>
+                    <a:blip r:embed="rId59"/>
                     <a:stretch>
                       <a:fillRect/>
                     </a:stretch>
@@ -5847,8 +6038,8 @@
         </w:pict>
       </w:r>
     </w:p>
-    <w:bookmarkEnd w:id="59"/>
-    <w:bookmarkStart w:id="60" w:name="references"/>
+    <w:bookmarkEnd w:id="62"/>
+    <w:bookmarkStart w:id="63" w:name="references"/>
     <w:p>
       <w:pPr>
         <w:pStyle w:val="Heading2"/>
@@ -6308,6 +6499,140 @@
       </w:r>
     </w:p>
     <w:p>
+      <w:pPr>
+        <w:pStyle w:val="Compact"/>
+        <w:numPr>
+          <w:ilvl w:val="0"/>
+          <w:numId w:val="1004"/>
+        </w:numPr>
+      </w:pPr>
+      <w:r>
+        <w:t xml:space="preserve">Gligorijević V, Renfrew PD, Kosciolek T,</w:t>
+      </w:r>
+      <w:r>
+        <w:t xml:space="preserve"> </w:t>
+      </w:r>
+      <w:r>
+        <w:rPr>
+          <w:i/>
+          <w:iCs/>
+        </w:rPr>
+        <w:t xml:space="preserve">et al.</w:t>
+      </w:r>
+      <w:r>
+        <w:t xml:space="preserve"> </w:t>
+      </w:r>
+      <w:r>
+        <w:t xml:space="preserve">Structure-based protein function prediction using</w:t>
+      </w:r>
+      <w:r>
+        <w:t xml:space="preserve"> </w:t>
+      </w:r>
+      <w:r>
+        <w:t xml:space="preserve">graph convolutional networks.</w:t>
+      </w:r>
+      <w:r>
+        <w:t xml:space="preserve"> </w:t>
+      </w:r>
+      <w:r>
+        <w:rPr>
+          <w:i/>
+          <w:iCs/>
+        </w:rPr>
+        <w:t xml:space="preserve">Nature Communications</w:t>
+      </w:r>
+      <w:r>
+        <w:t xml:space="preserve"> </w:t>
+      </w:r>
+      <w:r>
+        <w:t xml:space="preserve">2021; 12:3168.</w:t>
+      </w:r>
+    </w:p>
+    <w:p>
+      <w:pPr>
+        <w:pStyle w:val="Compact"/>
+        <w:numPr>
+          <w:ilvl w:val="0"/>
+          <w:numId w:val="1004"/>
+        </w:numPr>
+      </w:pPr>
+      <w:r>
+        <w:t xml:space="preserve">Thornton JM, Laskowski RA, Borkakoti N. AlphaFold heralds a data-driven revolution in biology and</w:t>
+      </w:r>
+      <w:r>
+        <w:t xml:space="preserve"> </w:t>
+      </w:r>
+      <w:r>
+        <w:t xml:space="preserve">medicine.</w:t>
+      </w:r>
+      <w:r>
+        <w:t xml:space="preserve"> </w:t>
+      </w:r>
+      <w:r>
+        <w:rPr>
+          <w:i/>
+          <w:iCs/>
+        </w:rPr>
+        <w:t xml:space="preserve">Nature Medicine</w:t>
+      </w:r>
+      <w:r>
+        <w:t xml:space="preserve"> </w:t>
+      </w:r>
+      <w:r>
+        <w:t xml:space="preserve">2021; 27:1666–1669.</w:t>
+      </w:r>
+    </w:p>
+    <w:p>
+      <w:pPr>
+        <w:pStyle w:val="Compact"/>
+        <w:numPr>
+          <w:ilvl w:val="0"/>
+          <w:numId w:val="1004"/>
+        </w:numPr>
+      </w:pPr>
+      <w:r>
+        <w:t xml:space="preserve">Akdel M, Pires DEV, Pardo EP,</w:t>
+      </w:r>
+      <w:r>
+        <w:t xml:space="preserve"> </w:t>
+      </w:r>
+      <w:r>
+        <w:rPr>
+          <w:i/>
+          <w:iCs/>
+        </w:rPr>
+        <w:t xml:space="preserve">et al.</w:t>
+      </w:r>
+      <w:r>
+        <w:t xml:space="preserve"> </w:t>
+      </w:r>
+      <w:r>
+        <w:t xml:space="preserve">A structural biology community assessment of AlphaFold2</w:t>
+      </w:r>
+      <w:r>
+        <w:t xml:space="preserve"> </w:t>
+      </w:r>
+      <w:r>
+        <w:t xml:space="preserve">applications.</w:t>
+      </w:r>
+      <w:r>
+        <w:t xml:space="preserve"> </w:t>
+      </w:r>
+      <w:r>
+        <w:rPr>
+          <w:i/>
+          <w:iCs/>
+        </w:rPr>
+        <w:t xml:space="preserve">Nature Structural &amp; Molecular Biology</w:t>
+      </w:r>
+      <w:r>
+        <w:t xml:space="preserve"> </w:t>
+      </w:r>
+      <w:r>
+        <w:t xml:space="preserve">2022; 29:1056–1067.</w:t>
+      </w:r>
+    </w:p>
+    <w:p>
       <w:r>
         <w:pict>
           <v:rect style="width:0;height:1.5pt" o:hralign="center" o:hrstd="t" o:hr="t"/>
@@ -6350,8 +6675,643 @@
         <w:t xml:space="preserve">where appropriate.</w:t>
       </w:r>
     </w:p>
-    <w:bookmarkEnd w:id="60"/>
-    <w:bookmarkEnd w:id="61"/>
+    <w:p>
+      <w:r>
+        <w:pict>
+          <v:rect style="width:0;height:1.5pt" o:hralign="center" o:hrstd="t" o:hr="t"/>
+        </w:pict>
+      </w:r>
+    </w:p>
+    <w:bookmarkEnd w:id="63"/>
+    <w:bookmarkStart w:id="64" w:name="appendix-a.-how-to-reproduce"/>
+    <w:p>
+      <w:pPr>
+        <w:pStyle w:val="Heading2"/>
+      </w:pPr>
+      <w:r>
+        <w:t xml:space="preserve">Appendix A. How to reproduce</w:t>
+      </w:r>
+    </w:p>
+    <w:p>
+      <w:pPr>
+        <w:pStyle w:val="FirstParagraph"/>
+      </w:pPr>
+      <w:r>
+        <w:t xml:space="preserve">Everything below runs on a commodity laptop (no GPU, no admin rights). Times are approximate on a</w:t>
+      </w:r>
+      <w:r>
+        <w:t xml:space="preserve"> </w:t>
+      </w:r>
+      <w:r>
+        <w:t xml:space="preserve">consumer CPU.</w:t>
+      </w:r>
+    </w:p>
+    <w:p>
+      <w:pPr>
+        <w:pStyle w:val="BodyText"/>
+      </w:pPr>
+      <w:r>
+        <w:rPr>
+          <w:b/>
+          <w:bCs/>
+        </w:rPr>
+        <w:t xml:space="preserve">Environment (~2 min).</w:t>
+      </w:r>
+    </w:p>
+    <w:p>
+      <w:pPr>
+        <w:pStyle w:val="SourceCode"/>
+      </w:pPr>
+      <w:r>
+        <w:rPr>
+          <w:rStyle w:val="FunctionTok"/>
+        </w:rPr>
+        <w:t xml:space="preserve">git</w:t>
+      </w:r>
+      <w:r>
+        <w:rPr>
+          <w:rStyle w:val="NormalTok"/>
+        </w:rPr>
+        <w:t xml:space="preserve"> clone </w:t>
+      </w:r>
+      <w:r>
+        <w:rPr>
+          <w:rStyle w:val="OperatorTok"/>
+        </w:rPr>
+        <w:t xml:space="preserve">&lt;</w:t>
+      </w:r>
+      <w:r>
+        <w:rPr>
+          <w:rStyle w:val="NormalTok"/>
+        </w:rPr>
+        <w:t xml:space="preserve">repository-url</w:t>
+      </w:r>
+      <w:r>
+        <w:rPr>
+          <w:rStyle w:val="OperatorTok"/>
+        </w:rPr>
+        <w:t xml:space="preserve">&gt;</w:t>
+      </w:r>
+      <w:r>
+        <w:rPr>
+          <w:rStyle w:val="NormalTok"/>
+        </w:rPr>
+        <w:t xml:space="preserve"> </w:t>
+      </w:r>
+      <w:r>
+        <w:rPr>
+          <w:rStyle w:val="KeywordTok"/>
+        </w:rPr>
+        <w:t xml:space="preserve">&amp;&amp;</w:t>
+      </w:r>
+      <w:r>
+        <w:rPr>
+          <w:rStyle w:val="NormalTok"/>
+        </w:rPr>
+        <w:t xml:space="preserve"> </w:t>
+      </w:r>
+      <w:r>
+        <w:rPr>
+          <w:rStyle w:val="BuiltInTok"/>
+        </w:rPr>
+        <w:t xml:space="preserve">cd</w:t>
+      </w:r>
+      <w:r>
+        <w:rPr>
+          <w:rStyle w:val="NormalTok"/>
+        </w:rPr>
+        <w:t xml:space="preserve"> protein-function-rescue</w:t>
+      </w:r>
+      <w:r>
+        <w:br/>
+      </w:r>
+      <w:r>
+        <w:rPr>
+          <w:rStyle w:val="ExtensionTok"/>
+        </w:rPr>
+        <w:t xml:space="preserve">python</w:t>
+      </w:r>
+      <w:r>
+        <w:rPr>
+          <w:rStyle w:val="NormalTok"/>
+        </w:rPr>
+        <w:t xml:space="preserve"> </w:t>
+      </w:r>
+      <w:r>
+        <w:rPr>
+          <w:rStyle w:val="AttributeTok"/>
+        </w:rPr>
+        <w:t xml:space="preserve">-m</w:t>
+      </w:r>
+      <w:r>
+        <w:rPr>
+          <w:rStyle w:val="NormalTok"/>
+        </w:rPr>
+        <w:t xml:space="preserve"> pip install </w:t>
+      </w:r>
+      <w:r>
+        <w:rPr>
+          <w:rStyle w:val="AttributeTok"/>
+        </w:rPr>
+        <w:t xml:space="preserve">-r</w:t>
+      </w:r>
+      <w:r>
+        <w:rPr>
+          <w:rStyle w:val="NormalTok"/>
+        </w:rPr>
+        <w:t xml:space="preserve"> requirements.txt</w:t>
+      </w:r>
+    </w:p>
+    <w:p>
+      <w:pPr>
+        <w:pStyle w:val="FirstParagraph"/>
+      </w:pPr>
+      <w:r>
+        <w:rPr>
+          <w:b/>
+          <w:bCs/>
+        </w:rPr>
+        <w:t xml:space="preserve">Reproduce the pilot (Section 3) and the interactive viewer (~5 min).</w:t>
+      </w:r>
+    </w:p>
+    <w:p>
+      <w:pPr>
+        <w:pStyle w:val="SourceCode"/>
+      </w:pPr>
+      <w:r>
+        <w:rPr>
+          <w:rStyle w:val="ExtensionTok"/>
+        </w:rPr>
+        <w:t xml:space="preserve">python</w:t>
+      </w:r>
+      <w:r>
+        <w:rPr>
+          <w:rStyle w:val="NormalTok"/>
+        </w:rPr>
+        <w:t xml:space="preserve"> </w:t>
+      </w:r>
+      <w:r>
+        <w:rPr>
+          <w:rStyle w:val="AttributeTok"/>
+        </w:rPr>
+        <w:t xml:space="preserve">-m</w:t>
+      </w:r>
+      <w:r>
+        <w:rPr>
+          <w:rStyle w:val="NormalTok"/>
+        </w:rPr>
+        <w:t xml:space="preserve"> pipeline.run all            </w:t>
+      </w:r>
+      <w:r>
+        <w:rPr>
+          <w:rStyle w:val="CommentTok"/>
+        </w:rPr>
+        <w:t xml:space="preserve"># download → parse → annotate → search → pocket → rank</w:t>
+      </w:r>
+      <w:r>
+        <w:br/>
+      </w:r>
+      <w:r>
+        <w:rPr>
+          <w:rStyle w:val="CommentTok"/>
+        </w:rPr>
+        <w:t xml:space="preserve"># open web/index.html in a browser (double-click) to explore the ranked candidates in 3D</w:t>
+      </w:r>
+    </w:p>
+    <w:p>
+      <w:pPr>
+        <w:pStyle w:val="FirstParagraph"/>
+      </w:pPr>
+      <w:r>
+        <w:rPr>
+          <w:rStyle w:val="VerbatimChar"/>
+        </w:rPr>
+        <w:t xml:space="preserve">--limit N</w:t>
+      </w:r>
+      <w:r>
+        <w:t xml:space="preserve"> </w:t>
+      </w:r>
+      <w:r>
+        <w:t xml:space="preserve">restricts to the first N structures for a quick test. Outputs land in</w:t>
+      </w:r>
+      <w:r>
+        <w:t xml:space="preserve"> </w:t>
+      </w:r>
+      <w:r>
+        <w:rPr>
+          <w:rStyle w:val="VerbatimChar"/>
+        </w:rPr>
+        <w:t xml:space="preserve">results/</w:t>
+      </w:r>
+      <w:r>
+        <w:t xml:space="preserve"> </w:t>
+      </w:r>
+      <w:r>
+        <w:t xml:space="preserve">(</w:t>
+      </w:r>
+      <w:r>
+        <w:rPr>
+          <w:rStyle w:val="VerbatimChar"/>
+        </w:rPr>
+        <w:t xml:space="preserve">results.json</w:t>
+      </w:r>
+      <w:r>
+        <w:t xml:space="preserve">,</w:t>
+      </w:r>
+      <w:r>
+        <w:t xml:space="preserve"> </w:t>
+      </w:r>
+      <w:r>
+        <w:rPr>
+          <w:rStyle w:val="VerbatimChar"/>
+        </w:rPr>
+        <w:t xml:space="preserve">candidates.csv</w:t>
+      </w:r>
+      <w:r>
+        <w:t xml:space="preserve">) and</w:t>
+      </w:r>
+      <w:r>
+        <w:t xml:space="preserve"> </w:t>
+      </w:r>
+      <w:r>
+        <w:rPr>
+          <w:rStyle w:val="VerbatimChar"/>
+        </w:rPr>
+        <w:t xml:space="preserve">web/data.js</w:t>
+      </w:r>
+      <w:r>
+        <w:t xml:space="preserve">.</w:t>
+      </w:r>
+    </w:p>
+    <w:p>
+      <w:pPr>
+        <w:pStyle w:val="BodyText"/>
+      </w:pPr>
+      <w:r>
+        <w:rPr>
+          <w:b/>
+          <w:bCs/>
+        </w:rPr>
+        <w:t xml:space="preserve">Reproduce the functional-residue verification (Section 3.6, Table 2, ~1 min).</w:t>
+      </w:r>
+    </w:p>
+    <w:p>
+      <w:pPr>
+        <w:pStyle w:val="SourceCode"/>
+      </w:pPr>
+      <w:r>
+        <w:rPr>
+          <w:rStyle w:val="ExtensionTok"/>
+        </w:rPr>
+        <w:t xml:space="preserve">python</w:t>
+      </w:r>
+      <w:r>
+        <w:rPr>
+          <w:rStyle w:val="NormalTok"/>
+        </w:rPr>
+        <w:t xml:space="preserve"> </w:t>
+      </w:r>
+      <w:r>
+        <w:rPr>
+          <w:rStyle w:val="AttributeTok"/>
+        </w:rPr>
+        <w:t xml:space="preserve">-m</w:t>
+      </w:r>
+      <w:r>
+        <w:rPr>
+          <w:rStyle w:val="NormalTok"/>
+        </w:rPr>
+        <w:t xml:space="preserve"> pipeline.functional_residues        </w:t>
+      </w:r>
+      <w:r>
+        <w:rPr>
+          <w:rStyle w:val="CommentTok"/>
+        </w:rPr>
+        <w:t xml:space="preserve"># writes results/functional_residues.json</w:t>
+      </w:r>
+    </w:p>
+    <w:p>
+      <w:pPr>
+        <w:pStyle w:val="FirstParagraph"/>
+      </w:pPr>
+      <w:r>
+        <w:rPr>
+          <w:b/>
+          <w:bCs/>
+        </w:rPr>
+        <w:t xml:space="preserve">Reproduce the validation benchmark (Section 4, Figures 3–5; ~2–3 h, resumable).</w:t>
+      </w:r>
+    </w:p>
+    <w:p>
+      <w:pPr>
+        <w:pStyle w:val="SourceCode"/>
+      </w:pPr>
+      <w:r>
+        <w:rPr>
+          <w:rStyle w:val="ExtensionTok"/>
+        </w:rPr>
+        <w:t xml:space="preserve">python</w:t>
+      </w:r>
+      <w:r>
+        <w:rPr>
+          <w:rStyle w:val="NormalTok"/>
+        </w:rPr>
+        <w:t xml:space="preserve"> benchmark/run_benchmark.py             </w:t>
+      </w:r>
+      <w:r>
+        <w:rPr>
+          <w:rStyle w:val="CommentTok"/>
+        </w:rPr>
+        <w:t xml:space="preserve"># builds the labelled set, runs leave-one-out</w:t>
+      </w:r>
+    </w:p>
+    <w:p>
+      <w:pPr>
+        <w:pStyle w:val="FirstParagraph"/>
+      </w:pPr>
+      <w:r>
+        <w:t xml:space="preserve">Writes</w:t>
+      </w:r>
+      <w:r>
+        <w:t xml:space="preserve"> </w:t>
+      </w:r>
+      <w:r>
+        <w:rPr>
+          <w:rStyle w:val="VerbatimChar"/>
+        </w:rPr>
+        <w:t xml:space="preserve">benchmark/results/metrics.json</w:t>
+      </w:r>
+      <w:r>
+        <w:t xml:space="preserve">,</w:t>
+      </w:r>
+      <w:r>
+        <w:t xml:space="preserve"> </w:t>
+      </w:r>
+      <w:r>
+        <w:rPr>
+          <w:rStyle w:val="VerbatimChar"/>
+        </w:rPr>
+        <w:t xml:space="preserve">per_query.csv</w:t>
+      </w:r>
+      <w:r>
+        <w:t xml:space="preserve">, and the figures. The O(n²) TM-align sweep</w:t>
+      </w:r>
+      <w:r>
+        <w:t xml:space="preserve"> </w:t>
+      </w:r>
+      <w:r>
+        <w:t xml:space="preserve">checkpoints periodically and resumes if interrupted.</w:t>
+      </w:r>
+    </w:p>
+    <w:p>
+      <w:pPr>
+        <w:pStyle w:val="BodyText"/>
+      </w:pPr>
+      <w:r>
+        <w:rPr>
+          <w:b/>
+          <w:bCs/>
+        </w:rPr>
+        <w:t xml:space="preserve">Reproduce the weight-sensitivity analysis (Section 4.6, Figure 6; ~30 min).</w:t>
+      </w:r>
+    </w:p>
+    <w:p>
+      <w:pPr>
+        <w:pStyle w:val="SourceCode"/>
+      </w:pPr>
+      <w:r>
+        <w:rPr>
+          <w:rStyle w:val="ExtensionTok"/>
+        </w:rPr>
+        <w:t xml:space="preserve">python</w:t>
+      </w:r>
+      <w:r>
+        <w:rPr>
+          <w:rStyle w:val="NormalTok"/>
+        </w:rPr>
+        <w:t xml:space="preserve"> benchmark/build_candidate_pool.py      </w:t>
+      </w:r>
+      <w:r>
+        <w:rPr>
+          <w:rStyle w:val="CommentTok"/>
+        </w:rPr>
+        <w:t xml:space="preserve"># realistic candidate pool</w:t>
+      </w:r>
+      <w:r>
+        <w:br/>
+      </w:r>
+      <w:r>
+        <w:rPr>
+          <w:rStyle w:val="ExtensionTok"/>
+        </w:rPr>
+        <w:t xml:space="preserve">python</w:t>
+      </w:r>
+      <w:r>
+        <w:rPr>
+          <w:rStyle w:val="NormalTok"/>
+        </w:rPr>
+        <w:t xml:space="preserve"> benchmark/weight_sensitivity.py        </w:t>
+      </w:r>
+      <w:r>
+        <w:rPr>
+          <w:rStyle w:val="CommentTok"/>
+        </w:rPr>
+        <w:t xml:space="preserve"># writes weight_sensitivity.json + figure</w:t>
+      </w:r>
+    </w:p>
+    <w:p>
+      <w:pPr>
+        <w:pStyle w:val="FirstParagraph"/>
+      </w:pPr>
+      <w:r>
+        <w:rPr>
+          <w:b/>
+          <w:bCs/>
+        </w:rPr>
+        <w:t xml:space="preserve">Render this manuscript to DOCX/PDF.</w:t>
+      </w:r>
+    </w:p>
+    <w:p>
+      <w:pPr>
+        <w:pStyle w:val="SourceCode"/>
+      </w:pPr>
+      <w:r>
+        <w:rPr>
+          <w:rStyle w:val="ExtensionTok"/>
+        </w:rPr>
+        <w:t xml:space="preserve">python</w:t>
+      </w:r>
+      <w:r>
+        <w:rPr>
+          <w:rStyle w:val="NormalTok"/>
+        </w:rPr>
+        <w:t xml:space="preserve"> paper/render.py                         </w:t>
+      </w:r>
+      <w:r>
+        <w:rPr>
+          <w:rStyle w:val="CommentTok"/>
+        </w:rPr>
+        <w:t xml:space="preserve"># DOCX always; PDF if MS Word or a LaTeX engine is present</w:t>
+      </w:r>
+    </w:p>
+    <w:p>
+      <w:pPr>
+        <w:pStyle w:val="FirstParagraph"/>
+      </w:pPr>
+      <w:r>
+        <w:rPr>
+          <w:b/>
+          <w:bCs/>
+        </w:rPr>
+        <w:t xml:space="preserve">Switch to the high-performance back-ends (optional, Linux/macOS).</w:t>
+      </w:r>
+      <w:r>
+        <w:t xml:space="preserve"> </w:t>
+      </w:r>
+      <w:r>
+        <w:t xml:space="preserve">Install Foldseek and fpocket</w:t>
+      </w:r>
+      <w:r>
+        <w:t xml:space="preserve"> </w:t>
+      </w:r>
+      <w:r>
+        <w:t xml:space="preserve">(</w:t>
+      </w:r>
+      <w:r>
+        <w:rPr>
+          <w:rStyle w:val="VerbatimChar"/>
+        </w:rPr>
+        <w:t xml:space="preserve">docs/SETUP_TOOLS.md</w:t>
+      </w:r>
+      <w:r>
+        <w:t xml:space="preserve">), then set</w:t>
+      </w:r>
+      <w:r>
+        <w:t xml:space="preserve"> </w:t>
+      </w:r>
+      <w:r>
+        <w:rPr>
+          <w:rStyle w:val="VerbatimChar"/>
+        </w:rPr>
+        <w:t xml:space="preserve">structural_search.backend: foldseek</w:t>
+      </w:r>
+      <w:r>
+        <w:t xml:space="preserve"> </w:t>
+      </w:r>
+      <w:r>
+        <w:t xml:space="preserve">and</w:t>
+      </w:r>
+      <w:r>
+        <w:t xml:space="preserve"> </w:t>
+      </w:r>
+      <w:r>
+        <w:rPr>
+          <w:rStyle w:val="VerbatimChar"/>
+        </w:rPr>
+        <w:t xml:space="preserve">pocket.backend: fpocket</w:t>
+      </w:r>
+      <w:r>
+        <w:t xml:space="preserve"> </w:t>
+      </w:r>
+      <w:r>
+        <w:t xml:space="preserve">in</w:t>
+      </w:r>
+      <w:r>
+        <w:t xml:space="preserve"> </w:t>
+      </w:r>
+      <w:r>
+        <w:rPr>
+          <w:rStyle w:val="VerbatimChar"/>
+        </w:rPr>
+        <w:t xml:space="preserve">config.yaml</w:t>
+      </w:r>
+      <w:r>
+        <w:t xml:space="preserve">.</w:t>
+      </w:r>
+      <w:r>
+        <w:t xml:space="preserve"> </w:t>
+      </w:r>
+      <w:r>
+        <w:rPr>
+          <w:b/>
+          <w:bCs/>
+        </w:rPr>
+        <w:t xml:space="preserve">Change organism</w:t>
+      </w:r>
+      <w:r>
+        <w:t xml:space="preserve"> </w:t>
+      </w:r>
+      <w:r>
+        <w:t xml:space="preserve">by editing the</w:t>
+      </w:r>
+      <w:r>
+        <w:t xml:space="preserve"> </w:t>
+      </w:r>
+      <w:r>
+        <w:rPr>
+          <w:rStyle w:val="VerbatimChar"/>
+        </w:rPr>
+        <w:t xml:space="preserve">organism</w:t>
+      </w:r>
+      <w:r>
+        <w:t xml:space="preserve"> </w:t>
+      </w:r>
+      <w:r>
+        <w:t xml:space="preserve">block in</w:t>
+      </w:r>
+      <w:r>
+        <w:t xml:space="preserve"> </w:t>
+      </w:r>
+      <w:r>
+        <w:rPr>
+          <w:rStyle w:val="VerbatimChar"/>
+        </w:rPr>
+        <w:t xml:space="preserve">config.yaml</w:t>
+      </w:r>
+      <w:r>
+        <w:t xml:space="preserve"> </w:t>
+      </w:r>
+      <w:r>
+        <w:t xml:space="preserve">to any proteome</w:t>
+      </w:r>
+      <w:r>
+        <w:t xml:space="preserve"> </w:t>
+      </w:r>
+      <w:r>
+        <w:t xml:space="preserve">listed on the AlphaFold DB FTP.</w:t>
+      </w:r>
+    </w:p>
+    <w:p>
+      <w:pPr>
+        <w:pStyle w:val="BodyText"/>
+      </w:pPr>
+      <w:r>
+        <w:t xml:space="preserve">Exact input identities are fixed by the tracked manifests (</w:t>
+      </w:r>
+      <w:r>
+        <w:rPr>
+          <w:rStyle w:val="VerbatimChar"/>
+        </w:rPr>
+        <w:t xml:space="preserve">references/manifest.json</w:t>
+      </w:r>
+      <w:r>
+        <w:t xml:space="preserve">,</w:t>
+      </w:r>
+      <w:r>
+        <w:t xml:space="preserve"> </w:t>
+      </w:r>
+      <w:r>
+        <w:rPr>
+          <w:rStyle w:val="VerbatimChar"/>
+        </w:rPr>
+        <w:t xml:space="preserve">benchmark/results/dataset.json</w:t>
+      </w:r>
+      <w:r>
+        <w:t xml:space="preserve">), so runs are reproducible up to upstream AlphaFold DB / UniProt updates.</w:t>
+      </w:r>
+    </w:p>
+    <w:bookmarkEnd w:id="64"/>
+    <w:bookmarkEnd w:id="65"/>
     <w:sectPr>
       <w:footnotePr>
         <w:numRestart w:val="eachSect"/>

</xml_diff>

<commit_message>
Add generative-AI disclosure and Zenodo-ready CITATION.cff
- Manuscript: "Use of generative AI" section (COPE/ICMJE-compliant disclosure;
  AI is a tool, not an author; author takes full responsibility).
- CITATION.cff (CFF 1.2.0) for GitHub "Cite this repository" + Zenodo DOI on
  release; placeholders for author/affiliation/ORCID/repo URL/date.
- README: Provenance & AI-assistance and Citing sections.
- Re-rendered DOCX/PDF.

Co-Authored-By: Claude Opus 4.8 <noreply@anthropic.com>
</commit_message>
<xml_diff>
--- a/paper/protein_function_rescue.docx
+++ b/paper/protein_function_rescue.docx
@@ -36,7 +36,7 @@
         </w:p>
       </w:sdtContent>
     </w:sdt>
-    <w:bookmarkStart w:id="65" w:name="X2d541942196f82a2883fccbb769b891731fb52e"/>
+    <w:bookmarkStart w:id="66" w:name="X2d541942196f82a2883fccbb769b891731fb52e"/>
     <w:p>
       <w:pPr>
         <w:pStyle w:val="Heading1"/>
@@ -5301,7 +5301,61 @@
       </w:r>
     </w:p>
     <w:bookmarkEnd w:id="42"/>
-    <w:bookmarkStart w:id="43" w:name="acknowledgements"/>
+    <w:bookmarkStart w:id="43" w:name="use-of-generative-ai"/>
+    <w:p>
+      <w:pPr>
+        <w:pStyle w:val="Heading2"/>
+      </w:pPr>
+      <w:r>
+        <w:t xml:space="preserve">Use of generative AI</w:t>
+      </w:r>
+    </w:p>
+    <w:p>
+      <w:pPr>
+        <w:pStyle w:val="FirstParagraph"/>
+      </w:pPr>
+      <w:r>
+        <w:t xml:space="preserve">In preparing this work the author used Anthropic’s Claude (Claude Opus 4 family) as a coding and writing</w:t>
+      </w:r>
+      <w:r>
+        <w:t xml:space="preserve"> </w:t>
+      </w:r>
+      <w:r>
+        <w:t xml:space="preserve">assistant: to help design and implement the software pipeline and the validation benchmark, to generate</w:t>
+      </w:r>
+      <w:r>
+        <w:t xml:space="preserve"> </w:t>
+      </w:r>
+      <w:r>
+        <w:t xml:space="preserve">the figures, and to draft and revise the text of this manuscript. After using this tool, the author</w:t>
+      </w:r>
+      <w:r>
+        <w:t xml:space="preserve"> </w:t>
+      </w:r>
+      <w:r>
+        <w:t xml:space="preserve">reviewed, edited, and verified the content, and takes full responsibility for it — including all code,</w:t>
+      </w:r>
+      <w:r>
+        <w:t xml:space="preserve"> </w:t>
+      </w:r>
+      <w:r>
+        <w:t xml:space="preserve">analyses, numerical results, and claims. No generative-AI system is listed as an author, consistent with</w:t>
+      </w:r>
+      <w:r>
+        <w:t xml:space="preserve"> </w:t>
+      </w:r>
+      <w:r>
+        <w:t xml:space="preserve">COPE and ICMJE guidance that authorship requires accountability a non-human tool cannot hold. All</w:t>
+      </w:r>
+      <w:r>
+        <w:t xml:space="preserve"> </w:t>
+      </w:r>
+      <w:r>
+        <w:t xml:space="preserve">citations were checked against the primary literature prior to submission.</w:t>
+      </w:r>
+    </w:p>
+    <w:bookmarkEnd w:id="43"/>
+    <w:bookmarkStart w:id="44" w:name="acknowledgements"/>
     <w:p>
       <w:pPr>
         <w:pStyle w:val="Heading2"/>
@@ -5331,8 +5385,8 @@
         </w:pict>
       </w:r>
     </w:p>
-    <w:bookmarkEnd w:id="43"/>
-    <w:bookmarkStart w:id="62" w:name="figures"/>
+    <w:bookmarkEnd w:id="44"/>
+    <w:bookmarkStart w:id="63" w:name="figures"/>
     <w:p>
       <w:pPr>
         <w:pStyle w:val="Heading2"/>
@@ -5350,18 +5404,18 @@
           <wp:inline>
             <wp:extent cx="5334000" cy="1468073"/>
             <wp:effectExtent b="0" l="0" r="0" t="0"/>
-            <wp:docPr descr="Pipeline overview" title="" id="45" name="Picture"/>
+            <wp:docPr descr="Pipeline overview" title="" id="46" name="Picture"/>
             <a:graphic>
               <a:graphicData uri="http://schemas.openxmlformats.org/drawingml/2006/picture">
                 <pic:pic>
                   <pic:nvPicPr>
-                    <pic:cNvPr descr="figures/fig1_pipeline.png" id="46" name="Picture"/>
+                    <pic:cNvPr descr="figures/fig1_pipeline.png" id="47" name="Picture"/>
                     <pic:cNvPicPr>
                       <a:picLocks noChangeArrowheads="1" noChangeAspect="1"/>
                     </pic:cNvPicPr>
                   </pic:nvPicPr>
                   <pic:blipFill>
-                    <a:blip r:embed="rId44"/>
+                    <a:blip r:embed="rId45"/>
                     <a:stretch>
                       <a:fillRect/>
                     </a:stretch>
@@ -5447,18 +5501,18 @@
           <wp:inline>
             <wp:extent cx="5334000" cy="3417093"/>
             <wp:effectExtent b="0" l="0" r="0" t="0"/>
-            <wp:docPr descr="Web viewer" title="" id="48" name="Picture"/>
+            <wp:docPr descr="Web viewer" title="" id="49" name="Picture"/>
             <a:graphic>
               <a:graphicData uri="http://schemas.openxmlformats.org/drawingml/2006/picture">
                 <pic:pic>
                   <pic:nvPicPr>
-                    <pic:cNvPr descr="figures/fig2_viewer.png" id="49" name="Picture"/>
+                    <pic:cNvPr descr="figures/fig2_viewer.png" id="50" name="Picture"/>
                     <pic:cNvPicPr>
                       <a:picLocks noChangeArrowheads="1" noChangeAspect="1"/>
                     </pic:cNvPicPr>
                   </pic:nvPicPr>
                   <pic:blipFill>
-                    <a:blip r:embed="rId47"/>
+                    <a:blip r:embed="rId48"/>
                     <a:stretch>
                       <a:fillRect/>
                     </a:stretch>
@@ -5538,18 +5592,18 @@
           <wp:inline>
             <wp:extent cx="5334000" cy="3556000"/>
             <wp:effectExtent b="0" l="0" r="0" t="0"/>
-            <wp:docPr descr="Leave-one-out function recovery" title="" id="51" name="Picture"/>
+            <wp:docPr descr="Leave-one-out function recovery" title="" id="52" name="Picture"/>
             <a:graphic>
               <a:graphicData uri="http://schemas.openxmlformats.org/drawingml/2006/picture">
                 <pic:pic>
                   <pic:nvPicPr>
-                    <pic:cNvPr descr="../benchmark/results/figures/fig_ec_accuracy.png" id="52" name="Picture"/>
+                    <pic:cNvPr descr="../benchmark/results/figures/fig_ec_accuracy.png" id="53" name="Picture"/>
                     <pic:cNvPicPr>
                       <a:picLocks noChangeArrowheads="1" noChangeAspect="1"/>
                     </pic:cNvPicPr>
                   </pic:nvPicPr>
                   <pic:blipFill>
-                    <a:blip r:embed="rId50"/>
+                    <a:blip r:embed="rId51"/>
                     <a:stretch>
                       <a:fillRect/>
                     </a:stretch>
@@ -5650,18 +5704,18 @@
           <wp:inline>
             <wp:extent cx="5334000" cy="3733799"/>
             <wp:effectExtent b="0" l="0" r="0" t="0"/>
-            <wp:docPr descr="Structure recovers function below the sequence twilight zone" title="" id="54" name="Picture"/>
+            <wp:docPr descr="Structure recovers function below the sequence twilight zone" title="" id="55" name="Picture"/>
             <a:graphic>
               <a:graphicData uri="http://schemas.openxmlformats.org/drawingml/2006/picture">
                 <pic:pic>
                   <pic:nvPicPr>
-                    <pic:cNvPr descr="../benchmark/results/figures/fig_tm_vs_identity.png" id="55" name="Picture"/>
+                    <pic:cNvPr descr="../benchmark/results/figures/fig_tm_vs_identity.png" id="56" name="Picture"/>
                     <pic:cNvPicPr>
                       <a:picLocks noChangeArrowheads="1" noChangeAspect="1"/>
                     </pic:cNvPicPr>
                   </pic:nvPicPr>
                   <pic:blipFill>
-                    <a:blip r:embed="rId53"/>
+                    <a:blip r:embed="rId54"/>
                     <a:stretch>
                       <a:fillRect/>
                     </a:stretch>
@@ -5788,18 +5842,18 @@
           <wp:inline>
             <wp:extent cx="5334000" cy="3556000"/>
             <wp:effectExtent b="0" l="0" r="0" t="0"/>
-            <wp:docPr descr="Calibration of the TM-score threshold" title="" id="57" name="Picture"/>
+            <wp:docPr descr="Calibration of the TM-score threshold" title="" id="58" name="Picture"/>
             <a:graphic>
               <a:graphicData uri="http://schemas.openxmlformats.org/drawingml/2006/picture">
                 <pic:pic>
                   <pic:nvPicPr>
-                    <pic:cNvPr descr="../benchmark/results/figures/fig_precision_threshold.png" id="58" name="Picture"/>
+                    <pic:cNvPr descr="../benchmark/results/figures/fig_precision_threshold.png" id="59" name="Picture"/>
                     <pic:cNvPicPr>
                       <a:picLocks noChangeArrowheads="1" noChangeAspect="1"/>
                     </pic:cNvPicPr>
                   </pic:nvPicPr>
                   <pic:blipFill>
-                    <a:blip r:embed="rId56"/>
+                    <a:blip r:embed="rId57"/>
                     <a:stretch>
                       <a:fillRect/>
                     </a:stretch>
@@ -5908,18 +5962,18 @@
           <wp:inline>
             <wp:extent cx="5334000" cy="2250074"/>
             <wp:effectExtent b="0" l="0" r="0" t="0"/>
-            <wp:docPr descr="The candidate ranking is insensitive to the composite weights" title="" id="60" name="Picture"/>
+            <wp:docPr descr="The candidate ranking is insensitive to the composite weights" title="" id="61" name="Picture"/>
             <a:graphic>
               <a:graphicData uri="http://schemas.openxmlformats.org/drawingml/2006/picture">
                 <pic:pic>
                   <pic:nvPicPr>
-                    <pic:cNvPr descr="../benchmark/results/figures/fig_weight_sensitivity.png" id="61" name="Picture"/>
+                    <pic:cNvPr descr="../benchmark/results/figures/fig_weight_sensitivity.png" id="62" name="Picture"/>
                     <pic:cNvPicPr>
                       <a:picLocks noChangeArrowheads="1" noChangeAspect="1"/>
                     </pic:cNvPicPr>
                   </pic:nvPicPr>
                   <pic:blipFill>
-                    <a:blip r:embed="rId59"/>
+                    <a:blip r:embed="rId60"/>
                     <a:stretch>
                       <a:fillRect/>
                     </a:stretch>
@@ -6038,8 +6092,8 @@
         </w:pict>
       </w:r>
     </w:p>
-    <w:bookmarkEnd w:id="62"/>
-    <w:bookmarkStart w:id="63" w:name="references"/>
+    <w:bookmarkEnd w:id="63"/>
+    <w:bookmarkStart w:id="64" w:name="references"/>
     <w:p>
       <w:pPr>
         <w:pStyle w:val="Heading2"/>
@@ -6682,8 +6736,8 @@
         </w:pict>
       </w:r>
     </w:p>
-    <w:bookmarkEnd w:id="63"/>
-    <w:bookmarkStart w:id="64" w:name="appendix-a.-how-to-reproduce"/>
+    <w:bookmarkEnd w:id="64"/>
+    <w:bookmarkStart w:id="65" w:name="appendix-a.-how-to-reproduce"/>
     <w:p>
       <w:pPr>
         <w:pStyle w:val="Heading2"/>
@@ -7310,8 +7364,8 @@
         <w:t xml:space="preserve">), so runs are reproducible up to upstream AlphaFold DB / UniProt updates.</w:t>
       </w:r>
     </w:p>
-    <w:bookmarkEnd w:id="64"/>
     <w:bookmarkEnd w:id="65"/>
+    <w:bookmarkEnd w:id="66"/>
     <w:sectPr>
       <w:footnotePr>
         <w:numRestart w:val="eachSect"/>

</xml_diff>

<commit_message>
Verify and correct scientific claims
</commit_message>
<xml_diff>
--- a/paper/protein_function_rescue.docx
+++ b/paper/protein_function_rescue.docx
@@ -126,7 +126,7 @@
         <w:t xml:space="preserve"> </w:t>
       </w:r>
       <w:r>
-        <w:t xml:space="preserve">2026-07-09</w:t>
+        <w:t xml:space="preserve">2026-07-13</w:t>
       </w:r>
     </w:p>
     <w:p>
@@ -326,25 +326,31 @@
         <w:t xml:space="preserve"> </w:t>
       </w:r>
       <w:r>
-        <w:t xml:space="preserve">fold at TM-score ≥ 0.5. The strongest candidate, an</w:t>
-      </w:r>
-      <w:r>
-        <w:t xml:space="preserve"> </w:t>
-      </w:r>
-      <w:r>
-        <w:t xml:space="preserve">“uncharacterized FAD-linked oxidoreductase”</w:t>
-      </w:r>
-      <w:r>
-        <w:t xml:space="preserve"> </w:t>
-      </w:r>
-      <w:r>
-        <w:t xml:space="preserve">(UniProt P9WIT1), matched a D-2-hydroxyglutarate dehydrogenase at TM-score 0.90 — a match consistent</w:t>
-      </w:r>
-      <w:r>
-        <w:t xml:space="preserve"> </w:t>
-      </w:r>
-      <w:r>
-        <w:t xml:space="preserve">with, and refining, its previously inferred enzyme class. On an independent benchmark of 227 enzymes</w:t>
+        <w:t xml:space="preserve">fold or domain at a query-normalised TM-score ≥ 0.5. Three larger proteins yielded fold-level hypotheses;</w:t>
+      </w:r>
+      <w:r>
+        <w:t xml:space="preserve"> </w:t>
+      </w:r>
+      <w:r>
+        <w:t xml:space="preserve">the cleanest whole-chain match was the uncharacterized P9WQ67 against an aromatic amino-acid</w:t>
+      </w:r>
+      <w:r>
+        <w:t xml:space="preserve"> </w:t>
+      </w:r>
+      <w:r>
+        <w:t xml:space="preserve">aminotransferase (query/reference-normalised TM-scores 0.67/0.63), although catalytic-residue identity</w:t>
+      </w:r>
+      <w:r>
+        <w:t xml:space="preserve"> </w:t>
+      </w:r>
+      <w:r>
+        <w:t xml:space="preserve">was not conserved and reaction transfer remains unproven. A 50-residue fourth hit was identified as a</w:t>
+      </w:r>
+      <w:r>
+        <w:t xml:space="preserve"> </w:t>
+      </w:r>
+      <w:r>
+        <w:t xml:space="preserve">short-fragment false positive. On an independent benchmark of 227 enzymes</w:t>
       </w:r>
       <w:r>
         <w:t xml:space="preserve"> </w:t>
@@ -356,43 +362,31 @@
         <w:t xml:space="preserve"> </w:t>
       </w:r>
       <w:r>
-        <w:t xml:space="preserve">correctly in 96.5 % of cases; this matched a simple pairwise sequence-identity baseline overall (which</w:t>
-      </w:r>
-      <w:r>
-        <w:t xml:space="preserve"> </w:t>
-      </w:r>
-      <w:r>
-        <w:t xml:space="preserve">reached 93.8 % at the exact-reaction level) and demonstrated clear advantages for several remote-homology</w:t>
-      </w:r>
-      <w:r>
-        <w:t xml:space="preserve"> </w:t>
-      </w:r>
-      <w:r>
-        <w:t xml:space="preserve">cases, recovering correct functions in the sub-30 %-identity</w:t>
-      </w:r>
-      <w:r>
-        <w:t xml:space="preserve"> </w:t>
-      </w:r>
-      <w:r>
-        <w:t xml:space="preserve">“twilight zone”</w:t>
-      </w:r>
-      <w:r>
-        <w:t xml:space="preserve"> </w:t>
-      </w:r>
-      <w:r>
-        <w:t xml:space="preserve">(including metallo-</w:t>
-      </w:r>
-      <w:r>
-        <w:t xml:space="preserve"> </w:t>
-      </w:r>
-      <w:r>
-        <w:t xml:space="preserve">β-lactamases and a lipase and catalase at low identity) where pairwise sequence comparison is</w:t>
-      </w:r>
-      <w:r>
-        <w:t xml:space="preserve"> </w:t>
-      </w:r>
-      <w:r>
-        <w:t xml:space="preserve">unreliable; at the default TM-score threshold of 0.5 precision was 0.982.</w:t>
+        <w:t xml:space="preserve">correctly in 96.5 % of cases, versus 93.8 % for a deliberately simple symmetric pairwise-identity</w:t>
+      </w:r>
+      <w:r>
+        <w:t xml:space="preserve"> </w:t>
+      </w:r>
+      <w:r>
+        <w:t xml:space="preserve">baseline at the exact-reaction level. No paired significance analysis was performed. Twenty-four of</w:t>
+      </w:r>
+      <w:r>
+        <w:t xml:space="preserve"> </w:t>
+      </w:r>
+      <w:r>
+        <w:t xml:space="preserve">219 correct structural calls had &lt;30 % identity to their structural hit; these are low-identity</w:t>
+      </w:r>
+      <w:r>
+        <w:t xml:space="preserve"> </w:t>
+      </w:r>
+      <w:r>
+        <w:t xml:space="preserve">recoveries, not necessarily 24 cases where structure defeated the sequence baseline. At the default</w:t>
+      </w:r>
+      <w:r>
+        <w:t xml:space="preserve"> </w:t>
+      </w:r>
+      <w:r>
+        <w:t xml:space="preserve">TM-score threshold of 0.5, precision was 0.982.</w:t>
       </w:r>
     </w:p>
     <w:p>
@@ -694,19 +688,19 @@
         <w:t xml:space="preserve"> </w:t>
       </w:r>
       <w:r>
-        <w:t xml:space="preserve">encoding of the fold. Such learned predictors are powerful but opaque, and — like the fast search</w:t>
-      </w:r>
-      <w:r>
-        <w:t xml:space="preserve"> </w:t>
-      </w:r>
-      <w:r>
-        <w:t xml:space="preserve">tools — are typically deployed with GPUs, large pre-indexed structural databases, or complex software</w:t>
-      </w:r>
-      <w:r>
-        <w:t xml:space="preserve"> </w:t>
-      </w:r>
-      <w:r>
-        <w:t xml:space="preserve">environments. Recent reviews and community assessments of AlphaFold’s impact on function prediction</w:t>
+        <w:t xml:space="preserve">encoding of the fold. Such learned predictors and fast search tools provide complementary capabilities,</w:t>
+      </w:r>
+      <w:r>
+        <w:t xml:space="preserve"> </w:t>
+      </w:r>
+      <w:r>
+        <w:t xml:space="preserve">often through local installations, pre-indexed resources, or hosted web services. Recent reviews and</w:t>
+      </w:r>
+      <w:r>
+        <w:t xml:space="preserve"> </w:t>
+      </w:r>
+      <w:r>
+        <w:t xml:space="preserve">community assessments of AlphaFold’s impact on function prediction</w:t>
       </w:r>
       <w:r>
         <w:t xml:space="preserve"> </w:t>
@@ -748,19 +742,7 @@
         <w:t xml:space="preserve"> </w:t>
       </w:r>
       <w:r>
-        <w:t xml:space="preserve">structural search can improve annotation, but published workflows typically depend on</w:t>
-      </w:r>
-      <w:r>
-        <w:t xml:space="preserve"> </w:t>
-      </w:r>
-      <w:r>
-        <w:t xml:space="preserve">high-performance-computing infrastructure, large pre-indexed structural databases, or intricate software</w:t>
-      </w:r>
-      <w:r>
-        <w:t xml:space="preserve"> </w:t>
-      </w:r>
-      <w:r>
-        <w:t xml:space="preserve">environments. We instead ask a different question:</w:t>
+        <w:t xml:space="preserve">structural search can improve annotation. We ask a narrower implementation question:</w:t>
       </w:r>
       <w:r>
         <w:t xml:space="preserve"> </w:t>
@@ -770,7 +752,7 @@
           <w:i/>
           <w:iCs/>
         </w:rPr>
-        <w:t xml:space="preserve">can a transparent, dependency-light workflow achieve</w:t>
+        <w:t xml:space="preserve">can a transparent,</w:t>
       </w:r>
       <w:r>
         <w:rPr>
@@ -784,40 +766,54 @@
           <w:i/>
           <w:iCs/>
         </w:rPr>
-        <w:t xml:space="preserve">meaningful annotation performance on commodity hardware while remaining fully reproducible?</w:t>
-      </w:r>
-      <w:r>
-        <w:t xml:space="preserve"> </w:t>
-      </w:r>
-      <w:r>
-        <w:t xml:space="preserve">Concretely,</w:t>
-      </w:r>
-      <w:r>
-        <w:t xml:space="preserve"> </w:t>
-      </w:r>
-      <w:r>
-        <w:t xml:space="preserve">we target a single laptop with no GPU, no administrator privileges, and no compiled bioinformatics</w:t>
-      </w:r>
-      <w:r>
-        <w:t xml:space="preserve"> </w:t>
-      </w:r>
-      <w:r>
-        <w:t xml:space="preserve">binaries, assembling the entire workflow from the pre-computed AlphaFold DB plus pure-Python components,</w:t>
-      </w:r>
-      <w:r>
-        <w:t xml:space="preserve"> </w:t>
-      </w:r>
-      <w:r>
-        <w:t xml:space="preserve">and we apply it to unannotated proteins of</w:t>
-      </w:r>
-      <w:r>
-        <w:t xml:space="preserve"> </w:t>
+        <w:t xml:space="preserve">Windows-compatible teaching workflow achieve</w:t>
       </w:r>
       <w:r>
         <w:rPr>
           <w:i/>
           <w:iCs/>
         </w:rPr>
+        <w:t xml:space="preserve"> </w:t>
+      </w:r>
+      <w:r>
+        <w:rPr>
+          <w:i/>
+          <w:iCs/>
+        </w:rPr>
+        <w:t xml:space="preserve">meaningful annotation performance on commodity hardware while remaining fully reproducible?</w:t>
+      </w:r>
+      <w:r>
+        <w:t xml:space="preserve"> </w:t>
+      </w:r>
+      <w:r>
+        <w:t xml:space="preserve">Concretely,</w:t>
+      </w:r>
+      <w:r>
+        <w:t xml:space="preserve"> </w:t>
+      </w:r>
+      <w:r>
+        <w:t xml:space="preserve">we target a single laptop with no GPU, no administrator privileges, and no compiled bioinformatics</w:t>
+      </w:r>
+      <w:r>
+        <w:t xml:space="preserve"> </w:t>
+      </w:r>
+      <w:r>
+        <w:t xml:space="preserve">binaries, assembling the entire workflow from the pre-computed AlphaFold DB plus pure-Python components,</w:t>
+      </w:r>
+      <w:r>
+        <w:t xml:space="preserve"> </w:t>
+      </w:r>
+      <w:r>
+        <w:t xml:space="preserve">and we apply it to unannotated proteins of</w:t>
+      </w:r>
+      <w:r>
+        <w:t xml:space="preserve"> </w:t>
+      </w:r>
+      <w:r>
+        <w:rPr>
+          <w:i/>
+          <w:iCs/>
+        </w:rPr>
         <w:t xml:space="preserve">Mycobacterium tuberculosis</w:t>
       </w:r>
       <w:r>
@@ -838,13 +834,13 @@
         <w:pStyle w:val="BodyText"/>
       </w:pPr>
       <w:r>
-        <w:t xml:space="preserve">Our contribution is fourfold: (1) an explicit demonstration that meaningful structure-based function</w:t>
-      </w:r>
-      <w:r>
-        <w:t xml:space="preserve"> </w:t>
-      </w:r>
-      <w:r>
-        <w:t xml:space="preserve">annotation is achievable on commodity hardware, without HPC, GPUs, or large indexed databases; (2) a</w:t>
+        <w:t xml:space="preserve">Our contribution is fourfold: (1) an explicit demonstration of fold-level triage on commodity hardware,</w:t>
+      </w:r>
+      <w:r>
+        <w:t xml:space="preserve"> </w:t>
+      </w:r>
+      <w:r>
+        <w:t xml:space="preserve">without a local GPU or compiled command-line bioinformatics executable; (2) a</w:t>
       </w:r>
       <w:r>
         <w:t xml:space="preserve"> </w:t>
@@ -902,19 +898,13 @@
         <w:t xml:space="preserve"> </w:t>
       </w:r>
       <w:r>
-        <w:t xml:space="preserve">[12] it is fully interpretable — every assignment is traceable to a specific structural match and to</w:t>
-      </w:r>
-      <w:r>
-        <w:t xml:space="preserve"> </w:t>
-      </w:r>
-      <w:r>
-        <w:t xml:space="preserve">conserved catalytic residues rather than a black-box inference — and unlike Foldseek [5] it trades raw</w:t>
-      </w:r>
-      <w:r>
-        <w:t xml:space="preserve"> </w:t>
-      </w:r>
-      <w:r>
-        <w:t xml:space="preserve">search speed for transparency and accessibility on everyday hardware.</w:t>
+        <w:t xml:space="preserve">[12], each assignment is traceable to a specific structural match and a coarse residue-site check; and</w:t>
+      </w:r>
+      <w:r>
+        <w:t xml:space="preserve"> </w:t>
+      </w:r>
+      <w:r>
+        <w:t xml:space="preserve">compared with Foldseek [5] it trades database scale and speed for a small, inspectable reference set.</w:t>
       </w:r>
     </w:p>
     <w:p>
@@ -1363,19 +1353,31 @@
         <w:t xml:space="preserve"> </w:t>
       </w:r>
       <w:r>
-        <w:t xml:space="preserve">normalised by the length of either chain, we recorded the larger of the two normalisations as the</w:t>
-      </w:r>
-      <w:r>
-        <w:t xml:space="preserve"> </w:t>
-      </w:r>
-      <w:r>
-        <w:t xml:space="preserve">match score, so that a strong match to a smaller known domain is not penalised. For each query, the</w:t>
-      </w:r>
-      <w:r>
-        <w:t xml:space="preserve"> </w:t>
-      </w:r>
-      <w:r>
-        <w:t xml:space="preserve">reference with the highest TM-score was retained if it met a configurable threshold (default 0.5).</w:t>
+        <w:t xml:space="preserve">normalised by the length of either chain, we retained the larger value as a domain-sensitive screening</w:t>
+      </w:r>
+      <w:r>
+        <w:t xml:space="preserve"> </w:t>
+      </w:r>
+      <w:r>
+        <w:t xml:space="preserve">score but recorded both normalisations, both lengths, and RMSD. A high query-normalised but low</w:t>
+      </w:r>
+      <w:r>
+        <w:t xml:space="preserve"> </w:t>
+      </w:r>
+      <w:r>
+        <w:t xml:space="preserve">reference-normalised score indicates a partial/domain match and is not evidence that the complete</w:t>
+      </w:r>
+      <w:r>
+        <w:t xml:space="preserve"> </w:t>
+      </w:r>
+      <w:r>
+        <w:t xml:space="preserve">proteins share a function. For each query, the reference with the highest screening score was retained</w:t>
+      </w:r>
+      <w:r>
+        <w:t xml:space="preserve"> </w:t>
+      </w:r>
+      <w:r>
+        <w:t xml:space="preserve">if it met a configurable threshold (default 0.5).</w:t>
       </w:r>
     </w:p>
     <w:p>
@@ -1898,13 +1900,13 @@
         <w:t xml:space="preserve"> </w:t>
       </w:r>
       <w:r>
-        <w:t xml:space="preserve">superposed the candidate onto the reference with the TM-align rotation/translation, and mapped each</w:t>
-      </w:r>
-      <w:r>
-        <w:t xml:space="preserve"> </w:t>
-      </w:r>
-      <w:r>
-        <w:t xml:space="preserve">annotated reference residue to its nearest candidate Cα. A reference functional residue was scored as</w:t>
+        <w:t xml:space="preserve">superposed the candidate onto the reference with the TM-align rotation/translation, and followed</w:t>
+      </w:r>
+      <w:r>
+        <w:t xml:space="preserve"> </w:t>
+      </w:r>
+      <w:r>
+        <w:t xml:space="preserve">TM-align’s explicit residue correspondence. A reference functional residue was scored as</w:t>
       </w:r>
       <w:r>
         <w:t xml:space="preserve"> </w:t>
@@ -1914,13 +1916,13 @@
           <w:i/>
           <w:iCs/>
         </w:rPr>
-        <w:t xml:space="preserve">position-conserved</w:t>
-      </w:r>
-      <w:r>
-        <w:t xml:space="preserve"> </w:t>
-      </w:r>
-      <w:r>
-        <w:t xml:space="preserve">if a candidate Cα lay within 4 Å of it after superposition, and additionally</w:t>
+        <w:t xml:space="preserve">position-compatible</w:t>
+      </w:r>
+      <w:r>
+        <w:t xml:space="preserve"> </w:t>
+      </w:r>
+      <w:r>
+        <w:t xml:space="preserve">if its aligned candidate Cα lay within 4 Å after superposition, and additionally</w:t>
       </w:r>
       <w:r>
         <w:t xml:space="preserve"> </w:t>
@@ -1936,19 +1938,25 @@
         <w:t xml:space="preserve"> </w:t>
       </w:r>
       <w:r>
-        <w:t xml:space="preserve">if that candidate residue was the same amino acid. The fraction of catalytic and</w:t>
-      </w:r>
-      <w:r>
-        <w:t xml:space="preserve"> </w:t>
-      </w:r>
-      <w:r>
-        <w:t xml:space="preserve">metal/ligand-binding residues that are position- and identity-conserved gives residue-level evidence</w:t>
-      </w:r>
-      <w:r>
-        <w:t xml:space="preserve"> </w:t>
-      </w:r>
-      <w:r>
-        <w:t xml:space="preserve">that complements the global score (implemented in</w:t>
+        <w:t xml:space="preserve">if that candidate residue was the same amino acid. The fractions of</w:t>
+      </w:r>
+      <w:r>
+        <w:t xml:space="preserve"> </w:t>
+      </w:r>
+      <w:r>
+        <w:t xml:space="preserve">position-compatible, identical, and chemically conservative aligned sites provide a coarse check that</w:t>
+      </w:r>
+      <w:r>
+        <w:t xml:space="preserve"> </w:t>
+      </w:r>
+      <w:r>
+        <w:t xml:space="preserve">complements the global score; they do not establish side-chain geometry or catalytic equivalence</w:t>
+      </w:r>
+      <w:r>
+        <w:t xml:space="preserve"> </w:t>
+      </w:r>
+      <w:r>
+        <w:t xml:space="preserve">(implemented in</w:t>
       </w:r>
       <w:r>
         <w:t xml:space="preserve"> </w:t>
@@ -2104,19 +2112,19 @@
         <w:pStyle w:val="FirstParagraph"/>
       </w:pPr>
       <w:r>
-        <w:t xml:space="preserve">Four of the nine queries (44 %) produced a structural match at TM-score ≥ 0.5 (Table 1). The remaining</w:t>
-      </w:r>
-      <w:r>
-        <w:t xml:space="preserve"> </w:t>
-      </w:r>
-      <w:r>
-        <w:t xml:space="preserve">five had no reference above threshold and were not assigned a candidate function, as expected for a</w:t>
-      </w:r>
-      <w:r>
-        <w:t xml:space="preserve"> </w:t>
-      </w:r>
-      <w:r>
-        <w:t xml:space="preserve">small, general-purpose reference library.</w:t>
+        <w:t xml:space="preserve">Four of the nine queries (44 %) produced a domain-sensitive screening hit at TM-score ≥ 0.5 (Table 1).</w:t>
+      </w:r>
+      <w:r>
+        <w:t xml:space="preserve"> </w:t>
+      </w:r>
+      <w:r>
+        <w:t xml:space="preserve">Because this threshold uses the larger length normalisation, these are fold/domain matches rather than</w:t>
+      </w:r>
+      <w:r>
+        <w:t xml:space="preserve"> </w:t>
+      </w:r>
+      <w:r>
+        <w:t xml:space="preserve">automatic function assignments. The remaining five had no reference above threshold.</w:t>
       </w:r>
     </w:p>
     <w:p>
@@ -2128,25 +2136,25 @@
           <w:b/>
           <w:bCs/>
         </w:rPr>
-        <w:t xml:space="preserve">Table 1. Ranked candidate function assignments for the pilot set.</w:t>
-      </w:r>
-      <w:r>
-        <w:t xml:space="preserve"> </w:t>
-      </w:r>
-      <w:r>
-        <w:t xml:space="preserve">TM-score from TM-align; pLDDT is</w:t>
-      </w:r>
-      <w:r>
-        <w:t xml:space="preserve"> </w:t>
-      </w:r>
-      <w:r>
-        <w:t xml:space="preserve">the mean AlphaFold confidence; cavity score is the geometric pocket estimate (Section 2.6); composite as</w:t>
-      </w:r>
-      <w:r>
-        <w:t xml:space="preserve"> </w:t>
-      </w:r>
-      <w:r>
-        <w:t xml:space="preserve">in Section 2.7. Matches are hypotheses, not experimental assignments.</w:t>
+        <w:t xml:space="preserve">Table 1. Ranked structural-screening hits for the pilot set.</w:t>
+      </w:r>
+      <w:r>
+        <w:t xml:space="preserve"> </w:t>
+      </w:r>
+      <w:r>
+        <w:t xml:space="preserve">TM-score Q/R gives query- and</w:t>
+      </w:r>
+      <w:r>
+        <w:t xml:space="preserve"> </w:t>
+      </w:r>
+      <w:r>
+        <w:t xml:space="preserve">reference-length normalisations; pLDDT is mean AlphaFold confidence; the cavity score is the native</w:t>
+      </w:r>
+      <w:r>
+        <w:t xml:space="preserve"> </w:t>
+      </w:r>
+      <w:r>
+        <w:t xml:space="preserve">geometric estimate. Matches are hypotheses, not experimental assignments.</w:t>
       </w:r>
     </w:p>
     <w:tbl>
@@ -2157,16 +2165,15 @@
         <w:tblLook w:firstRow="1" w:lastRow="0" w:firstColumn="0" w:lastColumn="0" w:noHBand="0" w:noVBand="0" w:val="0020"/>
       </w:tblPr>
       <w:tblGrid>
-        <w:gridCol w:w="323"/>
-        <w:gridCol w:w="915"/>
-        <w:gridCol w:w="1077"/>
-        <w:gridCol w:w="700"/>
-        <w:gridCol w:w="646"/>
-        <w:gridCol w:w="1885"/>
-        <w:gridCol w:w="538"/>
-        <w:gridCol w:w="484"/>
-        <w:gridCol w:w="754"/>
-        <w:gridCol w:w="592"/>
+        <w:gridCol w:w="416"/>
+        <w:gridCol w:w="486"/>
+        <w:gridCol w:w="833"/>
+        <w:gridCol w:w="833"/>
+        <w:gridCol w:w="1597"/>
+        <w:gridCol w:w="972"/>
+        <w:gridCol w:w="694"/>
+        <w:gridCol w:w="972"/>
+        <w:gridCol w:w="1111"/>
       </w:tblGrid>
       <w:tr>
         <w:trPr>
@@ -2191,7 +2198,7 @@
               <w:pStyle w:val="Compact"/>
             </w:pPr>
             <w:r>
-              <w:t xml:space="preserve">Query (UniProt)</w:t>
+              <w:t xml:space="preserve">Query</w:t>
             </w:r>
           </w:p>
         </w:tc>
@@ -2202,19 +2209,7 @@
               <w:pStyle w:val="Compact"/>
             </w:pPr>
             <w:r>
-              <w:t xml:space="preserve">Current annotation</w:t>
-            </w:r>
-          </w:p>
-        </w:tc>
-        <w:tc>
-          <w:tcPr/>
-          <w:p>
-            <w:pPr>
-              <w:pStyle w:val="Compact"/>
-              <w:jc w:val="right"/>
-            </w:pPr>
-            <w:r>
-              <w:t xml:space="preserve">Length (aa)</w:t>
+              <w:t xml:space="preserve">Length Q/R</w:t>
             </w:r>
           </w:p>
         </w:tc>
@@ -2237,7 +2232,18 @@
               <w:pStyle w:val="Compact"/>
             </w:pPr>
             <w:r>
-              <w:t xml:space="preserve">Best structural match (reference)</w:t>
+              <w:t xml:space="preserve">Best structural match</w:t>
+            </w:r>
+          </w:p>
+        </w:tc>
+        <w:tc>
+          <w:tcPr/>
+          <w:p>
+            <w:pPr>
+              <w:pStyle w:val="Compact"/>
+            </w:pPr>
+            <w:r>
+              <w:t xml:space="preserve">TM-score Q/R</w:t>
             </w:r>
           </w:p>
         </w:tc>
@@ -2249,19 +2255,7 @@
               <w:jc w:val="right"/>
             </w:pPr>
             <w:r>
-              <w:t xml:space="preserve">TM-score</w:t>
-            </w:r>
-          </w:p>
-        </w:tc>
-        <w:tc>
-          <w:tcPr/>
-          <w:p>
-            <w:pPr>
-              <w:pStyle w:val="Compact"/>
-              <w:jc w:val="right"/>
-            </w:pPr>
-            <w:r>
-              <w:t xml:space="preserve">Pockets</w:t>
+              <w:t xml:space="preserve">RMSD (Å)</w:t>
             </w:r>
           </w:p>
         </w:tc>
@@ -2282,10 +2276,9 @@
           <w:p>
             <w:pPr>
               <w:pStyle w:val="Compact"/>
-              <w:jc w:val="right"/>
             </w:pPr>
             <w:r>
-              <w:t xml:space="preserve">Composite</w:t>
+              <w:t xml:space="preserve">Interpretation</w:t>
             </w:r>
           </w:p>
         </w:tc>
@@ -2321,19 +2314,7 @@
               <w:pStyle w:val="Compact"/>
             </w:pPr>
             <w:r>
-              <w:t xml:space="preserve">Uncharacterized FAD-linked oxidoreductase Rv2280 (EC 1.-.-.-)</w:t>
-            </w:r>
-          </w:p>
-        </w:tc>
-        <w:tc>
-          <w:tcPr/>
-          <w:p>
-            <w:pPr>
-              <w:pStyle w:val="Compact"/>
-              <w:jc w:val="right"/>
-            </w:pPr>
-            <w:r>
-              <w:t xml:space="preserve">459</w:t>
+              <w:t xml:space="preserve">459/1022</w:t>
             </w:r>
           </w:p>
         </w:tc>
@@ -2356,7 +2337,18 @@
               <w:pStyle w:val="Compact"/>
             </w:pPr>
             <w:r>
-              <w:t xml:space="preserve">D-2-hydroxyglutarate dehydrogenase (EC 1.1.99.39)</w:t>
+              <w:t xml:space="preserve">D-2-hydroxyglutarate dehydrogenase</w:t>
+            </w:r>
+          </w:p>
+        </w:tc>
+        <w:tc>
+          <w:tcPr/>
+          <w:p>
+            <w:pPr>
+              <w:pStyle w:val="Compact"/>
+            </w:pPr>
+            <w:r>
+              <w:t xml:space="preserve">0.904/0.421</w:t>
             </w:r>
           </w:p>
         </w:tc>
@@ -2368,19 +2360,7 @@
               <w:jc w:val="right"/>
             </w:pPr>
             <w:r>
-              <w:t xml:space="preserve">0.904</w:t>
-            </w:r>
-          </w:p>
-        </w:tc>
-        <w:tc>
-          <w:tcPr/>
-          <w:p>
-            <w:pPr>
-              <w:pStyle w:val="Compact"/>
-              <w:jc w:val="right"/>
-            </w:pPr>
-            <w:r>
-              <w:t xml:space="preserve">6</w:t>
+              <w:t xml:space="preserve">2.647</w:t>
             </w:r>
           </w:p>
         </w:tc>
@@ -2401,10 +2381,9 @@
           <w:p>
             <w:pPr>
               <w:pStyle w:val="Compact"/>
-              <w:jc w:val="right"/>
             </w:pPr>
             <w:r>
-              <w:t xml:space="preserve">0.933</w:t>
+              <w:t xml:space="preserve">Oxidoreductase-related domain; specific reaction unsupported</w:t>
             </w:r>
           </w:p>
         </w:tc>
@@ -2440,19 +2419,7 @@
               <w:pStyle w:val="Compact"/>
             </w:pPr>
             <w:r>
-              <w:t xml:space="preserve">Uncharacterized membrane protein ArfB</w:t>
-            </w:r>
-          </w:p>
-        </w:tc>
-        <w:tc>
-          <w:tcPr/>
-          <w:p>
-            <w:pPr>
-              <w:pStyle w:val="Compact"/>
-              <w:jc w:val="right"/>
-            </w:pPr>
-            <w:r>
-              <w:t xml:space="preserve">50</w:t>
+              <w:t xml:space="preserve">50/269</w:t>
             </w:r>
           </w:p>
         </w:tc>
@@ -2475,7 +2442,18 @@
               <w:pStyle w:val="Compact"/>
             </w:pPr>
             <w:r>
-              <w:t xml:space="preserve">2′-cyclic-ADP-D-ribose synthase / TIR-domain NAD⁺ hydrolase (EC 3.2.2.-)</w:t>
+              <w:t xml:space="preserve">TIR-domain NAD⁺ hydrolase</w:t>
+            </w:r>
+          </w:p>
+        </w:tc>
+        <w:tc>
+          <w:tcPr/>
+          <w:p>
+            <w:pPr>
+              <w:pStyle w:val="Compact"/>
+            </w:pPr>
+            <w:r>
+              <w:t xml:space="preserve">0.862/0.180</w:t>
             </w:r>
           </w:p>
         </w:tc>
@@ -2487,19 +2465,7 @@
               <w:jc w:val="right"/>
             </w:pPr>
             <w:r>
-              <w:t xml:space="preserve">0.862</w:t>
-            </w:r>
-          </w:p>
-        </w:tc>
-        <w:tc>
-          <w:tcPr/>
-          <w:p>
-            <w:pPr>
-              <w:pStyle w:val="Compact"/>
-              <w:jc w:val="right"/>
-            </w:pPr>
-            <w:r>
-              <w:t xml:space="preserve">0</w:t>
+              <w:t xml:space="preserve">1.138</w:t>
             </w:r>
           </w:p>
         </w:tc>
@@ -2520,10 +2486,9 @@
           <w:p>
             <w:pPr>
               <w:pStyle w:val="Compact"/>
-              <w:jc w:val="right"/>
             </w:pPr>
             <w:r>
-              <w:t xml:space="preserve">0.844</w:t>
+              <w:t xml:space="preserve">Short-fragment false positive</w:t>
             </w:r>
           </w:p>
         </w:tc>
@@ -2559,19 +2524,7 @@
               <w:pStyle w:val="Compact"/>
             </w:pPr>
             <w:r>
-              <w:t xml:space="preserve">Uncharacterized metal-dependent hydrolase TatD (EC 3.1.-.-)</w:t>
-            </w:r>
-          </w:p>
-        </w:tc>
-        <w:tc>
-          <w:tcPr/>
-          <w:p>
-            <w:pPr>
-              <w:pStyle w:val="Compact"/>
-              <w:jc w:val="right"/>
-            </w:pPr>
-            <w:r>
-              <w:t xml:space="preserve">264</w:t>
+              <w:t xml:space="preserve">264/480</w:t>
             </w:r>
           </w:p>
         </w:tc>
@@ -2594,7 +2547,18 @@
               <w:pStyle w:val="Compact"/>
             </w:pPr>
             <w:r>
-              <w:t xml:space="preserve">Ochratoxinase / amidohydrolase 2 (EC 3.4.17.-)</w:t>
+              <w:t xml:space="preserve">Ochratoxinase / amidohydrolase 2</w:t>
+            </w:r>
+          </w:p>
+        </w:tc>
+        <w:tc>
+          <w:tcPr/>
+          <w:p>
+            <w:pPr>
+              <w:pStyle w:val="Compact"/>
+            </w:pPr>
+            <w:r>
+              <w:t xml:space="preserve">0.715/0.423</w:t>
             </w:r>
           </w:p>
         </w:tc>
@@ -2606,19 +2570,7 @@
               <w:jc w:val="right"/>
             </w:pPr>
             <w:r>
-              <w:t xml:space="preserve">0.715</w:t>
-            </w:r>
-          </w:p>
-        </w:tc>
-        <w:tc>
-          <w:tcPr/>
-          <w:p>
-            <w:pPr>
-              <w:pStyle w:val="Compact"/>
-              <w:jc w:val="right"/>
-            </w:pPr>
-            <w:r>
-              <w:t xml:space="preserve">4</w:t>
+              <w:t xml:space="preserve">3.461</w:t>
             </w:r>
           </w:p>
         </w:tc>
@@ -2639,10 +2591,9 @@
           <w:p>
             <w:pPr>
               <w:pStyle w:val="Compact"/>
-              <w:jc w:val="right"/>
             </w:pPr>
             <w:r>
-              <w:t xml:space="preserve">0.842</w:t>
+              <w:t xml:space="preserve">Metallo-hydrolase architecture; substrate specificity unsupported</w:t>
             </w:r>
           </w:p>
         </w:tc>
@@ -2678,19 +2629,7 @@
               <w:pStyle w:val="Compact"/>
             </w:pPr>
             <w:r>
-              <w:t xml:space="preserve">Uncharacterized protein Rv3778c</w:t>
-            </w:r>
-          </w:p>
-        </w:tc>
-        <w:tc>
-          <w:tcPr/>
-          <w:p>
-            <w:pPr>
-              <w:pStyle w:val="Compact"/>
-              <w:jc w:val="right"/>
-            </w:pPr>
-            <w:r>
-              <w:t xml:space="preserve">398</w:t>
+              <w:t xml:space="preserve">398/423</w:t>
             </w:r>
           </w:p>
         </w:tc>
@@ -2713,7 +2652,18 @@
               <w:pStyle w:val="Compact"/>
             </w:pPr>
             <w:r>
-              <w:t xml:space="preserve">Aromatic amino-acid aminotransferase (EC 2.6.1.57/58/70)</w:t>
+              <w:t xml:space="preserve">Aromatic amino-acid aminotransferase</w:t>
+            </w:r>
+          </w:p>
+        </w:tc>
+        <w:tc>
+          <w:tcPr/>
+          <w:p>
+            <w:pPr>
+              <w:pStyle w:val="Compact"/>
+            </w:pPr>
+            <w:r>
+              <w:t xml:space="preserve">0.666/0.633</w:t>
             </w:r>
           </w:p>
         </w:tc>
@@ -2725,19 +2675,7 @@
               <w:jc w:val="right"/>
             </w:pPr>
             <w:r>
-              <w:t xml:space="preserve">0.666</w:t>
-            </w:r>
-          </w:p>
-        </w:tc>
-        <w:tc>
-          <w:tcPr/>
-          <w:p>
-            <w:pPr>
-              <w:pStyle w:val="Compact"/>
-              <w:jc w:val="right"/>
-            </w:pPr>
-            <w:r>
-              <w:t xml:space="preserve">5</w:t>
+              <w:t xml:space="preserve">4.014</w:t>
             </w:r>
           </w:p>
         </w:tc>
@@ -2758,37 +2696,22 @@
           <w:p>
             <w:pPr>
               <w:pStyle w:val="Compact"/>
-              <w:jc w:val="right"/>
             </w:pPr>
             <w:r>
-              <w:t xml:space="preserve">0.816</w:t>
+              <w:t xml:space="preserve">Aminotransferase-fold hypothesis; catalytic identity unsupported</w:t>
             </w:r>
           </w:p>
         </w:tc>
       </w:tr>
     </w:tbl>
     <w:bookmarkEnd w:id="23"/>
-    <w:bookmarkStart w:id="24" w:name="consistency-of-the-top-assignments"/>
+    <w:bookmarkStart w:id="24" w:name="interpretation-of-the-structural-hits"/>
     <w:p>
       <w:pPr>
         <w:pStyle w:val="Heading3"/>
       </w:pPr>
       <w:r>
-        <w:t xml:space="preserve">3.3 Consistency of the top assignments</w:t>
-      </w:r>
-    </w:p>
-    <w:p>
-      <w:pPr>
-        <w:pStyle w:val="FirstParagraph"/>
-      </w:pPr>
-      <w:r>
-        <w:t xml:space="preserve">Three of the four assignments are internally consistent with, and refine, prior sequence-based</w:t>
-      </w:r>
-      <w:r>
-        <w:t xml:space="preserve"> </w:t>
-      </w:r>
-      <w:r>
-        <w:t xml:space="preserve">inference:</w:t>
+        <w:t xml:space="preserve">3.3 Interpretation of the structural hits</w:t>
       </w:r>
     </w:p>
     <w:p>
@@ -2810,31 +2733,25 @@
         <w:t xml:space="preserve"> </w:t>
       </w:r>
       <w:r>
-        <w:t xml:space="preserve">was already inferred by UniProt to be an oxidoreductase (EC class 1) but with no defined</w:t>
-      </w:r>
-      <w:r>
-        <w:t xml:space="preserve"> </w:t>
-      </w:r>
-      <w:r>
-        <w:t xml:space="preserve">sub-subclass (EC 1.-.-.-). Its top structural match, a D-2-hydroxyglutarate dehydrogenase</w:t>
-      </w:r>
-      <w:r>
-        <w:t xml:space="preserve"> </w:t>
-      </w:r>
-      <w:r>
-        <w:t xml:space="preserve">(EC 1.1.99.39), lies within the same top-level enzyme class and proposes a specific reaction — a</w:t>
-      </w:r>
-      <w:r>
-        <w:t xml:space="preserve"> </w:t>
-      </w:r>
-      <w:r>
-        <w:t xml:space="preserve">concrete, testable refinement supported by a high TM-score (0.90) and a high-confidence model</w:t>
-      </w:r>
-      <w:r>
-        <w:t xml:space="preserve"> </w:t>
-      </w:r>
-      <w:r>
-        <w:t xml:space="preserve">(pLDDT 95.5).</w:t>
+        <w:t xml:space="preserve">is already annotated broadly as an FAD-linked oxidoreductase (EC 1.-.-.-). Its match is</w:t>
+      </w:r>
+      <w:r>
+        <w:t xml:space="preserve"> </w:t>
+      </w:r>
+      <w:r>
+        <w:t xml:space="preserve">compatible with an oxidoreductase-related domain, but the reference is more than twice as long and</w:t>
+      </w:r>
+      <w:r>
+        <w:t xml:space="preserve"> </w:t>
+      </w:r>
+      <w:r>
+        <w:t xml:space="preserve">the reference-normalised score is 0.421. The evidence does not refine P9WIT1 to</w:t>
+      </w:r>
+      <w:r>
+        <w:t xml:space="preserve"> </w:t>
+      </w:r>
+      <w:r>
+        <w:t xml:space="preserve">D-2-hydroxyglutarate dehydrogenase.</w:t>
       </w:r>
     </w:p>
     <w:p>
@@ -2856,25 +2773,19 @@
         <w:t xml:space="preserve"> </w:t>
       </w:r>
       <w:r>
-        <w:t xml:space="preserve">is annotated as a metal-dependent hydrolase of the TatD family (EC 3.1.-.-); its match to</w:t>
-      </w:r>
-      <w:r>
-        <w:t xml:space="preserve"> </w:t>
-      </w:r>
-      <w:r>
-        <w:t xml:space="preserve">an amidohydrolase-superfamily enzyme (EC 3.4.17.-) is structurally coherent (both are metal-dependent</w:t>
-      </w:r>
-      <w:r>
-        <w:t xml:space="preserve"> </w:t>
-      </w:r>
-      <w:r>
-        <w:t xml:space="preserve">hydrolases built on the TIM-barrel amidohydrolase fold), reinforcing the hydrolase assignment while</w:t>
-      </w:r>
-      <w:r>
-        <w:t xml:space="preserve"> </w:t>
-      </w:r>
-      <w:r>
-        <w:t xml:space="preserve">suggesting a possible peptidase/amidase activity worth testing.</w:t>
+        <w:t xml:space="preserve">is already a TatD-family metal-dependent hydrolase. The match and metal-site-compatible</w:t>
+      </w:r>
+      <w:r>
+        <w:t xml:space="preserve"> </w:t>
+      </w:r>
+      <w:r>
+        <w:t xml:space="preserve">residues support that broad architecture, but do not establish ochratoxinase, peptidase, or amidase</w:t>
+      </w:r>
+      <w:r>
+        <w:t xml:space="preserve"> </w:t>
+      </w:r>
+      <w:r>
+        <w:t xml:space="preserve">substrate specificity.</w:t>
       </w:r>
     </w:p>
     <w:p>
@@ -2896,19 +2807,161 @@
         <w:t xml:space="preserve"> </w:t>
       </w:r>
       <w:r>
-        <w:t xml:space="preserve">carried no enzyme-class inference at all (</w:t>
-      </w:r>
-      <w:r>
-        <w:t xml:space="preserve">“Uncharacterized protein”</w:t>
-      </w:r>
-      <w:r>
-        <w:t xml:space="preserve">). Its match</w:t>
-      </w:r>
-      <w:r>
-        <w:t xml:space="preserve"> </w:t>
-      </w:r>
-      <w:r>
-        <w:t xml:space="preserve">to a PLP-dependent aromatic amino-acid aminotransferase (EC 2.6.1) is therefore a genuinely</w:t>
+        <w:t xml:space="preserve">provides the cleanest whole-chain fold match because both TM-score</w:t>
+      </w:r>
+      <w:r>
+        <w:t xml:space="preserve"> </w:t>
+      </w:r>
+      <w:r>
+        <w:t xml:space="preserve">normalisations exceed 0.5. It is therefore an aminotransferase-fold hypothesis, pending direct</w:t>
+      </w:r>
+      <w:r>
+        <w:t xml:space="preserve"> </w:t>
+      </w:r>
+      <w:r>
+        <w:t xml:space="preserve">verification of PLP-binding and catalytic residues.</w:t>
+      </w:r>
+    </w:p>
+    <w:p>
+      <w:pPr>
+        <w:pStyle w:val="Compact"/>
+        <w:numPr>
+          <w:ilvl w:val="0"/>
+          <w:numId w:val="1002"/>
+        </w:numPr>
+      </w:pPr>
+      <w:r>
+        <w:rPr>
+          <w:b/>
+          <w:bCs/>
+        </w:rPr>
+        <w:t xml:space="preserve">P9WJG7</w:t>
+      </w:r>
+      <w:r>
+        <w:t xml:space="preserve"> </w:t>
+      </w:r>
+      <w:r>
+        <w:t xml:space="preserve">is only 50 residues. Its query-normalised score is 0.862 but its reference-normalised score</w:t>
+      </w:r>
+      <w:r>
+        <w:t xml:space="preserve"> </w:t>
+      </w:r>
+      <w:r>
+        <w:t xml:space="preserve">is 0.180, and no functional sites align. It is a false positive caused by permissive short-fragment</w:t>
+      </w:r>
+      <w:r>
+        <w:t xml:space="preserve"> </w:t>
+      </w:r>
+      <w:r>
+        <w:t xml:space="preserve">normalisation and is retained only as a documented failure mode.</w:t>
+      </w:r>
+    </w:p>
+    <w:bookmarkEnd w:id="24"/>
+    <w:bookmarkStart w:id="25" w:name="pocket-analysis"/>
+    <w:p>
+      <w:pPr>
+        <w:pStyle w:val="Heading3"/>
+      </w:pPr>
+      <w:r>
+        <w:t xml:space="preserve">3.4 Pocket analysis</w:t>
+      </w:r>
+    </w:p>
+    <w:p>
+      <w:pPr>
+        <w:pStyle w:val="FirstParagraph"/>
+      </w:pPr>
+      <w:r>
+        <w:t xml:space="preserve">The geometric detector identified enclosed cavities in the three larger high-scoring proteins</w:t>
+      </w:r>
+      <w:r>
+        <w:t xml:space="preserve"> </w:t>
+      </w:r>
+      <w:r>
+        <w:t xml:space="preserve">(4–6 pockets; cavity scores 0.966–0.968), consistent with globular enzymes possessing defined active</w:t>
+      </w:r>
+      <w:r>
+        <w:t xml:space="preserve"> </w:t>
+      </w:r>
+      <w:r>
+        <w:t xml:space="preserve">sites, and reported no enclosed pocket for the 50-residue membrane peptide P9WJG7. Because the</w:t>
+      </w:r>
+      <w:r>
+        <w:t xml:space="preserve"> </w:t>
+      </w:r>
+      <w:r>
+        <w:t xml:space="preserve">cavity score is an unsupervised geometric measure, we use it only as a supporting signal in the</w:t>
+      </w:r>
+      <w:r>
+        <w:t xml:space="preserve"> </w:t>
+      </w:r>
+      <w:r>
+        <w:t xml:space="preserve">composite ranking and for visual inspection, not as a standalone druggability claim.</w:t>
+      </w:r>
+    </w:p>
+    <w:bookmarkEnd w:id="25"/>
+    <w:bookmarkStart w:id="26" w:name="software-and-interface"/>
+    <w:p>
+      <w:pPr>
+        <w:pStyle w:val="Heading3"/>
+      </w:pPr>
+      <w:r>
+        <w:t xml:space="preserve">3.5 Software and interface</w:t>
+      </w:r>
+    </w:p>
+    <w:p>
+      <w:pPr>
+        <w:pStyle w:val="FirstParagraph"/>
+      </w:pPr>
+      <w:r>
+        <w:t xml:space="preserve">The pipeline produced machine-readable outputs (JSON, CSV) and a static web interface that lists the</w:t>
+      </w:r>
+      <w:r>
+        <w:t xml:space="preserve"> </w:t>
+      </w:r>
+      <w:r>
+        <w:t xml:space="preserve">ranked candidates and renders each AlphaFold model in 3D, coloured by pLDDT, with its structural match,</w:t>
+      </w:r>
+      <w:r>
+        <w:t xml:space="preserve"> </w:t>
+      </w:r>
+      <w:r>
+        <w:t xml:space="preserve">match confidence, pocket statistics, and per-component scores (Figure 2). The complete pilot — download,</w:t>
+      </w:r>
+      <w:r>
+        <w:t xml:space="preserve"> </w:t>
+      </w:r>
+      <w:r>
+        <w:t xml:space="preserve">parsing, annotation, 9 × 119 TM-align comparisons, pocket detection, and ranking — ran on a consumer</w:t>
+      </w:r>
+      <w:r>
+        <w:t xml:space="preserve"> </w:t>
+      </w:r>
+      <w:r>
+        <w:t xml:space="preserve">laptop without a GPU; the structural-search stage took 18 min 37 s in the verification run. Runtime</w:t>
+      </w:r>
+      <w:r>
+        <w:t xml:space="preserve"> </w:t>
+      </w:r>
+      <w:r>
+        <w:t xml:space="preserve">was strongly length-dependent, with the 1,327-residue P9WN15 query dominating the run.</w:t>
+      </w:r>
+    </w:p>
+    <w:bookmarkEnd w:id="26"/>
+    <w:bookmarkStart w:id="27" w:name="X337fcafd85cc1d614e2686deb6afcf3a148f903"/>
+    <w:p>
+      <w:pPr>
+        <w:pStyle w:val="Heading3"/>
+      </w:pPr>
+      <w:r>
+        <w:t xml:space="preserve">3.6 Functional-residue verification of the candidates</w:t>
+      </w:r>
+    </w:p>
+    <w:p>
+      <w:pPr>
+        <w:pStyle w:val="FirstParagraph"/>
+      </w:pPr>
+      <w:r>
+        <w:t xml:space="preserve">Global fold similarity alone leaves open whether the</w:t>
       </w:r>
       <w:r>
         <w:t xml:space="preserve"> </w:t>
@@ -2918,196 +2971,61 @@
           <w:i/>
           <w:iCs/>
         </w:rPr>
-        <w:t xml:space="preserve">de novo</w:t>
-      </w:r>
-      <w:r>
-        <w:t xml:space="preserve"> </w:t>
-      </w:r>
-      <w:r>
-        <w:t xml:space="preserve">functional hypothesis — the case in which structure-based rescue adds the most information.</w:t>
-      </w:r>
-    </w:p>
-    <w:p>
-      <w:pPr>
-        <w:pStyle w:val="FirstParagraph"/>
-      </w:pPr>
-      <w:r>
-        <w:t xml:space="preserve">The second-ranked hit,</w:t>
-      </w:r>
-      <w:r>
-        <w:t xml:space="preserve"> </w:t>
-      </w:r>
+        <w:t xml:space="preserve">active site</w:t>
+      </w:r>
+      <w:r>
+        <w:t xml:space="preserve"> </w:t>
+      </w:r>
+      <w:r>
+        <w:t xml:space="preserve">is shared. We therefore tested, for</w:t>
+      </w:r>
+      <w:r>
+        <w:t xml:space="preserve"> </w:t>
+      </w:r>
+      <w:r>
+        <w:t xml:space="preserve">each pilot candidate, whether the matched reference’s annotated catalytic and binding residues are</w:t>
+      </w:r>
+      <w:r>
+        <w:t xml:space="preserve"> </w:t>
+      </w:r>
+      <w:r>
+        <w:t xml:space="preserve">compatible under the explicit TM-align correspondence (Section 2.9; Table 2).</w:t>
+      </w:r>
+    </w:p>
+    <w:p>
+      <w:pPr>
+        <w:pStyle w:val="BodyText"/>
+      </w:pPr>
       <w:r>
         <w:rPr>
           <w:b/>
           <w:bCs/>
         </w:rPr>
-        <w:t xml:space="preserve">P9WJG7</w:t>
-      </w:r>
-      <w:r>
-        <w:t xml:space="preserve">, illustrates an important caveat rather than a confident result: at</w:t>
-      </w:r>
-      <w:r>
-        <w:t xml:space="preserve"> </w:t>
-      </w:r>
-      <w:r>
-        <w:t xml:space="preserve">only 50 residues its TM-score (0.86) is computed over few aligned positions and is intrinsically less</w:t>
-      </w:r>
-      <w:r>
-        <w:t xml:space="preserve"> </w:t>
-      </w:r>
-      <w:r>
-        <w:t xml:space="preserve">reliable, and no enclosed pocket was detected. It is retained here as a transparent example of a</w:t>
-      </w:r>
-      <w:r>
-        <w:t xml:space="preserve"> </w:t>
-      </w:r>
-      <w:r>
-        <w:t xml:space="preserve">low-confidence match that a user should discount.</w:t>
-      </w:r>
-    </w:p>
-    <w:bookmarkEnd w:id="24"/>
-    <w:bookmarkStart w:id="25" w:name="pocket-analysis"/>
-    <w:p>
-      <w:pPr>
-        <w:pStyle w:val="Heading3"/>
-      </w:pPr>
-      <w:r>
-        <w:t xml:space="preserve">3.4 Pocket analysis</w:t>
-      </w:r>
-    </w:p>
-    <w:p>
-      <w:pPr>
-        <w:pStyle w:val="FirstParagraph"/>
-      </w:pPr>
-      <w:r>
-        <w:t xml:space="preserve">The geometric detector identified enclosed cavities in the three larger high-scoring proteins</w:t>
-      </w:r>
-      <w:r>
-        <w:t xml:space="preserve"> </w:t>
-      </w:r>
-      <w:r>
-        <w:t xml:space="preserve">(4–6 pockets; cavity scores 0.966–0.968), consistent with globular enzymes possessing defined active</w:t>
-      </w:r>
-      <w:r>
-        <w:t xml:space="preserve"> </w:t>
-      </w:r>
-      <w:r>
-        <w:t xml:space="preserve">sites, and correctly reported no enclosed pocket for the 50-residue membrane peptide P9WJG7. Because the</w:t>
-      </w:r>
-      <w:r>
-        <w:t xml:space="preserve"> </w:t>
-      </w:r>
-      <w:r>
-        <w:t xml:space="preserve">cavity score is an unsupervised geometric measure, we use it only as a supporting signal in the</w:t>
-      </w:r>
-      <w:r>
-        <w:t xml:space="preserve"> </w:t>
-      </w:r>
-      <w:r>
-        <w:t xml:space="preserve">composite ranking and for visual inspection, not as a standalone druggability claim.</w:t>
-      </w:r>
-    </w:p>
-    <w:bookmarkEnd w:id="25"/>
-    <w:bookmarkStart w:id="26" w:name="software-and-interface"/>
-    <w:p>
-      <w:pPr>
-        <w:pStyle w:val="Heading3"/>
-      </w:pPr>
-      <w:r>
-        <w:t xml:space="preserve">3.5 Software and interface</w:t>
-      </w:r>
-    </w:p>
-    <w:p>
-      <w:pPr>
-        <w:pStyle w:val="FirstParagraph"/>
-      </w:pPr>
-      <w:r>
-        <w:t xml:space="preserve">The pipeline produced machine-readable outputs (JSON, CSV) and a static web interface that lists the</w:t>
-      </w:r>
-      <w:r>
-        <w:t xml:space="preserve"> </w:t>
-      </w:r>
-      <w:r>
-        <w:t xml:space="preserve">ranked candidates and renders each AlphaFold model in 3D, coloured by pLDDT, with its structural match,</w:t>
-      </w:r>
-      <w:r>
-        <w:t xml:space="preserve"> </w:t>
-      </w:r>
-      <w:r>
-        <w:t xml:space="preserve">match confidence, pocket statistics, and per-component scores (Figure 2). The complete pilot — download,</w:t>
-      </w:r>
-      <w:r>
-        <w:t xml:space="preserve"> </w:t>
-      </w:r>
-      <w:r>
-        <w:t xml:space="preserve">parsing, annotation, 9 × 119 TM-align comparisons, pocket detection, and ranking — ran on a consumer</w:t>
-      </w:r>
-      <w:r>
-        <w:t xml:space="preserve"> </w:t>
-      </w:r>
-      <w:r>
-        <w:t xml:space="preserve">laptop without a GPU; the structural-search stage dominated runtime at roughly one minute per query</w:t>
-      </w:r>
-      <w:r>
-        <w:t xml:space="preserve"> </w:t>
-      </w:r>
-      <w:r>
-        <w:t xml:space="preserve">against the 119-protein library.</w:t>
-      </w:r>
-    </w:p>
-    <w:bookmarkEnd w:id="26"/>
-    <w:bookmarkStart w:id="27" w:name="X337fcafd85cc1d614e2686deb6afcf3a148f903"/>
-    <w:p>
-      <w:pPr>
-        <w:pStyle w:val="Heading3"/>
-      </w:pPr>
-      <w:r>
-        <w:t xml:space="preserve">3.6 Functional-residue verification of the candidates</w:t>
-      </w:r>
-    </w:p>
-    <w:p>
-      <w:pPr>
-        <w:pStyle w:val="FirstParagraph"/>
-      </w:pPr>
-      <w:r>
-        <w:t xml:space="preserve">Global fold similarity alone leaves open whether the</w:t>
-      </w:r>
-      <w:r>
-        <w:t xml:space="preserve"> </w:t>
-      </w:r>
-      <w:r>
-        <w:rPr>
-          <w:i/>
-          <w:iCs/>
-        </w:rPr>
-        <w:t xml:space="preserve">active site</w:t>
-      </w:r>
-      <w:r>
-        <w:t xml:space="preserve"> </w:t>
-      </w:r>
-      <w:r>
-        <w:t xml:space="preserve">is shared. We therefore tested, for</w:t>
-      </w:r>
-      <w:r>
-        <w:t xml:space="preserve"> </w:t>
-      </w:r>
-      <w:r>
-        <w:t xml:space="preserve">each pilot candidate, whether the matched reference’s annotated catalytic and binding residues are</w:t>
-      </w:r>
-      <w:r>
-        <w:t xml:space="preserve"> </w:t>
-      </w:r>
-      <w:r>
-        <w:t xml:space="preserve">structurally conserved (Section 2.9; Table 2). This sharpens the picture from the global scores.</w:t>
-      </w:r>
-    </w:p>
-    <w:p>
-      <w:pPr>
-        <w:pStyle w:val="BodyText"/>
-      </w:pPr>
-      <w:r>
-        <w:t xml:space="preserve">The metal-dependent hydrolase candidate</w:t>
+        <w:t xml:space="preserve">O08343</w:t>
+      </w:r>
+      <w:r>
+        <w:t xml:space="preserve"> </w:t>
+      </w:r>
+      <w:r>
+        <w:t xml:space="preserve">is the only strong residue-level case: all eight annotated reference sites have aligned Cα</w:t>
+      </w:r>
+      <w:r>
+        <w:t xml:space="preserve"> </w:t>
+      </w:r>
+      <w:r>
+        <w:t xml:space="preserve">pairs within 4 Å, and four identities are retained. Reference H111/H113/D378 correspond to candidate</w:t>
+      </w:r>
+      <w:r>
+        <w:t xml:space="preserve"> </w:t>
+      </w:r>
+      <w:r>
+        <w:t xml:space="preserve">H5/H7/D208; those candidate sites are already annotated by UniProt by similarity, so this supports</w:t>
+      </w:r>
+      <w:r>
+        <w:t xml:space="preserve"> </w:t>
+      </w:r>
+      <w:r>
+        <w:t xml:space="preserve">metal-site compatibility rather than discovering a new reaction.</w:t>
       </w:r>
       <w:r>
         <w:t xml:space="preserve"> </w:t>
@@ -3117,202 +3035,99 @@
           <w:b/>
           <w:bCs/>
         </w:rPr>
-        <w:t xml:space="preserve">O08343</w:t>
-      </w:r>
-      <w:r>
-        <w:t xml:space="preserve"> </w:t>
-      </w:r>
-      <w:r>
-        <w:t xml:space="preserve">is the strongest case: all eight annotated functional</w:t>
-      </w:r>
-      <w:r>
-        <w:t xml:space="preserve"> </w:t>
-      </w:r>
-      <w:r>
-        <w:t xml:space="preserve">residues of the matched amidohydrolase are position-conserved, and the two zinc-coordinating histidines</w:t>
-      </w:r>
-      <w:r>
-        <w:t xml:space="preserve"> </w:t>
-      </w:r>
-      <w:r>
-        <w:t xml:space="preserve">(His111→His5, His113→His7) together with a catalytic aspartate (Asp378→Asp208) are conserved in identity</w:t>
-      </w:r>
-      <w:r>
-        <w:t xml:space="preserve"> </w:t>
-      </w:r>
-      <w:r>
-        <w:t xml:space="preserve">as well as position — a direct structural signature of a metal-dependent hydrolase active site. The</w:t>
-      </w:r>
-      <w:r>
-        <w:t xml:space="preserve"> </w:t>
-      </w:r>
-      <w:r>
-        <w:t xml:space="preserve">oxidoreductase (</w:t>
+        <w:t xml:space="preserve">P9WIT1</w:t>
+      </w:r>
+      <w:r>
+        <w:t xml:space="preserve"> </w:t>
+      </w:r>
+      <w:r>
+        <w:t xml:space="preserve">has no aligned functional</w:t>
+      </w:r>
+      <w:r>
+        <w:t xml:space="preserve"> </w:t>
+      </w:r>
+      <w:r>
+        <w:t xml:space="preserve">site within 4 Å; two aligned identities lie outside the distance cutoff and the reference Fe-S cysteines</w:t>
+      </w:r>
+      <w:r>
+        <w:t xml:space="preserve"> </w:t>
+      </w:r>
+      <w:r>
+        <w:t xml:space="preserve">fall outside the matched region.</w:t>
+      </w:r>
+      <w:r>
+        <w:t xml:space="preserve"> </w:t>
       </w:r>
       <w:r>
         <w:rPr>
           <w:b/>
           <w:bCs/>
         </w:rPr>
-        <w:t xml:space="preserve">P9WIT1</w:t>
-      </w:r>
-      <w:r>
-        <w:t xml:space="preserve">) and aminotransferase (</w:t>
+        <w:t xml:space="preserve">P9WQ67</w:t>
+      </w:r>
+      <w:r>
+        <w:t xml:space="preserve"> </w:t>
+      </w:r>
+      <w:r>
+        <w:t xml:space="preserve">has 9/11 position-compatible sites but no identities or</w:t>
+      </w:r>
+      <w:r>
+        <w:t xml:space="preserve"> </w:t>
+      </w:r>
+      <w:r>
+        <w:t xml:space="preserve">conservative substitutions, so its catalytic machinery is unverified.</w:t>
+      </w:r>
+      <w:r>
+        <w:t xml:space="preserve"> </w:t>
       </w:r>
       <w:r>
         <w:rPr>
           <w:b/>
           <w:bCs/>
         </w:rPr>
-        <w:t xml:space="preserve">P9WQ67</w:t>
-      </w:r>
-      <w:r>
-        <w:t xml:space="preserve">) candidates retain the active-site</w:t>
-      </w:r>
-      <w:r>
-        <w:t xml:space="preserve"> </w:t>
-      </w:r>
-      <w:r>
-        <w:rPr>
-          <w:i/>
-          <w:iCs/>
-        </w:rPr>
-        <w:t xml:space="preserve">geometry</w:t>
-      </w:r>
-      <w:r>
-        <w:t xml:space="preserve"> </w:t>
-      </w:r>
-      <w:r>
-        <w:t xml:space="preserve">(83 % and 100 % of functional residues position-conserved) but with diverged residue</w:t>
-      </w:r>
-      <w:r>
-        <w:t xml:space="preserve"> </w:t>
-      </w:r>
-      <w:r>
-        <w:t xml:space="preserve">identities, indicating a shared fold and binding-pocket architecture rather than an identical catalytic</w:t>
-      </w:r>
-      <w:r>
-        <w:t xml:space="preserve"> </w:t>
-      </w:r>
-      <w:r>
-        <w:t xml:space="preserve">complement — a deliberately more cautious level of support (for P9WIT1 the reference’s [4Fe-4S]-cluster</w:t>
-      </w:r>
-      <w:r>
-        <w:t xml:space="preserve"> </w:t>
-      </w:r>
-      <w:r>
-        <w:t xml:space="preserve">cysteines are notably</w:t>
-      </w:r>
-      <w:r>
-        <w:t xml:space="preserve"> </w:t>
-      </w:r>
-      <w:r>
-        <w:rPr>
-          <w:i/>
-          <w:iCs/>
-        </w:rPr>
-        <w:t xml:space="preserve">not</w:t>
-      </w:r>
-      <w:r>
-        <w:t xml:space="preserve"> </w:t>
-      </w:r>
-      <w:r>
-        <w:t xml:space="preserve">conserved, suggesting a related oxidoreductase lacking that exact cofactor).</w:t>
-      </w:r>
-      <w:r>
-        <w:t xml:space="preserve"> </w:t>
-      </w:r>
-      <w:r>
-        <w:t xml:space="preserve">Critically, the short 50-residue candidate</w:t>
-      </w:r>
-      <w:r>
-        <w:t xml:space="preserve"> </w:t>
-      </w:r>
+        <w:t xml:space="preserve">P9WJG7</w:t>
+      </w:r>
+      <w:r>
+        <w:t xml:space="preserve"> </w:t>
+      </w:r>
+      <w:r>
+        <w:t xml:space="preserve">has no aligned</w:t>
+      </w:r>
+      <w:r>
+        <w:t xml:space="preserve"> </w:t>
+      </w:r>
+      <w:r>
+        <w:t xml:space="preserve">functional sites. The check is a coarse Cα proxy and does not test side-chain coordination geometry.</w:t>
+      </w:r>
+    </w:p>
+    <w:p>
+      <w:pPr>
+        <w:pStyle w:val="BodyText"/>
+      </w:pPr>
       <w:r>
         <w:rPr>
           <w:b/>
           <w:bCs/>
         </w:rPr>
-        <w:t xml:space="preserve">P9WJG7</w:t>
-      </w:r>
-      <w:r>
-        <w:t xml:space="preserve">, whose global match we had already flagged as</w:t>
-      </w:r>
-      <w:r>
-        <w:t xml:space="preserve"> </w:t>
-      </w:r>
-      <w:r>
-        <w:t xml:space="preserve">unreliable, shows</w:t>
-      </w:r>
-      <w:r>
-        <w:t xml:space="preserve"> </w:t>
-      </w:r>
-      <w:r>
-        <w:rPr>
-          <w:i/>
-          <w:iCs/>
-        </w:rPr>
-        <w:t xml:space="preserve">no</w:t>
-      </w:r>
-      <w:r>
-        <w:t xml:space="preserve"> </w:t>
-      </w:r>
-      <w:r>
-        <w:t xml:space="preserve">functional-residue conservation (0/6; all reference active-site residues 36–55 Å</w:t>
-      </w:r>
-      <w:r>
-        <w:t xml:space="preserve"> </w:t>
-      </w:r>
-      <w:r>
-        <w:t xml:space="preserve">away after superposition), independently confirming that its high TM-score is spurious. Residue-level</w:t>
-      </w:r>
-      <w:r>
-        <w:t xml:space="preserve"> </w:t>
-      </w:r>
-      <w:r>
-        <w:t xml:space="preserve">verification thus both strengthens the confident assignments and automatically down-weights the</w:t>
-      </w:r>
-      <w:r>
-        <w:t xml:space="preserve"> </w:t>
-      </w:r>
-      <w:r>
-        <w:t xml:space="preserve">questionable one.</w:t>
-      </w:r>
-    </w:p>
-    <w:p>
-      <w:pPr>
-        <w:pStyle w:val="BodyText"/>
-      </w:pPr>
-      <w:r>
-        <w:rPr>
-          <w:b/>
-          <w:bCs/>
-        </w:rPr>
-        <w:t xml:space="preserve">Table 2. Functional-residue conservation for the pilot candidates.</w:t>
-      </w:r>
-      <w:r>
-        <w:t xml:space="preserve"> </w:t>
-      </w:r>
-      <w:r>
-        <w:t xml:space="preserve">Annotated active-site,</w:t>
-      </w:r>
-      <w:r>
-        <w:t xml:space="preserve"> </w:t>
-      </w:r>
-      <w:r>
-        <w:t xml:space="preserve">binding-site and metal-binding residues of the matched reference, checked for structural conservation in</w:t>
-      </w:r>
-      <w:r>
-        <w:t xml:space="preserve"> </w:t>
-      </w:r>
-      <w:r>
-        <w:t xml:space="preserve">the candidate after TM-align superposition (position-conserved: candidate Cα within 4 Å; identity: same</w:t>
-      </w:r>
-      <w:r>
-        <w:t xml:space="preserve"> </w:t>
-      </w:r>
-      <w:r>
-        <w:t xml:space="preserve">amino acid).</w:t>
+        <w:t xml:space="preserve">Table 2. Functional-site compatibility for the pilot hits.</w:t>
+      </w:r>
+      <w:r>
+        <w:t xml:space="preserve"> </w:t>
+      </w:r>
+      <w:r>
+        <w:t xml:space="preserve">Sites use TM-align’s residue</w:t>
+      </w:r>
+      <w:r>
+        <w:t xml:space="preserve"> </w:t>
+      </w:r>
+      <w:r>
+        <w:t xml:space="preserve">correspondence; position-compatible means the aligned Cα pair is within 4 Å. Identity is counted only</w:t>
+      </w:r>
+      <w:r>
+        <w:t xml:space="preserve"> </w:t>
+      </w:r>
+      <w:r>
+        <w:t xml:space="preserve">for position-compatible pairs.</w:t>
       </w:r>
     </w:p>
     <w:tbl>
@@ -3323,12 +3138,12 @@
         <w:tblLook w:firstRow="1" w:lastRow="0" w:firstColumn="0" w:lastColumn="0" w:noHBand="0" w:noVBand="0" w:val="0020"/>
       </w:tblPr>
       <w:tblGrid>
-        <w:gridCol w:w="744"/>
-        <w:gridCol w:w="1083"/>
-        <w:gridCol w:w="1421"/>
-        <w:gridCol w:w="1353"/>
-        <w:gridCol w:w="1353"/>
-        <w:gridCol w:w="1963"/>
+        <w:gridCol w:w="957"/>
+        <w:gridCol w:w="1392"/>
+        <w:gridCol w:w="609"/>
+        <w:gridCol w:w="1827"/>
+        <w:gridCol w:w="1740"/>
+        <w:gridCol w:w="1392"/>
       </w:tblGrid>
       <w:tr>
         <w:trPr>
@@ -3364,7 +3179,7 @@
               <w:jc w:val="right"/>
             </w:pPr>
             <w:r>
-              <w:t xml:space="preserve">Functional residues</w:t>
+              <w:t xml:space="preserve">Sites</w:t>
             </w:r>
           </w:p>
         </w:tc>
@@ -3376,7 +3191,7 @@
               <w:jc w:val="right"/>
             </w:pPr>
             <w:r>
-              <w:t xml:space="preserve">Position-conserved</w:t>
+              <w:t xml:space="preserve">Position-compatible</w:t>
             </w:r>
           </w:p>
         </w:tc>
@@ -3399,7 +3214,7 @@
               <w:pStyle w:val="Compact"/>
             </w:pPr>
             <w:r>
-              <w:t xml:space="preserve">Notable conserved residues</w:t>
+              <w:t xml:space="preserve">Interpretation</w:t>
             </w:r>
           </w:p>
         </w:tc>
@@ -3470,7 +3285,7 @@
               <w:pStyle w:val="Compact"/>
             </w:pPr>
             <w:r>
-              <w:t xml:space="preserve">Zn-His111, Zn-His113, catalytic Asp378</w:t>
+              <w:t xml:space="preserve">Candidate H5/H7/D208 support metal-site compatibility</w:t>
             </w:r>
           </w:p>
         </w:tc>
@@ -3518,7 +3333,7 @@
               <w:jc w:val="right"/>
             </w:pPr>
             <w:r>
-              <w:t xml:space="preserve">11 (100 %)</w:t>
+              <w:t xml:space="preserve">9 (82 %)</w:t>
             </w:r>
           </w:p>
         </w:tc>
@@ -3541,7 +3356,7 @@
               <w:pStyle w:val="Compact"/>
             </w:pPr>
             <w:r>
-              <w:t xml:space="preserve">PLP / 2-oxoglutarate site geometry</w:t>
+              <w:t xml:space="preserve">Fold hypothesis; catalytic identity unsupported</w:t>
             </w:r>
           </w:p>
         </w:tc>
@@ -3589,7 +3404,7 @@
               <w:jc w:val="right"/>
             </w:pPr>
             <w:r>
-              <w:t xml:space="preserve">5 (83 %)</w:t>
+              <w:t xml:space="preserve">0</w:t>
             </w:r>
           </w:p>
         </w:tc>
@@ -3612,7 +3427,7 @@
               <w:pStyle w:val="Compact"/>
             </w:pPr>
             <w:r>
-              <w:t xml:space="preserve">substrate-site geometry (4Fe-4S Cys not conserved)</w:t>
+              <w:t xml:space="preserve">Reference functional sites not supported by aligned geometry</w:t>
             </w:r>
           </w:p>
         </w:tc>
@@ -3683,7 +3498,7 @@
               <w:pStyle w:val="Compact"/>
             </w:pPr>
             <w:r>
-              <w:t xml:space="preserve">none (spurious 50-residue match)</w:t>
+              <w:t xml:space="preserve">Short-fragment false positive</w:t>
             </w:r>
           </w:p>
         </w:tc>
@@ -3812,7 +3627,13 @@
         <w:t xml:space="preserve"> </w:t>
       </w:r>
       <w:r>
-        <w:t xml:space="preserve">a sequence baseline (local pairwise identity, BLOSUM62). Predictions were scored by EC agreement at each</w:t>
+        <w:t xml:space="preserve">a sequence baseline (the mean identity from local BLOSUM62 alignments in both sequence orders, making</w:t>
+      </w:r>
+      <w:r>
+        <w:t xml:space="preserve"> </w:t>
+      </w:r>
+      <w:r>
+        <w:t xml:space="preserve">the pairwise score symmetric). Predictions were scored by EC agreement at each</w:t>
       </w:r>
       <w:r>
         <w:t xml:space="preserve"> </w:t>
@@ -3925,35 +3746,35 @@
         <w:t xml:space="preserve"> </w:t>
       </w:r>
       <w:r>
-        <w:t xml:space="preserve">(level 4) — so structure was slightly better at pinpointing the</w:t>
-      </w:r>
-      <w:r>
-        <w:t xml:space="preserve"> </w:t>
-      </w:r>
-      <w:r>
-        <w:t xml:space="preserve">specific reaction, while the two methods were comparable overall. We make no claim of a large overall</w:t>
-      </w:r>
-      <w:r>
-        <w:t xml:space="preserve"> </w:t>
-      </w:r>
-      <w:r>
-        <w:t xml:space="preserve">improvement on easy cases, and note that a stronger sequence method (profile/HMM search; Section 6)</w:t>
-      </w:r>
-      <w:r>
-        <w:t xml:space="preserve"> </w:t>
-      </w:r>
-      <w:r>
-        <w:t xml:space="preserve">would likely close even this small gap. The meaningful difference appears elsewhere (Section 4.3).</w:t>
+        <w:t xml:space="preserve">(level 4). This is a 2.7-percentage-point observed difference;</w:t>
+      </w:r>
+      <w:r>
+        <w:t xml:space="preserve"> </w:t>
+      </w:r>
+      <w:r>
+        <w:t xml:space="preserve">no paired confidence interval or significance test was performed, so we do not claim statistical</w:t>
+      </w:r>
+      <w:r>
+        <w:t xml:space="preserve"> </w:t>
+      </w:r>
+      <w:r>
+        <w:t xml:space="preserve">superiority or equivalence. A stronger sequence method (profile/HMM search; Section 6) could narrow or</w:t>
+      </w:r>
+      <w:r>
+        <w:t xml:space="preserve"> </w:t>
+      </w:r>
+      <w:r>
+        <w:t xml:space="preserve">reverse the difference.</w:t>
       </w:r>
     </w:p>
     <w:bookmarkEnd w:id="30"/>
-    <w:bookmarkStart w:id="31" w:name="X6237b8087aa5f73f462d51c86b4c32b2c42da81"/>
+    <w:bookmarkStart w:id="31" w:name="X812b4a4daf242f78c5560c6c6555ac1a5686c64"/>
     <w:p>
       <w:pPr>
         <w:pStyle w:val="Heading3"/>
       </w:pPr>
       <w:r>
-        <w:t xml:space="preserve">4.3 The value of structure: recovery in the twilight zone</w:t>
+        <w:t xml:space="preserve">4.3 Correct structural calls at low pairwise identity</w:t>
       </w:r>
     </w:p>
     <w:p>
@@ -3961,7 +3782,7 @@
         <w:pStyle w:val="FirstParagraph"/>
       </w:pPr>
       <w:r>
-        <w:t xml:space="preserve">The methods diverge precisely where they should. Among the 219 correct structural recoveries,</w:t>
+        <w:t xml:space="preserve">Among the 219 correct structural recoveries,</w:t>
       </w:r>
       <w:r>
         <w:t xml:space="preserve"> </w:t>
@@ -3971,7 +3792,7 @@
           <w:b/>
           <w:bCs/>
         </w:rPr>
-        <w:t xml:space="preserve">24</w:t>
+        <w:t xml:space="preserve">24 (11 %) had below 30 % sequence identity to the</w:t>
       </w:r>
       <w:r>
         <w:rPr>
@@ -3985,37 +3806,61 @@
           <w:b/>
           <w:bCs/>
         </w:rPr>
-        <w:t xml:space="preserve">(11 %) occurred at below 30 % sequence identity to the matched protein</w:t>
-      </w:r>
-      <w:r>
-        <w:t xml:space="preserve"> </w:t>
-      </w:r>
-      <w:r>
-        <w:t xml:space="preserve">(Figure 4) — the regime in</w:t>
-      </w:r>
-      <w:r>
-        <w:t xml:space="preserve"> </w:t>
-      </w:r>
-      <w:r>
-        <w:t xml:space="preserve">which sequence homology becomes unreliable [2]. These include metallo-β-lactamases (VIM-1/NDM-1,</w:t>
-      </w:r>
-      <w:r>
-        <w:t xml:space="preserve"> </w:t>
-      </w:r>
-      <w:r>
-        <w:t xml:space="preserve">~24 % identity), a glutathione S-transferase (~12 %), an aspartate aminotransferase (~13 %), and — most</w:t>
-      </w:r>
-      <w:r>
-        <w:t xml:space="preserve"> </w:t>
-      </w:r>
-      <w:r>
-        <w:t xml:space="preserve">strikingly — a triacylglycerol lipase, an alanine racemase and a dye-decolorizing peroxidase recovered</w:t>
-      </w:r>
-      <w:r>
-        <w:t xml:space="preserve"> </w:t>
-      </w:r>
-      <w:r>
-        <w:t xml:space="preserve">correctly at</w:t>
+        <w:t xml:space="preserve">structural hit</w:t>
+      </w:r>
+      <w:r>
+        <w:t xml:space="preserve"> </w:t>
+      </w:r>
+      <w:r>
+        <w:t xml:space="preserve">(Figure 4), including several examples at very low identity. This establishes that the</w:t>
+      </w:r>
+      <w:r>
+        <w:t xml:space="preserve"> </w:t>
+      </w:r>
+      <w:r>
+        <w:t xml:space="preserve">structural nearest neighbour can recover the labelled EC family despite little pairwise identity to</w:t>
+      </w:r>
+      <w:r>
+        <w:t xml:space="preserve"> </w:t>
+      </w:r>
+      <w:r>
+        <w:t xml:space="preserve">that neighbour. It does not mean that all 24 are unique wins over the sequence baseline, whose nearest</w:t>
+      </w:r>
+      <w:r>
+        <w:t xml:space="preserve"> </w:t>
+      </w:r>
+      <w:r>
+        <w:t xml:space="preserve">hit may be a different protein. Accordingly, Figure 4 is interpreted as a low-identity structural-call</w:t>
+      </w:r>
+      <w:r>
+        <w:t xml:space="preserve"> </w:t>
+      </w:r>
+      <w:r>
+        <w:t xml:space="preserve">analysis rather than a general comparison with modern sequence methods.</w:t>
+      </w:r>
+    </w:p>
+    <w:bookmarkEnd w:id="31"/>
+    <w:bookmarkStart w:id="32" w:name="calibration-of-the-tm-score-threshold"/>
+    <w:p>
+      <w:pPr>
+        <w:pStyle w:val="Heading3"/>
+      </w:pPr>
+      <w:r>
+        <w:t xml:space="preserve">4.4 Calibration of the TM-score threshold</w:t>
+      </w:r>
+    </w:p>
+    <w:p>
+      <w:pPr>
+        <w:pStyle w:val="FirstParagraph"/>
+      </w:pPr>
+      <w:r>
+        <w:t xml:space="preserve">Precision as a function of the TM-score acceptance threshold (Figure 5) supports the default cutoff of</w:t>
+      </w:r>
+      <w:r>
+        <w:t xml:space="preserve"> </w:t>
+      </w:r>
+      <w:r>
+        <w:t xml:space="preserve">0.5: at TM ≥ 0.5, precision for ≥3-level EC agreement was</w:t>
       </w:r>
       <w:r>
         <w:t xml:space="preserve"> </w:t>
@@ -4025,10 +3870,13 @@
           <w:b/>
           <w:bCs/>
         </w:rPr>
-        <w:t xml:space="preserve">3–5 % identity</w:t>
-      </w:r>
-      <w:r>
-        <w:t xml:space="preserve">. In</w:t>
+        <w:t xml:space="preserve">0.982 (219 of 223 accepted hits correct)</w:t>
+      </w:r>
+      <w:r>
+        <w:t xml:space="preserve"> </w:t>
+      </w:r>
+      <w:r>
+        <w:t xml:space="preserve">at 98.2 % coverage; raising the threshold to 0.75 gave</w:t>
       </w:r>
       <w:r>
         <w:t xml:space="preserve"> </w:t>
@@ -4038,31 +3886,67 @@
           <w:b/>
           <w:bCs/>
         </w:rPr>
-        <w:t xml:space="preserve">five</w:t>
-      </w:r>
-      <w:r>
-        <w:t xml:space="preserve"> </w:t>
-      </w:r>
-      <w:r>
-        <w:t xml:space="preserve">of these low-identity cases the sequence baseline’s top hit</w:t>
-      </w:r>
-      <w:r>
-        <w:t xml:space="preserve"> </w:t>
-      </w:r>
-      <w:r>
-        <w:t xml:space="preserve">was incorrect while the structural top hit was correct (the lipase, the racemase, the peroxidase, the</w:t>
-      </w:r>
-      <w:r>
-        <w:t xml:space="preserve"> </w:t>
-      </w:r>
-      <w:r>
-        <w:t xml:space="preserve">glutathione S-transferase and the aminotransferase) — direct examples of structure succeeding where a</w:t>
-      </w:r>
-      <w:r>
-        <w:t xml:space="preserve"> </w:t>
-      </w:r>
-      <w:r>
-        <w:t xml:space="preserve">pairwise sequence comparison fails. Across the whole benchmark there was</w:t>
+        <w:t xml:space="preserve">100 % precision</w:t>
+      </w:r>
+      <w:r>
+        <w:t xml:space="preserve"> </w:t>
+      </w:r>
+      <w:r>
+        <w:t xml:space="preserve">at 95.2 % coverage. The four</w:t>
+      </w:r>
+      <w:r>
+        <w:t xml:space="preserve"> </w:t>
+      </w:r>
+      <w:r>
+        <w:t xml:space="preserve">false positives at the default threshold are instructive rather than random — each is a genuine case of</w:t>
+      </w:r>
+      <w:r>
+        <w:t xml:space="preserve"> </w:t>
+      </w:r>
+      <w:r>
+        <w:t xml:space="preserve">shared fold architecture without shared function: a mutual confusion between a 94-residue</w:t>
+      </w:r>
+      <w:r>
+        <w:t xml:space="preserve"> </w:t>
+      </w:r>
+      <w:r>
+        <w:t xml:space="preserve">pyrimidine/purine nucleoside phosphorylase and a glucose-6-phosphate isomerase (TM 0.74), a PLP-fold</w:t>
+      </w:r>
+      <w:r>
+        <w:t xml:space="preserve"> </w:t>
+      </w:r>
+      <w:r>
+        <w:t xml:space="preserve">alanine racemase matched to an aspartate aminotransferase, and a microsomal (MAPEG-fold) prostaglandin</w:t>
+      </w:r>
+      <w:r>
+        <w:t xml:space="preserve"> </w:t>
+      </w:r>
+      <w:r>
+        <w:t xml:space="preserve">E synthase. High structural scores reflect fold identity, which usually but not always implies</w:t>
+      </w:r>
+      <w:r>
+        <w:t xml:space="preserve"> </w:t>
+      </w:r>
+      <w:r>
+        <w:t xml:space="preserve">functional identity.</w:t>
+      </w:r>
+    </w:p>
+    <w:bookmarkEnd w:id="32"/>
+    <w:bookmarkStart w:id="33" w:name="instructive-failure-modes"/>
+    <w:p>
+      <w:pPr>
+        <w:pStyle w:val="Heading3"/>
+      </w:pPr>
+      <w:r>
+        <w:t xml:space="preserve">4.5 Instructive failure modes</w:t>
+      </w:r>
+    </w:p>
+    <w:p>
+      <w:pPr>
+        <w:pStyle w:val="FirstParagraph"/>
+      </w:pPr>
+      <w:r>
+        <w:t xml:space="preserve">Of the eight proteins not correctly recovered,</w:t>
       </w:r>
       <w:r>
         <w:t xml:space="preserve"> </w:t>
@@ -4072,61 +3956,13 @@
           <w:b/>
           <w:bCs/>
         </w:rPr>
-        <w:t xml:space="preserve">no case</w:t>
-      </w:r>
-      <w:r>
-        <w:t xml:space="preserve"> </w:t>
-      </w:r>
-      <w:r>
-        <w:t xml:space="preserve">in which the</w:t>
-      </w:r>
-      <w:r>
-        <w:t xml:space="preserve"> </w:t>
-      </w:r>
-      <w:r>
-        <w:t xml:space="preserve">sequence baseline recovered the correct function (to ≥ 3 EC levels) and structure did not.</w:t>
-      </w:r>
-    </w:p>
-    <w:bookmarkEnd w:id="31"/>
-    <w:bookmarkStart w:id="32" w:name="calibration-of-the-tm-score-threshold"/>
-    <w:p>
-      <w:pPr>
-        <w:pStyle w:val="Heading3"/>
-      </w:pPr>
-      <w:r>
-        <w:t xml:space="preserve">4.4 Calibration of the TM-score threshold</w:t>
-      </w:r>
-    </w:p>
-    <w:p>
-      <w:pPr>
-        <w:pStyle w:val="FirstParagraph"/>
-      </w:pPr>
-      <w:r>
-        <w:t xml:space="preserve">Precision as a function of the TM-score acceptance threshold (Figure 5) supports the default cutoff of</w:t>
-      </w:r>
-      <w:r>
-        <w:t xml:space="preserve"> </w:t>
-      </w:r>
-      <w:r>
-        <w:t xml:space="preserve">0.5: at TM ≥ 0.5, precision for ≥3-level EC agreement was</w:t>
-      </w:r>
-      <w:r>
-        <w:t xml:space="preserve"> </w:t>
+        <w:t xml:space="preserve">four had a best structural score below the 0.5</w:t>
       </w:r>
       <w:r>
         <w:rPr>
           <w:b/>
           <w:bCs/>
         </w:rPr>
-        <w:t xml:space="preserve">0.982 (219 of 223 accepted hits correct)</w:t>
-      </w:r>
-      <w:r>
-        <w:t xml:space="preserve"> </w:t>
-      </w:r>
-      <w:r>
-        <w:t xml:space="preserve">at 98.2 % coverage; raising the threshold to 0.75 gave</w:t>
-      </w:r>
-      <w:r>
         <w:t xml:space="preserve"> </w:t>
       </w:r>
       <w:r>
@@ -4134,59 +3970,62 @@
           <w:b/>
           <w:bCs/>
         </w:rPr>
-        <w:t xml:space="preserve">100 % precision</w:t>
-      </w:r>
-      <w:r>
-        <w:t xml:space="preserve"> </w:t>
-      </w:r>
-      <w:r>
-        <w:t xml:space="preserve">at 95.2 % coverage. The four</w:t>
-      </w:r>
-      <w:r>
-        <w:t xml:space="preserve"> </w:t>
-      </w:r>
-      <w:r>
-        <w:t xml:space="preserve">false positives at the default threshold are instructive rather than random — each is a genuine case of</w:t>
-      </w:r>
-      <w:r>
-        <w:t xml:space="preserve"> </w:t>
-      </w:r>
-      <w:r>
-        <w:t xml:space="preserve">shared fold architecture without shared function: a mutual confusion between a 94-residue</w:t>
-      </w:r>
-      <w:r>
-        <w:t xml:space="preserve"> </w:t>
-      </w:r>
-      <w:r>
-        <w:t xml:space="preserve">pyrimidine/purine nucleoside phosphorylase and a glucose-6-phosphate isomerase (TM 0.74), a PLP-fold</w:t>
-      </w:r>
-      <w:r>
-        <w:t xml:space="preserve"> </w:t>
-      </w:r>
-      <w:r>
-        <w:t xml:space="preserve">alanine racemase matched to an aspartate aminotransferase, and a microsomal (MAPEG-fold) prostaglandin</w:t>
-      </w:r>
-      <w:r>
-        <w:t xml:space="preserve"> </w:t>
-      </w:r>
-      <w:r>
-        <w:t xml:space="preserve">E synthase. High structural scores reflect fold identity, which usually but not always implies</w:t>
-      </w:r>
-      <w:r>
-        <w:t xml:space="preserve"> </w:t>
-      </w:r>
-      <w:r>
-        <w:t xml:space="preserve">functional identity.</w:t>
-      </w:r>
-    </w:p>
-    <w:bookmarkEnd w:id="32"/>
-    <w:bookmarkStart w:id="33" w:name="instructive-failure-modes"/>
+        <w:t xml:space="preserve">threshold and were therefore correctly rejected rather than misassigned</w:t>
+      </w:r>
+      <w:r>
+        <w:t xml:space="preserve">; the other four are the</w:t>
+      </w:r>
+      <w:r>
+        <w:t xml:space="preserve"> </w:t>
+      </w:r>
+      <w:r>
+        <w:t xml:space="preserve">false positives above. The rejected cases are all atypical members whose fold differs from the rest of</w:t>
+      </w:r>
+      <w:r>
+        <w:t xml:space="preserve"> </w:t>
+      </w:r>
+      <w:r>
+        <w:t xml:space="preserve">their EC family — a carboxysomal carbonic anhydrase (CsoSCA), which adopts a fold distinct from the</w:t>
+      </w:r>
+      <w:r>
+        <w:t xml:space="preserve"> </w:t>
+      </w:r>
+      <w:r>
+        <w:t xml:space="preserve">α-carbonic anhydrases; a lanthionine-synthetase-like protein (LANCL1) annotated as a glutathione</w:t>
+      </w:r>
+      <w:r>
+        <w:t xml:space="preserve"> </w:t>
+      </w:r>
+      <w:r>
+        <w:t xml:space="preserve">transferase but not sharing the GST fold; and proteins carrying secondary EC labels on a different</w:t>
+      </w:r>
+      <w:r>
+        <w:t xml:space="preserve"> </w:t>
+      </w:r>
+      <w:r>
+        <w:t xml:space="preserve">scaffold (e.g. a peptidoglycan-editing factor also annotated as a purine nucleoside phosphorylase). This</w:t>
+      </w:r>
+      <w:r>
+        <w:t xml:space="preserve"> </w:t>
+      </w:r>
+      <w:r>
+        <w:t xml:space="preserve">behaviour is desirable: the confidence threshold converts many fold-degeneracy cases into abstentions</w:t>
+      </w:r>
+      <w:r>
+        <w:t xml:space="preserve"> </w:t>
+      </w:r>
+      <w:r>
+        <w:t xml:space="preserve">rather than wrong high-confidence calls, exactly as the pipeline’s filtering and ranking intend.</w:t>
+      </w:r>
+    </w:p>
+    <w:bookmarkEnd w:id="33"/>
+    <w:bookmarkStart w:id="34" w:name="X77b3583a237dcdc2c17a8b2b6f7eeb52c431ada"/>
     <w:p>
       <w:pPr>
         <w:pStyle w:val="Heading3"/>
       </w:pPr>
       <w:r>
-        <w:t xml:space="preserve">4.5 Instructive failure modes</w:t>
+        <w:t xml:space="preserve">4.6 Robustness of the composite ranking to the weights</w:t>
       </w:r>
     </w:p>
     <w:p>
@@ -4194,7 +4033,59 @@
         <w:pStyle w:val="FirstParagraph"/>
       </w:pPr>
       <w:r>
-        <w:t xml:space="preserve">Of the eight proteins not correctly recovered,</w:t>
+        <w:t xml:space="preserve">The composite score combines structural similarity, model confidence and pocket quality with default</w:t>
+      </w:r>
+      <w:r>
+        <w:t xml:space="preserve"> </w:t>
+      </w:r>
+      <w:r>
+        <w:t xml:space="preserve">weights (0.5, 0.2, 0.3); a reviewer will reasonably ask whether the ranking depends on those particular</w:t>
+      </w:r>
+      <w:r>
+        <w:t xml:space="preserve"> </w:t>
+      </w:r>
+      <w:r>
+        <w:t xml:space="preserve">numbers. To test this we scored a realistic pool of 40</w:t>
+      </w:r>
+      <w:r>
+        <w:t xml:space="preserve"> </w:t>
+      </w:r>
+      <w:r>
+        <w:rPr>
+          <w:i/>
+          <w:iCs/>
+        </w:rPr>
+        <w:t xml:space="preserve">M. tuberculosis</w:t>
+      </w:r>
+      <w:r>
+        <w:t xml:space="preserve"> </w:t>
+      </w:r>
+      <w:r>
+        <w:t xml:space="preserve">rescue candidates (structural-</w:t>
+      </w:r>
+      <w:r>
+        <w:t xml:space="preserve"> </w:t>
+      </w:r>
+      <w:r>
+        <w:t xml:space="preserve">similarity scores spanning 0.45–0.84) and re-ranked them under many weight vectors (Section 2.10;</w:t>
+      </w:r>
+      <w:r>
+        <w:t xml:space="preserve"> </w:t>
+      </w:r>
+      <w:r>
+        <w:t xml:space="preserve">Figure 6). Within a reasonable neighbourhood of the default — structure kept dominant, each weight</w:t>
+      </w:r>
+      <w:r>
+        <w:t xml:space="preserve"> </w:t>
+      </w:r>
+      <w:r>
+        <w:t xml:space="preserve">varied by up to ±0.1 — the ranking was essentially unchanged: Kendall’s τ against the default ranking</w:t>
+      </w:r>
+      <w:r>
+        <w:t xml:space="preserve"> </w:t>
+      </w:r>
+      <w:r>
+        <w:t xml:space="preserve">had a</w:t>
       </w:r>
       <w:r>
         <w:t xml:space="preserve"> </w:t>
@@ -4204,96 +4095,22 @@
           <w:b/>
           <w:bCs/>
         </w:rPr>
-        <w:t xml:space="preserve">four had a best structural score below the 0.5</w:t>
-      </w:r>
-      <w:r>
-        <w:rPr>
-          <w:b/>
-          <w:bCs/>
-        </w:rPr>
-        <w:t xml:space="preserve"> </w:t>
-      </w:r>
-      <w:r>
-        <w:rPr>
-          <w:b/>
-          <w:bCs/>
-        </w:rPr>
-        <w:t xml:space="preserve">threshold and were therefore correctly rejected rather than misassigned</w:t>
-      </w:r>
-      <w:r>
-        <w:t xml:space="preserve">; the other four are the</w:t>
-      </w:r>
-      <w:r>
-        <w:t xml:space="preserve"> </w:t>
-      </w:r>
-      <w:r>
-        <w:t xml:space="preserve">false positives above. The rejected cases are all atypical members whose fold differs from the rest of</w:t>
-      </w:r>
-      <w:r>
-        <w:t xml:space="preserve"> </w:t>
-      </w:r>
-      <w:r>
-        <w:t xml:space="preserve">their EC family — a carboxysomal carbonic anhydrase (CsoSCA), which adopts a fold distinct from the</w:t>
-      </w:r>
-      <w:r>
-        <w:t xml:space="preserve"> </w:t>
-      </w:r>
-      <w:r>
-        <w:t xml:space="preserve">α-carbonic anhydrases; a lanthionine-synthetase-like protein (LANCL1) annotated as a glutathione</w:t>
-      </w:r>
-      <w:r>
-        <w:t xml:space="preserve"> </w:t>
-      </w:r>
-      <w:r>
-        <w:t xml:space="preserve">transferase but not sharing the GST fold; and proteins carrying secondary EC labels on a different</w:t>
-      </w:r>
-      <w:r>
-        <w:t xml:space="preserve"> </w:t>
-      </w:r>
-      <w:r>
-        <w:t xml:space="preserve">scaffold (e.g. a peptidoglycan-editing factor also annotated as a purine nucleoside phosphorylase). This</w:t>
-      </w:r>
-      <w:r>
-        <w:t xml:space="preserve"> </w:t>
-      </w:r>
-      <w:r>
-        <w:t xml:space="preserve">behaviour is desirable: the confidence threshold converts many fold-degeneracy cases into abstentions</w:t>
-      </w:r>
-      <w:r>
-        <w:t xml:space="preserve"> </w:t>
-      </w:r>
-      <w:r>
-        <w:t xml:space="preserve">rather than wrong high-confidence calls, exactly as the pipeline’s filtering and ranking intend.</w:t>
-      </w:r>
-    </w:p>
-    <w:bookmarkEnd w:id="33"/>
-    <w:bookmarkStart w:id="34" w:name="X77b3583a237dcdc2c17a8b2b6f7eeb52c431ada"/>
-    <w:p>
-      <w:pPr>
-        <w:pStyle w:val="Heading3"/>
-      </w:pPr>
-      <w:r>
-        <w:t xml:space="preserve">4.6 Robustness of the composite ranking to the weights</w:t>
-      </w:r>
-    </w:p>
-    <w:p>
-      <w:pPr>
-        <w:pStyle w:val="FirstParagraph"/>
-      </w:pPr>
-      <w:r>
-        <w:t xml:space="preserve">The composite score combines structural similarity, model confidence and pocket quality with default</w:t>
-      </w:r>
-      <w:r>
-        <w:t xml:space="preserve"> </w:t>
-      </w:r>
-      <w:r>
-        <w:t xml:space="preserve">weights (0.5, 0.2, 0.3); a reviewer will reasonably ask whether the ranking depends on those particular</w:t>
-      </w:r>
-      <w:r>
-        <w:t xml:space="preserve"> </w:t>
-      </w:r>
-      <w:r>
-        <w:t xml:space="preserve">numbers. To test this we scored a realistic pool of 40</w:t>
+        <w:t xml:space="preserve">median of 0.98 (minimum 0.95; all 61 weightings above 0.9)</w:t>
+      </w:r>
+      <w:r>
+        <w:t xml:space="preserve">, and the top-10 candidates were</w:t>
+      </w:r>
+      <w:r>
+        <w:t xml:space="preserve"> </w:t>
+      </w:r>
+      <w:r>
+        <w:t xml:space="preserve">identical for the majority of weightings (median top-10 Jaccard 1.0). Even under an adversarial stress</w:t>
+      </w:r>
+      <w:r>
+        <w:t xml:space="preserve"> </w:t>
+      </w:r>
+      <w:r>
+        <w:t xml:space="preserve">test over the</w:t>
       </w:r>
       <w:r>
         <w:t xml:space="preserve"> </w:t>
@@ -4303,71 +4120,6 @@
           <w:i/>
           <w:iCs/>
         </w:rPr>
-        <w:t xml:space="preserve">M. tuberculosis</w:t>
-      </w:r>
-      <w:r>
-        <w:t xml:space="preserve"> </w:t>
-      </w:r>
-      <w:r>
-        <w:t xml:space="preserve">rescue candidates (structural-</w:t>
-      </w:r>
-      <w:r>
-        <w:t xml:space="preserve"> </w:t>
-      </w:r>
-      <w:r>
-        <w:t xml:space="preserve">similarity scores spanning 0.45–0.84) and re-ranked them under many weight vectors (Section 2.10;</w:t>
-      </w:r>
-      <w:r>
-        <w:t xml:space="preserve"> </w:t>
-      </w:r>
-      <w:r>
-        <w:t xml:space="preserve">Figure 6). Within a reasonable neighbourhood of the default — structure kept dominant, each weight</w:t>
-      </w:r>
-      <w:r>
-        <w:t xml:space="preserve"> </w:t>
-      </w:r>
-      <w:r>
-        <w:t xml:space="preserve">varied by up to ±0.1 — the ranking was essentially unchanged: Kendall’s τ against the default ranking</w:t>
-      </w:r>
-      <w:r>
-        <w:t xml:space="preserve"> </w:t>
-      </w:r>
-      <w:r>
-        <w:t xml:space="preserve">had a</w:t>
-      </w:r>
-      <w:r>
-        <w:t xml:space="preserve"> </w:t>
-      </w:r>
-      <w:r>
-        <w:rPr>
-          <w:b/>
-          <w:bCs/>
-        </w:rPr>
-        <w:t xml:space="preserve">median of 0.98 (minimum 0.95; all 61 weightings above 0.9)</w:t>
-      </w:r>
-      <w:r>
-        <w:t xml:space="preserve">, and the top-10 candidates were</w:t>
-      </w:r>
-      <w:r>
-        <w:t xml:space="preserve"> </w:t>
-      </w:r>
-      <w:r>
-        <w:t xml:space="preserve">identical for the majority of weightings (median top-10 Jaccard 1.0). Even under an adversarial stress</w:t>
-      </w:r>
-      <w:r>
-        <w:t xml:space="preserve"> </w:t>
-      </w:r>
-      <w:r>
-        <w:t xml:space="preserve">test over the</w:t>
-      </w:r>
-      <w:r>
-        <w:t xml:space="preserve"> </w:t>
-      </w:r>
-      <w:r>
-        <w:rPr>
-          <w:i/>
-          <w:iCs/>
-        </w:rPr>
         <w:t xml:space="preserve">entire</w:t>
       </w:r>
       <w:r>
@@ -4422,25 +4174,25 @@
         <w:t xml:space="preserve"> </w:t>
       </w:r>
       <w:r>
-        <w:t xml:space="preserve">enzyme function in 96.5 % of leave-one-out tests. It matched a simple pairwise sequence-identity</w:t>
-      </w:r>
-      <w:r>
-        <w:t xml:space="preserve"> </w:t>
-      </w:r>
-      <w:r>
-        <w:t xml:space="preserve">baseline overall, was slightly better at pinpointing the exact reaction, and demonstrated clear</w:t>
-      </w:r>
-      <w:r>
-        <w:t xml:space="preserve"> </w:t>
-      </w:r>
-      <w:r>
-        <w:t xml:space="preserve">advantages for several remote-homology cases in the low-identity twilight zone where pairwise sequence</w:t>
-      </w:r>
-      <w:r>
-        <w:t xml:space="preserve"> </w:t>
-      </w:r>
-      <w:r>
-        <w:t xml:space="preserve">comparison is unreliable — while its calibrated threshold keeps precision high (0.982 at TM ≥ 0.5) and</w:t>
+        <w:t xml:space="preserve">enzyme function in 96.5 % of leave-one-out tests, versus 93.8 % for the simple pairwise-identity</w:t>
+      </w:r>
+      <w:r>
+        <w:t xml:space="preserve"> </w:t>
+      </w:r>
+      <w:r>
+        <w:t xml:space="preserve">baseline at the exact-reaction level. The observed difference was not tested for statistical</w:t>
+      </w:r>
+      <w:r>
+        <w:t xml:space="preserve"> </w:t>
+      </w:r>
+      <w:r>
+        <w:t xml:space="preserve">significance. Twenty-four correct structural calls had low identity to their structural neighbour,</w:t>
+      </w:r>
+      <w:r>
+        <w:t xml:space="preserve"> </w:t>
+      </w:r>
+      <w:r>
+        <w:t xml:space="preserve">while the calibrated threshold keeps precision high (0.982 at TM ≥ 0.5) and</w:t>
       </w:r>
       <w:r>
         <w:t xml:space="preserve"> </w:t>
@@ -4528,13 +4280,45 @@
         <w:pStyle w:val="BodyText"/>
       </w:pPr>
       <w:r>
-        <w:t xml:space="preserve">The pilot results are encouraging in a specific, limited sense: the method recovered fold-level matches</w:t>
-      </w:r>
-      <w:r>
-        <w:t xml:space="preserve"> </w:t>
-      </w:r>
-      <w:r>
-        <w:t xml:space="preserve">that are</w:t>
+        <w:t xml:space="preserve">The pilot results are useful in a specific, limited sense: P9WIT1 and O08343 produced domain/fold</w:t>
+      </w:r>
+      <w:r>
+        <w:t xml:space="preserve"> </w:t>
+      </w:r>
+      <w:r>
+        <w:t xml:space="preserve">matches coherent with their existing broad enzyme-class annotations, while P9WQ67 produced an</w:t>
+      </w:r>
+      <w:r>
+        <w:t xml:space="preserve"> </w:t>
+      </w:r>
+      <w:r>
+        <w:t xml:space="preserve">aminotransferase-fold hypothesis where the current record contains no enzyme class. None of these</w:t>
+      </w:r>
+      <w:r>
+        <w:t xml:space="preserve"> </w:t>
+      </w:r>
+      <w:r>
+        <w:t xml:space="preserve">results establishes a specific reaction, and the P9WJG7 result documents a short-fragment false positive.</w:t>
+      </w:r>
+    </w:p>
+    <w:p>
+      <w:pPr>
+        <w:pStyle w:val="BodyText"/>
+      </w:pPr>
+      <w:r>
+        <w:t xml:space="preserve">The design also makes the speed/scale trade-off explicit and pedagogically useful. TM-align’s</w:t>
+      </w:r>
+      <w:r>
+        <w:t xml:space="preserve"> </w:t>
+      </w:r>
+      <w:r>
+        <w:t xml:space="preserve">exhaustive, exact alignment is ideal for a curated reference set on a laptop but does not scale to</w:t>
+      </w:r>
+      <w:r>
+        <w:t xml:space="preserve"> </w:t>
+      </w:r>
+      <w:r>
+        <w:t xml:space="preserve">searching millions of targets; Foldseek’s</w:t>
       </w:r>
       <w:r>
         <w:t xml:space="preserve"> </w:t>
@@ -4544,60 +4328,6 @@
           <w:i/>
           <w:iCs/>
         </w:rPr>
-        <w:t xml:space="preserve">coherent with independent evidence</w:t>
-      </w:r>
-      <w:r>
-        <w:t xml:space="preserve"> </w:t>
-      </w:r>
-      <w:r>
-        <w:t xml:space="preserve">(the EC-class agreement for P9WIT1 and O08343) and, in one</w:t>
-      </w:r>
-      <w:r>
-        <w:t xml:space="preserve"> </w:t>
-      </w:r>
-      <w:r>
-        <w:t xml:space="preserve">case (P9WQ67), generated a functional hypothesis where sequence analysis had produced none. This is</w:t>
-      </w:r>
-      <w:r>
-        <w:t xml:space="preserve"> </w:t>
-      </w:r>
-      <w:r>
-        <w:t xml:space="preserve">precisely the behaviour expected of a useful triage tool — it should confirm and sharpen weak prior</w:t>
-      </w:r>
-      <w:r>
-        <w:t xml:space="preserve"> </w:t>
-      </w:r>
-      <w:r>
-        <w:t xml:space="preserve">signals and occasionally surface entirely new ones.</w:t>
-      </w:r>
-    </w:p>
-    <w:p>
-      <w:pPr>
-        <w:pStyle w:val="BodyText"/>
-      </w:pPr>
-      <w:r>
-        <w:t xml:space="preserve">The design also makes the speed/scale trade-off explicit and pedagogically useful. TM-align’s</w:t>
-      </w:r>
-      <w:r>
-        <w:t xml:space="preserve"> </w:t>
-      </w:r>
-      <w:r>
-        <w:t xml:space="preserve">exhaustive, exact alignment is ideal for a curated reference set on a laptop but does not scale to</w:t>
-      </w:r>
-      <w:r>
-        <w:t xml:space="preserve"> </w:t>
-      </w:r>
-      <w:r>
-        <w:t xml:space="preserve">searching millions of targets; Foldseek’s</w:t>
-      </w:r>
-      <w:r>
-        <w:t xml:space="preserve"> </w:t>
-      </w:r>
-      <w:r>
-        <w:rPr>
-          <w:i/>
-          <w:iCs/>
-        </w:rPr>
         <w:t xml:space="preserve">k</w:t>
       </w:r>
       <w:r>
@@ -4619,7 +4349,13 @@
         <w:t xml:space="preserve"> </w:t>
       </w:r>
       <w:r>
-        <w:t xml:space="preserve">changing one configuration value. The pocket stage mirrors this: a transparent geometric detector for</w:t>
+        <w:t xml:space="preserve">changing one configuration value, although the two search methods are not scientifically equivalent.</w:t>
+      </w:r>
+      <w:r>
+        <w:t xml:space="preserve"> </w:t>
+      </w:r>
+      <w:r>
+        <w:t xml:space="preserve">The pocket stage mirrors this: a transparent geometric detector for</w:t>
       </w:r>
       <w:r>
         <w:t xml:space="preserve"> </w:t>
@@ -4850,6 +4586,18 @@
       <w:r>
         <w:t xml:space="preserve">which was beyond the scope of this laptop-based study.</w:t>
       </w:r>
+      <w:r>
+        <w:t xml:space="preserve"> </w:t>
+      </w:r>
+      <w:r>
+        <w:t xml:space="preserve">Some proteins carry multiple legitimate EC numbers, whereas the benchmark assigns the single family</w:t>
+      </w:r>
+      <w:r>
+        <w:t xml:space="preserve"> </w:t>
+      </w:r>
+      <w:r>
+        <w:t xml:space="preserve">EC under which each entry was fetched; apparent errors can therefore include valid secondary functions.</w:t>
+      </w:r>
     </w:p>
     <w:p>
       <w:pPr>
@@ -4892,19 +4640,31 @@
           <w:b/>
           <w:bCs/>
         </w:rPr>
-        <w:t xml:space="preserve">Score reliability at short length.</w:t>
-      </w:r>
-      <w:r>
-        <w:t xml:space="preserve"> </w:t>
-      </w:r>
-      <w:r>
-        <w:t xml:space="preserve">TM-score is less reliable for very short proteins (illustrated</w:t>
-      </w:r>
-      <w:r>
-        <w:t xml:space="preserve"> </w:t>
-      </w:r>
-      <w:r>
-        <w:t xml:space="preserve">by the 50-residue P9WJG7); length and pLDDT should be weighed alongside TM-score.</w:t>
+        <w:t xml:space="preserve">Length normalisation and partial matches.</w:t>
+      </w:r>
+      <w:r>
+        <w:t xml:space="preserve"> </w:t>
+      </w:r>
+      <w:r>
+        <w:t xml:space="preserve">Ranking by the larger TM-score normalisation is</w:t>
+      </w:r>
+      <w:r>
+        <w:t xml:space="preserve"> </w:t>
+      </w:r>
+      <w:r>
+        <w:t xml:space="preserve">deliberately permissive for domain matches and can inflate short-to-long comparisons (illustrated by</w:t>
+      </w:r>
+      <w:r>
+        <w:t xml:space="preserve"> </w:t>
+      </w:r>
+      <w:r>
+        <w:t xml:space="preserve">the 50-residue P9WJG7). Both normalisations, both lengths, and coverage must be inspected before</w:t>
+      </w:r>
+      <w:r>
+        <w:t xml:space="preserve"> </w:t>
+      </w:r>
+      <w:r>
+        <w:t xml:space="preserve">function transfer.</w:t>
       </w:r>
     </w:p>
     <w:p>
@@ -4984,13 +4744,13 @@
         <w:t xml:space="preserve"> </w:t>
       </w:r>
       <w:r>
-        <w:t xml:space="preserve">however, we have not yet benchmarked its accuracy systematically, and the Cα-distance mapping it uses</w:t>
-      </w:r>
-      <w:r>
-        <w:t xml:space="preserve"> </w:t>
-      </w:r>
-      <w:r>
-        <w:t xml:space="preserve">is a coarse proxy for full active-site comparison.</w:t>
+        <w:t xml:space="preserve">however, we have not yet benchmarked its accuracy systematically, and aligned Cα proximity is a coarse</w:t>
+      </w:r>
+      <w:r>
+        <w:t xml:space="preserve"> </w:t>
+      </w:r>
+      <w:r>
+        <w:t xml:space="preserve">proxy that does not test side-chain geometry or catalytic equivalence.</w:t>
       </w:r>
     </w:p>
     <w:p>
@@ -5056,29 +4816,19 @@
         <w:t xml:space="preserve"> </w:t>
       </w:r>
       <w:r>
-        <w:t xml:space="preserve">recovered four fold-level candidate assignments, three consistent with prior</w:t>
-      </w:r>
-      <w:r>
-        <w:t xml:space="preserve"> </w:t>
-      </w:r>
-      <w:r>
-        <w:t xml:space="preserve">enzyme-class inference and one a</w:t>
-      </w:r>
-      <w:r>
-        <w:t xml:space="preserve"> </w:t>
-      </w:r>
-      <w:r>
-        <w:rPr>
-          <w:i/>
-          <w:iCs/>
-        </w:rPr>
-        <w:t xml:space="preserve">de novo</w:t>
-      </w:r>
-      <w:r>
-        <w:t xml:space="preserve"> </w:t>
-      </w:r>
-      <w:r>
-        <w:t xml:space="preserve">hypothesis. A controlled leave-one-out benchmark then</w:t>
+        <w:t xml:space="preserve">recovered three larger fold/domain hypotheses and one short-fragment false positive.</w:t>
+      </w:r>
+      <w:r>
+        <w:t xml:space="preserve"> </w:t>
+      </w:r>
+      <w:r>
+        <w:t xml:space="preserve">The cleanest whole-chain result, P9WQ67, remains an aminotransferase-fold hypothesis rather than a</w:t>
+      </w:r>
+      <w:r>
+        <w:t xml:space="preserve"> </w:t>
+      </w:r>
+      <w:r>
+        <w:t xml:space="preserve">reaction assignment. A controlled leave-one-out benchmark then</w:t>
       </w:r>
       <w:r>
         <w:t xml:space="preserve"> </w:t>
@@ -5090,19 +4840,19 @@
         <w:t xml:space="preserve"> </w:t>
       </w:r>
       <w:r>
-        <w:t xml:space="preserve">matching a simple pairwise sequence-identity baseline overall (and exceeding it at the exact-reaction</w:t>
-      </w:r>
-      <w:r>
-        <w:t xml:space="preserve"> </w:t>
-      </w:r>
-      <w:r>
-        <w:t xml:space="preserve">level) while showing clear advantages for several remote-homology cases in the low-identity twilight</w:t>
-      </w:r>
-      <w:r>
-        <w:t xml:space="preserve"> </w:t>
-      </w:r>
-      <w:r>
-        <w:t xml:space="preserve">zone, with a well-calibrated confidence threshold (precision 0.982 at TM ≥ 0.5).</w:t>
+        <w:t xml:space="preserve">versus 93.8 % for a deliberately simple symmetric pairwise-identity baseline at the exact-reaction</w:t>
+      </w:r>
+      <w:r>
+        <w:t xml:space="preserve"> </w:t>
+      </w:r>
+      <w:r>
+        <w:t xml:space="preserve">level; no paired significance analysis was performed. Twenty-four correct structural calls had &lt;30 %</w:t>
+      </w:r>
+      <w:r>
+        <w:t xml:space="preserve"> </w:t>
+      </w:r>
+      <w:r>
+        <w:t xml:space="preserve">identity to their structural hit, and the threshold gave precision 0.982 at TM ≥ 0.5.</w:t>
       </w:r>
     </w:p>
     <w:p>
@@ -5574,7 +5324,13 @@
         <w:t xml:space="preserve"> </w:t>
       </w:r>
       <w:r>
-        <w:t xml:space="preserve">together with its best structural match (D-2-hydroxyglutarate dehydrogenase, TM-score 0.90), match</w:t>
+        <w:t xml:space="preserve">together with its best structural match (D-2-hydroxyglutarate dehydrogenase; query/reference-normalised</w:t>
+      </w:r>
+      <w:r>
+        <w:t xml:space="preserve"> </w:t>
+      </w:r>
+      <w:r>
+        <w:t xml:space="preserve">TM-scores 0.90/0.42), match</w:t>
       </w:r>
       <w:r>
         <w:t xml:space="preserve"> </w:t>
@@ -5704,7 +5460,7 @@
           <wp:inline>
             <wp:extent cx="5334000" cy="3733799"/>
             <wp:effectExtent b="0" l="0" r="0" t="0"/>
-            <wp:docPr descr="Structure recovers function below the sequence twilight zone" title="" id="55" name="Picture"/>
+            <wp:docPr descr="Correct structural calls can have low pairwise identity" title="" id="55" name="Picture"/>
             <a:graphic>
               <a:graphicData uri="http://schemas.openxmlformats.org/drawingml/2006/picture">
                 <pic:pic>
@@ -5747,7 +5503,7 @@
         <w:pStyle w:val="ImageCaption"/>
       </w:pPr>
       <w:r>
-        <w:t xml:space="preserve">Structure recovers function below the sequence twilight zone</w:t>
+        <w:t xml:space="preserve">Correct structural calls can have low pairwise identity</w:t>
       </w:r>
     </w:p>
     <w:p>
@@ -5759,7 +5515,7 @@
           <w:b/>
           <w:bCs/>
         </w:rPr>
-        <w:t xml:space="preserve">Figure 4. Structure recovers function below the sequence twilight zone</w:t>
+        <w:t xml:space="preserve">Figure 4. Correct structural calls can have low pairwise identity</w:t>
       </w:r>
       <w:r>
         <w:rPr>
@@ -5800,25 +5556,25 @@
         <w:t xml:space="preserve"> </w:t>
       </w:r>
       <w:r>
-        <w:t xml:space="preserve">plotted as TM-score against the sequence identity to that hit, coloured by whether the hit’s EC number</w:t>
-      </w:r>
-      <w:r>
-        <w:t xml:space="preserve"> </w:t>
-      </w:r>
-      <w:r>
-        <w:t xml:space="preserve">is correct (≥3 levels). The dashed line marks 30 % identity, below which sequence homology is</w:t>
-      </w:r>
-      <w:r>
-        <w:t xml:space="preserve"> </w:t>
-      </w:r>
-      <w:r>
-        <w:t xml:space="preserve">unreliable; 24 correct recoveries (green) lie to its left, including matches at ~24 % (metallo-</w:t>
-      </w:r>
-      <w:r>
-        <w:t xml:space="preserve"> </w:t>
-      </w:r>
-      <w:r>
-        <w:t xml:space="preserve">β-lactamases) and 3–5 % (a lipase, an alanine racemase and a peroxidase) identity. The high-TM incorrect</w:t>
+        <w:t xml:space="preserve">plotted as TM-score against the sequence identity to that structural hit, coloured by whether the hit’s</w:t>
+      </w:r>
+      <w:r>
+        <w:t xml:space="preserve"> </w:t>
+      </w:r>
+      <w:r>
+        <w:t xml:space="preserve">EC number is correct (≥3 levels). The dashed line marks 30 % identity; 24 correct structural calls</w:t>
+      </w:r>
+      <w:r>
+        <w:t xml:space="preserve"> </w:t>
+      </w:r>
+      <w:r>
+        <w:t xml:space="preserve">(green) lie to its left. These are low-identity structural recoveries, not necessarily cases where the</w:t>
+      </w:r>
+      <w:r>
+        <w:t xml:space="preserve"> </w:t>
+      </w:r>
+      <w:r>
+        <w:t xml:space="preserve">sequence baseline failed because its nearest hit may differ. The high-TM incorrect</w:t>
       </w:r>
       <w:r>
         <w:t xml:space="preserve"> </w:t>
@@ -6521,7 +6277,7 @@
         <w:t xml:space="preserve"> </w:t>
       </w:r>
       <w:r>
-        <w:t xml:space="preserve">15(6):359–363.</w:t>
+        <w:t xml:space="preserve">15(6):359–363, 389.</w:t>
       </w:r>
     </w:p>
     <w:p>
@@ -6708,25 +6464,13 @@
         <w:t xml:space="preserve"> </w:t>
       </w:r>
       <w:r>
-        <w:t xml:space="preserve">citation details should be verified against the primary sources before any formal</w:t>
-      </w:r>
-      <w:r>
-        <w:t xml:space="preserve"> </w:t>
-      </w:r>
-      <w:r>
-        <w:t xml:space="preserve">submission; author lists are abbreviated with</w:t>
-      </w:r>
-      <w:r>
-        <w:t xml:space="preserve"> </w:t>
-      </w:r>
-      <w:r>
-        <w:t xml:space="preserve">“et al.”</w:t>
-      </w:r>
-      <w:r>
-        <w:t xml:space="preserve"> </w:t>
-      </w:r>
-      <w:r>
-        <w:t xml:space="preserve">where appropriate.</w:t>
+        <w:t xml:space="preserve">citation details were checked against primary records on 13 July 2026; author lists</w:t>
+      </w:r>
+      <w:r>
+        <w:t xml:space="preserve"> </w:t>
+      </w:r>
+      <w:r>
+        <w:t xml:space="preserve">are abbreviated with “et al.” where appropriate.</w:t>
       </w:r>
     </w:p>
     <w:p>
@@ -6885,7 +6629,7 @@
           <w:b/>
           <w:bCs/>
         </w:rPr>
-        <w:t xml:space="preserve">Reproduce the pilot (Section 3) and the interactive viewer (~5 min).</w:t>
+        <w:t xml:space="preserve">Reproduce the pilot (Section 3) and the interactive viewer (~19 min in the verification run).</w:t>
       </w:r>
     </w:p>
     <w:p>

</xml_diff>

<commit_message>
Adapt manuscript for BMC Bioinformatics
</commit_message>
<xml_diff>
--- a/paper/protein_function_rescue.docx
+++ b/paper/protein_function_rescue.docx
@@ -2,41 +2,7 @@
 <file path=word/document.xml><?xml version="1.0" encoding="utf-8"?>
 <w:document xmlns:w="http://schemas.openxmlformats.org/wordprocessingml/2006/main" xmlns:m="http://schemas.openxmlformats.org/officeDocument/2006/math" xmlns:r="http://schemas.openxmlformats.org/officeDocument/2006/relationships" xmlns:o="urn:schemas-microsoft-com:office:office" xmlns:v="urn:schemas-microsoft-com:vml" xmlns:w10="urn:schemas-microsoft-com:office:word" xmlns:a="http://schemas.openxmlformats.org/drawingml/2006/main" xmlns:pic="http://schemas.openxmlformats.org/drawingml/2006/picture" xmlns:wp="http://schemas.openxmlformats.org/drawingml/2006/wordprocessingDrawing">
   <w:body>
-    <w:p>
-      <w:pPr>
-        <w:pStyle w:val="Title"/>
-      </w:pPr>
-      <w:r>
-        <w:t xml:space="preserve">Structure-based functional annotation of hypothetical proteins using the AlphaFold Database and TM-align</w:t>
-      </w:r>
-    </w:p>
-    <w:sdt>
-      <w:sdtPr>
-        <w:docPartObj>
-          <w:docPartGallery w:val="Table of Contents"/>
-          <w:docPartUnique/>
-        </w:docPartObj>
-      </w:sdtPr>
-      <w:sdtContent>
-        <w:p>
-          <w:pPr>
-            <w:pStyle w:val="TOCHeading"/>
-          </w:pPr>
-          <w:r>
-            <w:t xml:space="preserve">Table of Contents</w:t>
-          </w:r>
-        </w:p>
-        <w:p>
-          <w:r>
-            <w:fldChar w:fldCharType="begin" w:dirty="true"/>
-            <w:instrText xml:space="preserve">TOC \o "1-2" \h \z \u</w:instrText>
-            <w:fldChar w:fldCharType="separate"/>
-            <w:fldChar w:fldCharType="end"/>
-          </w:r>
-        </w:p>
-      </w:sdtContent>
-    </w:sdt>
-    <w:bookmarkStart w:id="66" w:name="X2d541942196f82a2883fccbb769b891731fb52e"/>
+    <w:bookmarkStart w:id="71" w:name="X2d541942196f82a2883fccbb769b891731fb52e"/>
     <w:p>
       <w:pPr>
         <w:pStyle w:val="Heading1"/>
@@ -104,13 +70,13 @@
           <w:b/>
           <w:bCs/>
         </w:rPr>
-        <w:t xml:space="preserve">Manuscript type:</w:t>
-      </w:r>
-      <w:r>
-        <w:t xml:space="preserve"> </w:t>
-      </w:r>
-      <w:r>
-        <w:t xml:space="preserve">Methods / proof-of-concept (pre-print draft)</w:t>
+        <w:t xml:space="preserve">Target journal:</w:t>
+      </w:r>
+      <w:r>
+        <w:t xml:space="preserve"> </w:t>
+      </w:r>
+      <w:r>
+        <w:t xml:space="preserve">BMC Bioinformatics</w:t>
       </w:r>
       <w:r>
         <w:t xml:space="preserve"> </w:t>
@@ -120,13 +86,29 @@
           <w:b/>
           <w:bCs/>
         </w:rPr>
+        <w:t xml:space="preserve">Article type:</w:t>
+      </w:r>
+      <w:r>
+        <w:t xml:space="preserve"> </w:t>
+      </w:r>
+      <w:r>
+        <w:t xml:space="preserve">Research Article (computational method and software)</w:t>
+      </w:r>
+      <w:r>
+        <w:t xml:space="preserve"> </w:t>
+      </w:r>
+      <w:r>
+        <w:rPr>
+          <w:b/>
+          <w:bCs/>
+        </w:rPr>
         <w:t xml:space="preserve">Date:</w:t>
       </w:r>
       <w:r>
         <w:t xml:space="preserve"> </w:t>
       </w:r>
       <w:r>
-        <w:t xml:space="preserve">2026-07-13</w:t>
+        <w:t xml:space="preserve">2026-07-14</w:t>
       </w:r>
     </w:p>
     <w:p>
@@ -368,7 +350,25 @@
         <w:t xml:space="preserve"> </w:t>
       </w:r>
       <w:r>
-        <w:t xml:space="preserve">baseline at the exact-reaction level. No paired significance analysis was performed. Twenty-four of</w:t>
+        <w:t xml:space="preserve">baseline at the exact-reaction level. In a two-sided exact McNemar test, structure was correct and</w:t>
+      </w:r>
+      <w:r>
+        <w:t xml:space="preserve"> </w:t>
+      </w:r>
+      <w:r>
+        <w:t xml:space="preserve">sequence was wrong for six queries, the reverse occurred for none, and the paired difference was</w:t>
+      </w:r>
+      <w:r>
+        <w:t xml:space="preserve"> </w:t>
+      </w:r>
+      <w:r>
+        <w:t xml:space="preserve">statistically significant (P = 0.03125). This comparison is against a deliberately simple pairwise-</w:t>
+      </w:r>
+      <w:r>
+        <w:t xml:space="preserve"> </w:t>
+      </w:r>
+      <w:r>
+        <w:t xml:space="preserve">identity baseline and does not establish superiority over profile-HMM or learned methods. Twenty-four of</w:t>
       </w:r>
       <w:r>
         <w:t xml:space="preserve"> </w:t>
@@ -464,13 +464,13 @@
       </w:r>
     </w:p>
     <w:bookmarkEnd w:id="9"/>
-    <w:bookmarkStart w:id="10" w:name="introduction"/>
+    <w:bookmarkStart w:id="10" w:name="background"/>
     <w:p>
       <w:pPr>
         <w:pStyle w:val="Heading2"/>
       </w:pPr>
       <w:r>
-        <w:t xml:space="preserve">1. Introduction</w:t>
+        <w:t xml:space="preserve">Background</w:t>
       </w:r>
     </w:p>
     <w:p>
@@ -915,7 +915,7 @@
       </w:r>
     </w:p>
     <w:bookmarkEnd w:id="10"/>
-    <w:bookmarkStart w:id="21" w:name="methods"/>
+    <w:bookmarkStart w:id="23" w:name="methods"/>
     <w:p>
       <w:pPr>
         <w:pStyle w:val="Heading2"/>
@@ -2016,6 +2016,156 @@
         <w:t xml:space="preserve">).</w:t>
       </w:r>
     </w:p>
+    <w:bookmarkEnd w:id="20"/>
+    <w:bookmarkStart w:id="21" w:name="statistical-analysis"/>
+    <w:p>
+      <w:pPr>
+        <w:pStyle w:val="Heading3"/>
+      </w:pPr>
+      <w:r>
+        <w:t xml:space="preserve">2.11 Statistical analysis</w:t>
+      </w:r>
+    </w:p>
+    <w:p>
+      <w:pPr>
+        <w:pStyle w:val="FirstParagraph"/>
+      </w:pPr>
+      <w:r>
+        <w:t xml:space="preserve">Because structural and sequence predictions were made for the same 227 proteins, exact-reaction</w:t>
+      </w:r>
+      <w:r>
+        <w:t xml:space="preserve"> </w:t>
+      </w:r>
+      <w:r>
+        <w:t xml:space="preserve">accuracy was compared with a two-sided exact McNemar test on the discordant paired outcomes. The test</w:t>
+      </w:r>
+      <w:r>
+        <w:t xml:space="preserve"> </w:t>
+      </w:r>
+      <w:r>
+        <w:t xml:space="preserve">and its 2 x 2 counts are generated from</w:t>
+      </w:r>
+      <w:r>
+        <w:t xml:space="preserve"> </w:t>
+      </w:r>
+      <w:r>
+        <w:rPr>
+          <w:rStyle w:val="VerbatimChar"/>
+        </w:rPr>
+        <w:t xml:space="preserve">benchmark/results/per_query.csv</w:t>
+      </w:r>
+      <w:r>
+        <w:t xml:space="preserve"> </w:t>
+      </w:r>
+      <w:r>
+        <w:t xml:space="preserve">by</w:t>
+      </w:r>
+      <w:r>
+        <w:t xml:space="preserve"> </w:t>
+      </w:r>
+      <w:r>
+        <w:rPr>
+          <w:rStyle w:val="VerbatimChar"/>
+        </w:rPr>
+        <w:t xml:space="preserve">benchmark/run_benchmark.py</w:t>
+      </w:r>
+      <w:r>
+        <w:t xml:space="preserve"> </w:t>
+      </w:r>
+      <w:r>
+        <w:t xml:space="preserve">and stored in</w:t>
+      </w:r>
+      <w:r>
+        <w:t xml:space="preserve"> </w:t>
+      </w:r>
+      <w:r>
+        <w:rPr>
+          <w:rStyle w:val="VerbatimChar"/>
+        </w:rPr>
+        <w:t xml:space="preserve">benchmark/results/metrics.json</w:t>
+      </w:r>
+      <w:r>
+        <w:t xml:space="preserve">. The significance level was</w:t>
+      </w:r>
+      <w:r>
+        <w:t xml:space="preserve"> </w:t>
+      </w:r>
+      <w:r>
+        <w:t xml:space="preserve">0.05. This was the single paired test corresponding to the manuscript’s headline exact-EC comparison;</w:t>
+      </w:r>
+      <w:r>
+        <w:t xml:space="preserve"> </w:t>
+      </w:r>
+      <w:r>
+        <w:t xml:space="preserve">the other EC-level accuracies and calibration summaries are descriptive, and no multiple-testing</w:t>
+      </w:r>
+      <w:r>
+        <w:t xml:space="preserve"> </w:t>
+      </w:r>
+      <w:r>
+        <w:t xml:space="preserve">adjustment was applied.</w:t>
+      </w:r>
+    </w:p>
+    <w:bookmarkEnd w:id="21"/>
+    <w:bookmarkStart w:id="22" w:name="generative-ai-assistance"/>
+    <w:p>
+      <w:pPr>
+        <w:pStyle w:val="Heading3"/>
+      </w:pPr>
+      <w:r>
+        <w:t xml:space="preserve">2.12 Generative-AI assistance</w:t>
+      </w:r>
+    </w:p>
+    <w:p>
+      <w:pPr>
+        <w:pStyle w:val="FirstParagraph"/>
+      </w:pPr>
+      <w:r>
+        <w:t xml:space="preserve">Anthropic Claude (Claude Opus 4 family) assisted with initial software design and implementation,</w:t>
+      </w:r>
+      <w:r>
+        <w:t xml:space="preserve"> </w:t>
+      </w:r>
+      <w:r>
+        <w:t xml:space="preserve">benchmark construction, figure generation, and manuscript drafting. OpenAI Codex (GPT-5-based) was</w:t>
+      </w:r>
+      <w:r>
+        <w:t xml:space="preserve"> </w:t>
+      </w:r>
+      <w:r>
+        <w:t xml:space="preserve">subsequently used to audit citations and claims, rerun and correct analyses, revise code and text, add</w:t>
+      </w:r>
+      <w:r>
+        <w:t xml:space="preserve"> </w:t>
+      </w:r>
+      <w:r>
+        <w:t xml:space="preserve">tests and the paired statistical analysis, and regenerate and visually inspect the manuscript</w:t>
+      </w:r>
+      <w:r>
+        <w:t xml:space="preserve"> </w:t>
+      </w:r>
+      <w:r>
+        <w:t xml:space="preserve">artifacts. No generative-AI system was used as an author or to generate scientific images. The human</w:t>
+      </w:r>
+      <w:r>
+        <w:t xml:space="preserve"> </w:t>
+      </w:r>
+      <w:r>
+        <w:t xml:space="preserve">author reviewed the source code, reran the reported analyses, checked the citations against primary</w:t>
+      </w:r>
+      <w:r>
+        <w:t xml:space="preserve"> </w:t>
+      </w:r>
+      <w:r>
+        <w:t xml:space="preserve">records, edited the manuscript, and retains responsibility for the accuracy, originality, and</w:t>
+      </w:r>
+      <w:r>
+        <w:t xml:space="preserve"> </w:t>
+      </w:r>
+      <w:r>
+        <w:t xml:space="preserve">integrity of the work.</w:t>
+      </w:r>
+    </w:p>
     <w:p>
       <w:r>
         <w:pict>
@@ -2023,9 +2173,9 @@
         </w:pict>
       </w:r>
     </w:p>
-    <w:bookmarkEnd w:id="20"/>
-    <w:bookmarkEnd w:id="21"/>
-    <w:bookmarkStart w:id="28" w:name="results"/>
+    <w:bookmarkEnd w:id="22"/>
+    <w:bookmarkEnd w:id="23"/>
+    <w:bookmarkStart w:id="30" w:name="results"/>
     <w:p>
       <w:pPr>
         <w:pStyle w:val="Heading2"/>
@@ -2034,7 +2184,7 @@
         <w:t xml:space="preserve">3. Results</w:t>
       </w:r>
     </w:p>
-    <w:bookmarkStart w:id="22" w:name="pilot-dataset"/>
+    <w:bookmarkStart w:id="24" w:name="pilot-dataset"/>
     <w:p>
       <w:pPr>
         <w:pStyle w:val="Heading3"/>
@@ -2097,14 +2247,14 @@
         <w:t xml:space="preserve">straightforward but was outside the scope of this demonstration (see Limitations).</w:t>
       </w:r>
     </w:p>
-    <w:bookmarkEnd w:id="22"/>
-    <w:bookmarkStart w:id="23" w:name="candidate-function-assignments"/>
+    <w:bookmarkEnd w:id="24"/>
+    <w:bookmarkStart w:id="25" w:name="candidate-structural-hypotheses"/>
     <w:p>
       <w:pPr>
         <w:pStyle w:val="Heading3"/>
       </w:pPr>
       <w:r>
-        <w:t xml:space="preserve">3.2 Candidate function assignments</w:t>
+        <w:t xml:space="preserve">3.2 Candidate structural hypotheses</w:t>
       </w:r>
     </w:p>
     <w:p>
@@ -2118,13 +2268,19 @@
         <w:t xml:space="preserve"> </w:t>
       </w:r>
       <w:r>
-        <w:t xml:space="preserve">Because this threshold uses the larger length normalisation, these are fold/domain matches rather than</w:t>
-      </w:r>
-      <w:r>
-        <w:t xml:space="preserve"> </w:t>
-      </w:r>
-      <w:r>
-        <w:t xml:space="preserve">automatic function assignments. The remaining five had no reference above threshold.</w:t>
+        <w:t xml:space="preserve">Because this threshold uses the larger length normalisation, these are structural hypotheses rather</w:t>
+      </w:r>
+      <w:r>
+        <w:t xml:space="preserve"> </w:t>
+      </w:r>
+      <w:r>
+        <w:t xml:space="preserve">than experimental or reaction-level function assignments. The remaining five had no reference above</w:t>
+      </w:r>
+      <w:r>
+        <w:t xml:space="preserve"> </w:t>
+      </w:r>
+      <w:r>
+        <w:t xml:space="preserve">threshold.</w:t>
       </w:r>
     </w:p>
     <w:p>
@@ -2704,8 +2860,8 @@
         </w:tc>
       </w:tr>
     </w:tbl>
-    <w:bookmarkEnd w:id="23"/>
-    <w:bookmarkStart w:id="24" w:name="interpretation-of-the-structural-hits"/>
+    <w:bookmarkEnd w:id="25"/>
+    <w:bookmarkStart w:id="26" w:name="interpretation-of-the-structural-hits"/>
     <w:p>
       <w:pPr>
         <w:pStyle w:val="Heading3"/>
@@ -2856,8 +3012,8 @@
         <w:t xml:space="preserve">normalisation and is retained only as a documented failure mode.</w:t>
       </w:r>
     </w:p>
-    <w:bookmarkEnd w:id="24"/>
-    <w:bookmarkStart w:id="25" w:name="pocket-analysis"/>
+    <w:bookmarkEnd w:id="26"/>
+    <w:bookmarkStart w:id="27" w:name="pocket-analysis"/>
     <w:p>
       <w:pPr>
         <w:pStyle w:val="Heading3"/>
@@ -2898,8 +3054,8 @@
         <w:t xml:space="preserve">composite ranking and for visual inspection, not as a standalone druggability claim.</w:t>
       </w:r>
     </w:p>
-    <w:bookmarkEnd w:id="25"/>
-    <w:bookmarkStart w:id="26" w:name="software-and-interface"/>
+    <w:bookmarkEnd w:id="27"/>
+    <w:bookmarkStart w:id="28" w:name="software-and-interface"/>
     <w:p>
       <w:pPr>
         <w:pStyle w:val="Heading3"/>
@@ -2946,8 +3102,8 @@
         <w:t xml:space="preserve">was strongly length-dependent, with the 1,327-residue P9WN15 query dominating the run.</w:t>
       </w:r>
     </w:p>
-    <w:bookmarkEnd w:id="26"/>
-    <w:bookmarkStart w:id="27" w:name="X337fcafd85cc1d614e2686deb6afcf3a148f903"/>
+    <w:bookmarkEnd w:id="28"/>
+    <w:bookmarkStart w:id="29" w:name="X337fcafd85cc1d614e2686deb6afcf3a148f903"/>
     <w:p>
       <w:pPr>
         <w:pStyle w:val="Heading3"/>
@@ -3511,9 +3667,9 @@
         </w:pict>
       </w:r>
     </w:p>
-    <w:bookmarkEnd w:id="27"/>
-    <w:bookmarkEnd w:id="28"/>
-    <w:bookmarkStart w:id="36" w:name="validation-a-leave-one-out-benchmark"/>
+    <w:bookmarkEnd w:id="29"/>
+    <w:bookmarkEnd w:id="30"/>
+    <w:bookmarkStart w:id="38" w:name="validation-a-leave-one-out-benchmark"/>
     <w:p>
       <w:pPr>
         <w:pStyle w:val="Heading2"/>
@@ -3561,7 +3717,7 @@
         <w:t xml:space="preserve">labelled gold-standard set.</w:t>
       </w:r>
     </w:p>
-    <w:bookmarkStart w:id="29" w:name="benchmark-design"/>
+    <w:bookmarkStart w:id="31" w:name="benchmark-design"/>
     <w:p>
       <w:pPr>
         <w:pStyle w:val="Heading3"/>
@@ -3660,8 +3816,8 @@
         <w:t xml:space="preserve">.</w:t>
       </w:r>
     </w:p>
-    <w:bookmarkEnd w:id="29"/>
-    <w:bookmarkStart w:id="30" w:name="X0678a78b1f556c857954555e23544fe8630b298"/>
+    <w:bookmarkEnd w:id="31"/>
+    <w:bookmarkStart w:id="32" w:name="X0678a78b1f556c857954555e23544fe8630b298"/>
     <w:p>
       <w:pPr>
         <w:pStyle w:val="Heading3"/>
@@ -3746,29 +3902,35 @@
         <w:t xml:space="preserve"> </w:t>
       </w:r>
       <w:r>
-        <w:t xml:space="preserve">(level 4). This is a 2.7-percentage-point observed difference;</w:t>
-      </w:r>
-      <w:r>
-        <w:t xml:space="preserve"> </w:t>
-      </w:r>
-      <w:r>
-        <w:t xml:space="preserve">no paired confidence interval or significance test was performed, so we do not claim statistical</w:t>
-      </w:r>
-      <w:r>
-        <w:t xml:space="preserve"> </w:t>
-      </w:r>
-      <w:r>
-        <w:t xml:space="preserve">superiority or equivalence. A stronger sequence method (profile/HMM search; Section 6) could narrow or</w:t>
-      </w:r>
-      <w:r>
-        <w:t xml:space="preserve"> </w:t>
-      </w:r>
-      <w:r>
-        <w:t xml:space="preserve">reverse the difference.</w:t>
-      </w:r>
-    </w:p>
-    <w:bookmarkEnd w:id="30"/>
-    <w:bookmarkStart w:id="31" w:name="X812b4a4daf242f78c5560c6c6555ac1a5686c64"/>
+        <w:t xml:space="preserve">(level 4). Of the paired outcomes, both methods were correct for</w:t>
+      </w:r>
+      <w:r>
+        <w:t xml:space="preserve"> </w:t>
+      </w:r>
+      <w:r>
+        <w:t xml:space="preserve">213 proteins, structure alone was correct for six, sequence alone was correct for none, and both were</w:t>
+      </w:r>
+      <w:r>
+        <w:t xml:space="preserve"> </w:t>
+      </w:r>
+      <w:r>
+        <w:t xml:space="preserve">wrong for eight. The 2.64-percentage-point difference was significant by a two-sided exact McNemar test</w:t>
+      </w:r>
+      <w:r>
+        <w:t xml:space="preserve"> </w:t>
+      </w:r>
+      <w:r>
+        <w:t xml:space="preserve">(P = 0.03125). This establishes a difference only against this deliberately simple pairwise-identity</w:t>
+      </w:r>
+      <w:r>
+        <w:t xml:space="preserve"> </w:t>
+      </w:r>
+      <w:r>
+        <w:t xml:space="preserve">baseline on this benchmark; it does not establish superiority over profile-HMM or learned methods.</w:t>
+      </w:r>
+    </w:p>
+    <w:bookmarkEnd w:id="32"/>
+    <w:bookmarkStart w:id="33" w:name="X812b4a4daf242f78c5560c6c6555ac1a5686c64"/>
     <w:p>
       <w:pPr>
         <w:pStyle w:val="Heading3"/>
@@ -3839,8 +4001,8 @@
         <w:t xml:space="preserve">analysis rather than a general comparison with modern sequence methods.</w:t>
       </w:r>
     </w:p>
-    <w:bookmarkEnd w:id="31"/>
-    <w:bookmarkStart w:id="32" w:name="calibration-of-the-tm-score-threshold"/>
+    <w:bookmarkEnd w:id="33"/>
+    <w:bookmarkStart w:id="34" w:name="calibration-of-the-tm-score-threshold"/>
     <w:p>
       <w:pPr>
         <w:pStyle w:val="Heading3"/>
@@ -3931,8 +4093,8 @@
         <w:t xml:space="preserve">functional identity.</w:t>
       </w:r>
     </w:p>
-    <w:bookmarkEnd w:id="32"/>
-    <w:bookmarkStart w:id="33" w:name="instructive-failure-modes"/>
+    <w:bookmarkEnd w:id="34"/>
+    <w:bookmarkStart w:id="35" w:name="instructive-failure-modes"/>
     <w:p>
       <w:pPr>
         <w:pStyle w:val="Heading3"/>
@@ -4018,8 +4180,8 @@
         <w:t xml:space="preserve">rather than wrong high-confidence calls, exactly as the pipeline’s filtering and ranking intend.</w:t>
       </w:r>
     </w:p>
-    <w:bookmarkEnd w:id="33"/>
-    <w:bookmarkStart w:id="34" w:name="X77b3583a237dcdc2c17a8b2b6f7eeb52c431ada"/>
+    <w:bookmarkEnd w:id="35"/>
+    <w:bookmarkStart w:id="36" w:name="X77b3583a237dcdc2c17a8b2b6f7eeb52c431ada"/>
     <w:p>
       <w:pPr>
         <w:pStyle w:val="Heading3"/>
@@ -4153,8 +4315,8 @@
         <w:t xml:space="preserve">structural similarity and model confidence regardless.)</w:t>
       </w:r>
     </w:p>
-    <w:bookmarkEnd w:id="34"/>
-    <w:bookmarkStart w:id="35" w:name="summary"/>
+    <w:bookmarkEnd w:id="36"/>
+    <w:bookmarkStart w:id="37" w:name="summary"/>
     <w:p>
       <w:pPr>
         <w:pStyle w:val="Heading3"/>
@@ -4180,13 +4342,13 @@
         <w:t xml:space="preserve"> </w:t>
       </w:r>
       <w:r>
-        <w:t xml:space="preserve">baseline at the exact-reaction level. The observed difference was not tested for statistical</w:t>
-      </w:r>
-      <w:r>
-        <w:t xml:space="preserve"> </w:t>
-      </w:r>
-      <w:r>
-        <w:t xml:space="preserve">significance. Twenty-four correct structural calls had low identity to their structural neighbour,</w:t>
+        <w:t xml:space="preserve">baseline at the exact-reaction level; the paired exact McNemar P value was 0.03125 (six discordant</w:t>
+      </w:r>
+      <w:r>
+        <w:t xml:space="preserve"> </w:t>
+      </w:r>
+      <w:r>
+        <w:t xml:space="preserve">structure-only successes and no sequence-only successes). Twenty-four correct structural calls had low identity to their structural neighbour,</w:t>
       </w:r>
       <w:r>
         <w:t xml:space="preserve"> </w:t>
@@ -4226,9 +4388,9 @@
         </w:pict>
       </w:r>
     </w:p>
-    <w:bookmarkEnd w:id="35"/>
-    <w:bookmarkEnd w:id="36"/>
-    <w:bookmarkStart w:id="37" w:name="discussion"/>
+    <w:bookmarkEnd w:id="37"/>
+    <w:bookmarkEnd w:id="38"/>
+    <w:bookmarkStart w:id="39" w:name="discussion"/>
     <w:p>
       <w:pPr>
         <w:pStyle w:val="Heading2"/>
@@ -4409,8 +4571,8 @@
         </w:pict>
       </w:r>
     </w:p>
-    <w:bookmarkEnd w:id="37"/>
-    <w:bookmarkStart w:id="38" w:name="limitations"/>
+    <w:bookmarkEnd w:id="39"/>
+    <w:bookmarkStart w:id="40" w:name="limitations"/>
     <w:p>
       <w:pPr>
         <w:pStyle w:val="Heading2"/>
@@ -4760,8 +4922,8 @@
         </w:pict>
       </w:r>
     </w:p>
-    <w:bookmarkEnd w:id="38"/>
-    <w:bookmarkStart w:id="39" w:name="conclusions-and-future-work"/>
+    <w:bookmarkEnd w:id="40"/>
+    <w:bookmarkStart w:id="41" w:name="conclusions-and-future-work"/>
     <w:p>
       <w:pPr>
         <w:pStyle w:val="Heading2"/>
@@ -4846,7 +5008,19 @@
         <w:t xml:space="preserve"> </w:t>
       </w:r>
       <w:r>
-        <w:t xml:space="preserve">level; no paired significance analysis was performed. Twenty-four correct structural calls had &lt;30 %</w:t>
+        <w:t xml:space="preserve">level. The two-sided exact McNemar P value was 0.03125 (six structure-only successes and no</w:t>
+      </w:r>
+      <w:r>
+        <w:t xml:space="preserve"> </w:t>
+      </w:r>
+      <w:r>
+        <w:t xml:space="preserve">sequence-only successes), but this result applies only to the deliberately simple pairwise baseline.</w:t>
+      </w:r>
+      <w:r>
+        <w:t xml:space="preserve"> </w:t>
+      </w:r>
+      <w:r>
+        <w:t xml:space="preserve">Twenty-four correct structural calls had &lt;30 %</w:t>
       </w:r>
       <w:r>
         <w:t xml:space="preserve"> </w:t>
@@ -4900,14 +5074,23 @@
         </w:pict>
       </w:r>
     </w:p>
-    <w:bookmarkEnd w:id="39"/>
-    <w:bookmarkStart w:id="40" w:name="data-and-code-availability"/>
+    <w:bookmarkEnd w:id="41"/>
+    <w:bookmarkStart w:id="49" w:name="declarations"/>
     <w:p>
       <w:pPr>
         <w:pStyle w:val="Heading2"/>
       </w:pPr>
       <w:r>
-        <w:t xml:space="preserve">Data and code availability</w:t>
+        <w:t xml:space="preserve">Declarations</w:t>
+      </w:r>
+    </w:p>
+    <w:bookmarkStart w:id="42" w:name="Xd182db0490b2de20bd2b4e4cc8698599182035f"/>
+    <w:p>
+      <w:pPr>
+        <w:pStyle w:val="Heading3"/>
+      </w:pPr>
+      <w:r>
+        <w:t xml:space="preserve">Ethics approval and consent to participate</w:t>
       </w:r>
     </w:p>
     <w:p>
@@ -4915,6 +5098,48 @@
         <w:pStyle w:val="FirstParagraph"/>
       </w:pPr>
       <w:r>
+        <w:t xml:space="preserve">Not applicable. The study used public protein structures and annotations and involved no human</w:t>
+      </w:r>
+      <w:r>
+        <w:t xml:space="preserve"> </w:t>
+      </w:r>
+      <w:r>
+        <w:t xml:space="preserve">participants, human data, human tissue, animals, or client-owned animals.</w:t>
+      </w:r>
+    </w:p>
+    <w:bookmarkEnd w:id="42"/>
+    <w:bookmarkStart w:id="43" w:name="consent-for-publication"/>
+    <w:p>
+      <w:pPr>
+        <w:pStyle w:val="Heading3"/>
+      </w:pPr>
+      <w:r>
+        <w:t xml:space="preserve">Consent for publication</w:t>
+      </w:r>
+    </w:p>
+    <w:p>
+      <w:pPr>
+        <w:pStyle w:val="FirstParagraph"/>
+      </w:pPr>
+      <w:r>
+        <w:t xml:space="preserve">Not applicable. The manuscript contains no individual person’s data.</w:t>
+      </w:r>
+    </w:p>
+    <w:bookmarkEnd w:id="43"/>
+    <w:bookmarkStart w:id="44" w:name="availability-of-data-and-materials"/>
+    <w:p>
+      <w:pPr>
+        <w:pStyle w:val="Heading3"/>
+      </w:pPr>
+      <w:r>
+        <w:t xml:space="preserve">Availability of data and materials</w:t>
+      </w:r>
+    </w:p>
+    <w:p>
+      <w:pPr>
+        <w:pStyle w:val="FirstParagraph"/>
+      </w:pPr>
+      <w:r>
         <w:t xml:space="preserve">All source code, configuration, the pilot outputs (ranked candidate list as JSON/CSV, the</w:t>
       </w:r>
       <w:r>
@@ -4951,13 +5176,25 @@
         <w:t xml:space="preserve"> </w:t>
       </w:r>
       <w:r>
-        <w:t xml:space="preserve">repository. Input structures are freely available from the AlphaFold Protein Structure Database</w:t>
-      </w:r>
-      <w:r>
-        <w:t xml:space="preserve"> </w:t>
-      </w:r>
-      <w:r>
-        <w:t xml:space="preserve">(https://alphafold.ebi.ac.uk) and protein annotations from UniProt (https://www.uniprot.org). The</w:t>
+        <w:t xml:space="preserve">repository at https://github.com/kenyamabro/protein-function-rescue. A persistent archived software DOI</w:t>
+      </w:r>
+      <w:r>
+        <w:t xml:space="preserve"> </w:t>
+      </w:r>
+      <w:r>
+        <w:t xml:space="preserve">must be added here after creating the submission release in Zenodo. Input structures are freely</w:t>
+      </w:r>
+      <w:r>
+        <w:t xml:space="preserve"> </w:t>
+      </w:r>
+      <w:r>
+        <w:t xml:space="preserve">available from the AlphaFold Protein Structure Database (https://alphafold.ebi.ac.uk) and protein</w:t>
+      </w:r>
+      <w:r>
+        <w:t xml:space="preserve"> </w:t>
+      </w:r>
+      <w:r>
+        <w:t xml:space="preserve">annotations from UniProt (https://www.uniprot.org). The</w:t>
       </w:r>
       <w:r>
         <w:t xml:space="preserve"> </w:t>
@@ -5008,14 +5245,50 @@
         <w:t xml:space="preserve">(0.5, 0.2, 0.3). Benchmark: 227 enzymes, 29 EC families, classes 1–6, length 80–520 residues.</w:t>
       </w:r>
     </w:p>
-    <w:bookmarkEnd w:id="40"/>
-    <w:bookmarkStart w:id="41" w:name="author-contributions"/>
-    <w:p>
-      <w:pPr>
-        <w:pStyle w:val="Heading2"/>
-      </w:pPr>
-      <w:r>
-        <w:t xml:space="preserve">Author contributions</w:t>
+    <w:p>
+      <w:pPr>
+        <w:pStyle w:val="BodyText"/>
+      </w:pPr>
+      <w:r>
+        <w:rPr>
+          <w:b/>
+          <w:bCs/>
+        </w:rPr>
+        <w:t xml:space="preserve">Software metadata:</w:t>
+      </w:r>
+      <w:r>
+        <w:t xml:space="preserve"> </w:t>
+      </w:r>
+      <w:r>
+        <w:t xml:space="preserve">Project name: Protein Function Rescue; project home page:</w:t>
+      </w:r>
+      <w:r>
+        <w:t xml:space="preserve"> </w:t>
+      </w:r>
+      <w:r>
+        <w:t xml:space="preserve">https://github.com/kenyamabro/protein-function-rescue; archived version: pending Zenodo DOI; operating</w:t>
+      </w:r>
+      <w:r>
+        <w:t xml:space="preserve"> </w:t>
+      </w:r>
+      <w:r>
+        <w:t xml:space="preserve">systems: Windows, Linux and macOS; programming language: Python 3.12; license: MIT; no restrictions on</w:t>
+      </w:r>
+      <w:r>
+        <w:t xml:space="preserve"> </w:t>
+      </w:r>
+      <w:r>
+        <w:t xml:space="preserve">academic or non-academic use beyond the license and upstream database terms.</w:t>
+      </w:r>
+    </w:p>
+    <w:bookmarkEnd w:id="44"/>
+    <w:bookmarkStart w:id="45" w:name="competing-interests"/>
+    <w:p>
+      <w:pPr>
+        <w:pStyle w:val="Heading3"/>
+      </w:pPr>
+      <w:r>
+        <w:t xml:space="preserve">Competing interests</w:t>
       </w:r>
     </w:p>
     <w:p>
@@ -5023,23 +5296,80 @@
         <w:pStyle w:val="FirstParagraph"/>
       </w:pPr>
       <w:r>
+        <w:t xml:space="preserve">The author declares no competing interests.</w:t>
+      </w:r>
+    </w:p>
+    <w:bookmarkEnd w:id="45"/>
+    <w:bookmarkStart w:id="46" w:name="funding"/>
+    <w:p>
+      <w:pPr>
+        <w:pStyle w:val="Heading3"/>
+      </w:pPr>
+      <w:r>
+        <w:t xml:space="preserve">Funding</w:t>
+      </w:r>
+    </w:p>
+    <w:p>
+      <w:pPr>
+        <w:pStyle w:val="FirstParagraph"/>
+      </w:pPr>
+      <w:r>
+        <w:t xml:space="preserve">[State all funding sources and the funders’ roles, or replace this text with:</w:t>
+      </w:r>
+      <w:r>
+        <w:t xml:space="preserve"> </w:t>
+      </w:r>
+      <w:r>
+        <w:t xml:space="preserve">“The author received no</w:t>
+      </w:r>
+      <w:r>
+        <w:t xml:space="preserve"> </w:t>
+      </w:r>
+      <w:r>
+        <w:t xml:space="preserve">specific funding for this work.”</w:t>
+      </w:r>
+      <w:r>
+        <w:t xml:space="preserve">]</w:t>
+      </w:r>
+    </w:p>
+    <w:bookmarkEnd w:id="46"/>
+    <w:bookmarkStart w:id="47" w:name="authors-contributions"/>
+    <w:p>
+      <w:pPr>
+        <w:pStyle w:val="Heading3"/>
+      </w:pPr>
+      <w:r>
+        <w:t xml:space="preserve">Authors’ contributions</w:t>
+      </w:r>
+    </w:p>
+    <w:p>
+      <w:pPr>
+        <w:pStyle w:val="FirstParagraph"/>
+      </w:pPr>
+      <w:r>
         <w:t xml:space="preserve">[Student Name] designed the study, implemented the pipeline, performed the analysis, and wrote the</w:t>
       </w:r>
       <w:r>
         <w:t xml:space="preserve"> </w:t>
       </w:r>
       <w:r>
-        <w:t xml:space="preserve">manuscript. [Add supervisor/contributors as appropriate.]</w:t>
-      </w:r>
-    </w:p>
-    <w:bookmarkEnd w:id="41"/>
-    <w:bookmarkStart w:id="42" w:name="competing-interests"/>
-    <w:p>
-      <w:pPr>
-        <w:pStyle w:val="Heading2"/>
-      </w:pPr>
-      <w:r>
-        <w:t xml:space="preserve">Competing interests</w:t>
+        <w:t xml:space="preserve">manuscript. [Add each qualifying coauthor or supervisor by initials and contribution; remove this</w:t>
+      </w:r>
+      <w:r>
+        <w:t xml:space="preserve"> </w:t>
+      </w:r>
+      <w:r>
+        <w:t xml:space="preserve">instruction before submission.] The final author list must read and approve the submitted manuscript.</w:t>
+      </w:r>
+    </w:p>
+    <w:bookmarkEnd w:id="47"/>
+    <w:bookmarkStart w:id="48" w:name="acknowledgements"/>
+    <w:p>
+      <w:pPr>
+        <w:pStyle w:val="Heading3"/>
+      </w:pPr>
+      <w:r>
+        <w:t xml:space="preserve">Acknowledgements</w:t>
       </w:r>
     </w:p>
     <w:p>
@@ -5047,85 +5377,34 @@
         <w:pStyle w:val="FirstParagraph"/>
       </w:pPr>
       <w:r>
-        <w:t xml:space="preserve">The author declares no competing interests.</w:t>
-      </w:r>
-    </w:p>
-    <w:bookmarkEnd w:id="42"/>
-    <w:bookmarkStart w:id="43" w:name="use-of-generative-ai"/>
-    <w:p>
-      <w:pPr>
-        <w:pStyle w:val="Heading2"/>
-      </w:pPr>
-      <w:r>
-        <w:t xml:space="preserve">Use of generative AI</w:t>
-      </w:r>
-    </w:p>
-    <w:p>
-      <w:pPr>
-        <w:pStyle w:val="FirstParagraph"/>
-      </w:pPr>
-      <w:r>
-        <w:t xml:space="preserve">In preparing this work the author used Anthropic’s Claude (Claude Opus 4 family) as a coding and writing</w:t>
-      </w:r>
-      <w:r>
-        <w:t xml:space="preserve"> </w:t>
-      </w:r>
-      <w:r>
-        <w:t xml:space="preserve">assistant: to help design and implement the software pipeline and the validation benchmark, to generate</w:t>
-      </w:r>
-      <w:r>
-        <w:t xml:space="preserve"> </w:t>
-      </w:r>
-      <w:r>
-        <w:t xml:space="preserve">the figures, and to draft and revise the text of this manuscript. After using this tool, the author</w:t>
-      </w:r>
-      <w:r>
-        <w:t xml:space="preserve"> </w:t>
-      </w:r>
-      <w:r>
-        <w:t xml:space="preserve">reviewed, edited, and verified the content, and takes full responsibility for it — including all code,</w:t>
-      </w:r>
-      <w:r>
-        <w:t xml:space="preserve"> </w:t>
-      </w:r>
-      <w:r>
-        <w:t xml:space="preserve">analyses, numerical results, and claims. No generative-AI system is listed as an author, consistent with</w:t>
-      </w:r>
-      <w:r>
-        <w:t xml:space="preserve"> </w:t>
-      </w:r>
-      <w:r>
-        <w:t xml:space="preserve">COPE and ICMJE guidance that authorship requires accountability a non-human tool cannot hold. All</w:t>
-      </w:r>
-      <w:r>
-        <w:t xml:space="preserve"> </w:t>
-      </w:r>
-      <w:r>
-        <w:t xml:space="preserve">citations were checked against the primary literature prior to submission.</w:t>
-      </w:r>
-    </w:p>
-    <w:bookmarkEnd w:id="43"/>
-    <w:bookmarkStart w:id="44" w:name="acknowledgements"/>
-    <w:p>
-      <w:pPr>
-        <w:pStyle w:val="Heading2"/>
-      </w:pPr>
-      <w:r>
-        <w:t xml:space="preserve">Acknowledgements</w:t>
-      </w:r>
-    </w:p>
-    <w:p>
-      <w:pPr>
-        <w:pStyle w:val="FirstParagraph"/>
-      </w:pPr>
-      <w:r>
         <w:t xml:space="preserve">This work uses data from the AlphaFold Protein Structure Database (Google DeepMind and EMBL-EBI) and</w:t>
       </w:r>
       <w:r>
         <w:t xml:space="preserve"> </w:t>
       </w:r>
       <w:r>
-        <w:t xml:space="preserve">UniProt. [Add mentors, institutions, funding as appropriate.]</w:t>
+        <w:t xml:space="preserve">UniProt. [Name non-author contributors only after obtaining their permission, or replace this bracketed</w:t>
+      </w:r>
+      <w:r>
+        <w:t xml:space="preserve"> </w:t>
+      </w:r>
+      <w:r>
+        <w:t xml:space="preserve">text with</w:t>
+      </w:r>
+      <w:r>
+        <w:t xml:space="preserve"> </w:t>
+      </w:r>
+      <w:r>
+        <w:t xml:space="preserve">“Not applicable.”</w:t>
+      </w:r>
+      <w:r>
+        <w:t xml:space="preserve">] Generative-AI assistance is documented in the Methods section as required</w:t>
+      </w:r>
+      <w:r>
+        <w:t xml:space="preserve"> </w:t>
+      </w:r>
+      <w:r>
+        <w:t xml:space="preserve">by the target journal.</w:t>
       </w:r>
     </w:p>
     <w:p>
@@ -5135,8 +5414,9 @@
         </w:pict>
       </w:r>
     </w:p>
-    <w:bookmarkEnd w:id="44"/>
-    <w:bookmarkStart w:id="63" w:name="figures"/>
+    <w:bookmarkEnd w:id="48"/>
+    <w:bookmarkEnd w:id="49"/>
+    <w:bookmarkStart w:id="68" w:name="figures"/>
     <w:p>
       <w:pPr>
         <w:pStyle w:val="Heading2"/>
@@ -5154,18 +5434,18 @@
           <wp:inline>
             <wp:extent cx="5334000" cy="1468073"/>
             <wp:effectExtent b="0" l="0" r="0" t="0"/>
-            <wp:docPr descr="Pipeline overview" title="" id="46" name="Picture"/>
+            <wp:docPr descr="Pipeline overview" title="" id="51" name="Picture"/>
             <a:graphic>
               <a:graphicData uri="http://schemas.openxmlformats.org/drawingml/2006/picture">
                 <pic:pic>
                   <pic:nvPicPr>
-                    <pic:cNvPr descr="figures/fig1_pipeline.png" id="47" name="Picture"/>
+                    <pic:cNvPr descr="figures/fig1_pipeline.png" id="52" name="Picture"/>
                     <pic:cNvPicPr>
                       <a:picLocks noChangeArrowheads="1" noChangeAspect="1"/>
                     </pic:cNvPicPr>
                   </pic:nvPicPr>
                   <pic:blipFill>
-                    <a:blip r:embed="rId45"/>
+                    <a:blip r:embed="rId50"/>
                     <a:stretch>
                       <a:fillRect/>
                     </a:stretch>
@@ -5251,18 +5531,18 @@
           <wp:inline>
             <wp:extent cx="5334000" cy="3417093"/>
             <wp:effectExtent b="0" l="0" r="0" t="0"/>
-            <wp:docPr descr="Web viewer" title="" id="49" name="Picture"/>
+            <wp:docPr descr="Web viewer" title="" id="54" name="Picture"/>
             <a:graphic>
               <a:graphicData uri="http://schemas.openxmlformats.org/drawingml/2006/picture">
                 <pic:pic>
                   <pic:nvPicPr>
-                    <pic:cNvPr descr="figures/fig2_viewer.png" id="50" name="Picture"/>
+                    <pic:cNvPr descr="figures/fig2_viewer.png" id="55" name="Picture"/>
                     <pic:cNvPicPr>
                       <a:picLocks noChangeArrowheads="1" noChangeAspect="1"/>
                     </pic:cNvPicPr>
                   </pic:nvPicPr>
                   <pic:blipFill>
-                    <a:blip r:embed="rId48"/>
+                    <a:blip r:embed="rId53"/>
                     <a:stretch>
                       <a:fillRect/>
                     </a:stretch>
@@ -5348,18 +5628,18 @@
           <wp:inline>
             <wp:extent cx="5334000" cy="3556000"/>
             <wp:effectExtent b="0" l="0" r="0" t="0"/>
-            <wp:docPr descr="Leave-one-out function recovery" title="" id="52" name="Picture"/>
+            <wp:docPr descr="Leave-one-out function recovery" title="" id="57" name="Picture"/>
             <a:graphic>
               <a:graphicData uri="http://schemas.openxmlformats.org/drawingml/2006/picture">
                 <pic:pic>
                   <pic:nvPicPr>
-                    <pic:cNvPr descr="../benchmark/results/figures/fig_ec_accuracy.png" id="53" name="Picture"/>
+                    <pic:cNvPr descr="../benchmark/results/figures/fig_ec_accuracy.png" id="58" name="Picture"/>
                     <pic:cNvPicPr>
                       <a:picLocks noChangeArrowheads="1" noChangeAspect="1"/>
                     </pic:cNvPicPr>
                   </pic:nvPicPr>
                   <pic:blipFill>
-                    <a:blip r:embed="rId51"/>
+                    <a:blip r:embed="rId56"/>
                     <a:stretch>
                       <a:fillRect/>
                     </a:stretch>
@@ -5460,18 +5740,18 @@
           <wp:inline>
             <wp:extent cx="5334000" cy="3733799"/>
             <wp:effectExtent b="0" l="0" r="0" t="0"/>
-            <wp:docPr descr="Correct structural calls can have low pairwise identity" title="" id="55" name="Picture"/>
+            <wp:docPr descr="Correct structural calls can have low pairwise identity" title="" id="60" name="Picture"/>
             <a:graphic>
               <a:graphicData uri="http://schemas.openxmlformats.org/drawingml/2006/picture">
                 <pic:pic>
                   <pic:nvPicPr>
-                    <pic:cNvPr descr="../benchmark/results/figures/fig_tm_vs_identity.png" id="56" name="Picture"/>
+                    <pic:cNvPr descr="../benchmark/results/figures/fig_tm_vs_identity.png" id="61" name="Picture"/>
                     <pic:cNvPicPr>
                       <a:picLocks noChangeArrowheads="1" noChangeAspect="1"/>
                     </pic:cNvPicPr>
                   </pic:nvPicPr>
                   <pic:blipFill>
-                    <a:blip r:embed="rId54"/>
+                    <a:blip r:embed="rId59"/>
                     <a:stretch>
                       <a:fillRect/>
                     </a:stretch>
@@ -5598,18 +5878,18 @@
           <wp:inline>
             <wp:extent cx="5334000" cy="3556000"/>
             <wp:effectExtent b="0" l="0" r="0" t="0"/>
-            <wp:docPr descr="Calibration of the TM-score threshold" title="" id="58" name="Picture"/>
+            <wp:docPr descr="Calibration of the TM-score threshold" title="" id="63" name="Picture"/>
             <a:graphic>
               <a:graphicData uri="http://schemas.openxmlformats.org/drawingml/2006/picture">
                 <pic:pic>
                   <pic:nvPicPr>
-                    <pic:cNvPr descr="../benchmark/results/figures/fig_precision_threshold.png" id="59" name="Picture"/>
+                    <pic:cNvPr descr="../benchmark/results/figures/fig_precision_threshold.png" id="64" name="Picture"/>
                     <pic:cNvPicPr>
                       <a:picLocks noChangeArrowheads="1" noChangeAspect="1"/>
                     </pic:cNvPicPr>
                   </pic:nvPicPr>
                   <pic:blipFill>
-                    <a:blip r:embed="rId57"/>
+                    <a:blip r:embed="rId62"/>
                     <a:stretch>
                       <a:fillRect/>
                     </a:stretch>
@@ -5718,18 +5998,18 @@
           <wp:inline>
             <wp:extent cx="5334000" cy="2250074"/>
             <wp:effectExtent b="0" l="0" r="0" t="0"/>
-            <wp:docPr descr="The candidate ranking is insensitive to the composite weights" title="" id="61" name="Picture"/>
+            <wp:docPr descr="The candidate ranking is insensitive to the composite weights" title="" id="66" name="Picture"/>
             <a:graphic>
               <a:graphicData uri="http://schemas.openxmlformats.org/drawingml/2006/picture">
                 <pic:pic>
                   <pic:nvPicPr>
-                    <pic:cNvPr descr="../benchmark/results/figures/fig_weight_sensitivity.png" id="62" name="Picture"/>
+                    <pic:cNvPr descr="../benchmark/results/figures/fig_weight_sensitivity.png" id="67" name="Picture"/>
                     <pic:cNvPicPr>
                       <a:picLocks noChangeArrowheads="1" noChangeAspect="1"/>
                     </pic:cNvPicPr>
                   </pic:nvPicPr>
                   <pic:blipFill>
-                    <a:blip r:embed="rId60"/>
+                    <a:blip r:embed="rId65"/>
                     <a:stretch>
                       <a:fillRect/>
                     </a:stretch>
@@ -5848,8 +6128,8 @@
         </w:pict>
       </w:r>
     </w:p>
-    <w:bookmarkEnd w:id="63"/>
-    <w:bookmarkStart w:id="64" w:name="references"/>
+    <w:bookmarkEnd w:id="68"/>
+    <w:bookmarkStart w:id="69" w:name="references"/>
     <w:p>
       <w:pPr>
         <w:pStyle w:val="Heading2"/>
@@ -6480,8 +6760,8 @@
         </w:pict>
       </w:r>
     </w:p>
-    <w:bookmarkEnd w:id="64"/>
-    <w:bookmarkStart w:id="65" w:name="appendix-a.-how-to-reproduce"/>
+    <w:bookmarkEnd w:id="69"/>
+    <w:bookmarkStart w:id="70" w:name="appendix-a.-how-to-reproduce"/>
     <w:p>
       <w:pPr>
         <w:pStyle w:val="Heading2"/>
@@ -7108,12 +7388,15 @@
         <w:t xml:space="preserve">), so runs are reproducible up to upstream AlphaFold DB / UniProt updates.</w:t>
       </w:r>
     </w:p>
-    <w:bookmarkEnd w:id="65"/>
-    <w:bookmarkEnd w:id="66"/>
+    <w:bookmarkEnd w:id="70"/>
+    <w:bookmarkEnd w:id="71"/>
     <w:sectPr>
+      <w:footerReference w:type="default" r:id="rId9"/>
       <w:footnotePr>
         <w:numRestart w:val="eachSect"/>
       </w:footnotePr>
+      <w:pgMar w:top="1440" w:bottom="1440" w:left="1440" w:right="1440"/>
+      <w:lnNumType w:countBy="1" w:restart="continuous"/>
     </w:sectPr>
   </w:body>
 </w:document>
@@ -7121,6 +7404,24 @@
 
 <file path=word/comments.xml><?xml version="1.0" encoding="utf-8"?>
 <w:comments xmlns:w="http://schemas.openxmlformats.org/wordprocessingml/2006/main" xmlns:m="http://schemas.openxmlformats.org/officeDocument/2006/math" xmlns:r="http://schemas.openxmlformats.org/officeDocument/2006/relationships" xmlns:o="urn:schemas-microsoft-com:office:office" xmlns:v="urn:schemas-microsoft-com:vml" xmlns:w10="urn:schemas-microsoft-com:office:word" xmlns:a="http://schemas.openxmlformats.org/drawingml/2006/main" xmlns:pic="http://schemas.openxmlformats.org/drawingml/2006/picture" xmlns:wp="http://schemas.openxmlformats.org/drawingml/2006/wordprocessingDrawing"/>
+</file>
+
+<file path=word/footer1.xml><?xml version="1.0" encoding="utf-8"?>
+<w:ftr xmlns:m="http://schemas.openxmlformats.org/officeDocument/2006/math" xmlns:mc="http://schemas.openxmlformats.org/markup-compatibility/2006" xmlns:mo="http://schemas.microsoft.com/office/mac/office/2008/main" xmlns:mv="urn:schemas-microsoft-com:mac:vml" xmlns:o="urn:schemas-microsoft-com:office:office" xmlns:r="http://schemas.openxmlformats.org/officeDocument/2006/relationships" xmlns:v="urn:schemas-microsoft-com:vml" xmlns:w10="urn:schemas-microsoft-com:office:word" xmlns:w14="http://schemas.microsoft.com/office/word/2010/wordml" xmlns:w="http://schemas.openxmlformats.org/wordprocessingml/2006/main" xmlns:wne="http://schemas.microsoft.com/office/word/2006/wordml" xmlns:wp14="http://schemas.microsoft.com/office/word/2010/wordprocessingDrawing" xmlns:wp="http://schemas.openxmlformats.org/drawingml/2006/wordprocessingDrawing" xmlns:wpc="http://schemas.microsoft.com/office/word/2010/wordprocessingCanvas" xmlns:wpg="http://schemas.microsoft.com/office/word/2010/wordprocessingGroup" xmlns:wpi="http://schemas.microsoft.com/office/word/2010/wordprocessingInk" xmlns:wps="http://schemas.microsoft.com/office/word/2010/wordprocessingShape" mc:Ignorable="w14 wp14">
+  <w:p>
+    <w:pPr>
+      <w:pStyle w:val="Footer"/>
+      <w:jc w:val="center"/>
+    </w:pPr>
+    <w:r>
+      <w:fldChar w:fldCharType="begin"/>
+      <w:instrText xml:space="preserve"> PAGE </w:instrText>
+      <w:fldChar w:fldCharType="separate"/>
+      <w:t>1</w:t>
+      <w:fldChar w:fldCharType="end"/>
+    </w:r>
+  </w:p>
+</w:ftr>
 </file>
 
 <file path=word/footnotes.xml><?xml version="1.0" encoding="utf-8"?>
@@ -7528,6 +7829,9 @@
   <w:style w:default="1" w:styleId="Normal" w:type="paragraph">
     <w:name w:val="Normal"/>
     <w:qFormat/>
+    <w:pPr>
+      <w:spacing w:line="480" w:lineRule="auto" w:after="0"/>
+    </w:pPr>
   </w:style>
   <w:style w:styleId="BodyText" w:type="paragraph">
     <w:name w:val="Body Text"/>
@@ -7561,7 +7865,7 @@
     <w:qFormat/>
     <w:rsid w:val="00A10FD9"/>
     <w:pPr>
-      <w:spacing w:after="80" w:line="240" w:lineRule="auto"/>
+      <w:spacing w:after="80" w:line="480" w:lineRule="auto"/>
       <w:contextualSpacing/>
       <w:jc w:val="center"/>
     </w:pPr>
@@ -7595,6 +7899,7 @@
       <w:numPr>
         <w:ilvl w:val="1"/>
       </w:numPr>
+      <w:spacing w:line="480" w:lineRule="auto"/>
     </w:pPr>
     <w:rPr>
       <w:rFonts w:cstheme="majorBidi" w:eastAsiaTheme="majorEastAsia"/>
@@ -7696,7 +8001,7 @@
     <w:pPr>
       <w:keepNext/>
       <w:keepLines/>
-      <w:spacing w:after="80" w:before="360"/>
+      <w:spacing w:after="80" w:before="360" w:line="480" w:lineRule="auto"/>
       <w:outlineLvl w:val="0"/>
     </w:pPr>
     <w:rPr>
@@ -7719,7 +8024,7 @@
     <w:pPr>
       <w:keepNext/>
       <w:keepLines/>
-      <w:spacing w:after="80" w:before="160"/>
+      <w:spacing w:after="80" w:before="160" w:line="480" w:lineRule="auto"/>
       <w:outlineLvl w:val="1"/>
     </w:pPr>
     <w:rPr>
@@ -7742,7 +8047,7 @@
     <w:pPr>
       <w:keepNext/>
       <w:keepLines/>
-      <w:spacing w:after="80" w:before="160"/>
+      <w:spacing w:after="80" w:before="160" w:line="480" w:lineRule="auto"/>
       <w:outlineLvl w:val="2"/>
     </w:pPr>
     <w:rPr>

</xml_diff>